<commit_message>
fix(experience): attribute Brixton Makunga HMS to WIK Technologies across portfolio and resume
- Move Brixton Makunga Hospital Management System under WIK Technologies deliverables in Experience section
- Update Flagship 8 metadata to Founder & Systems Architect · WIK
- Move Brixton Makunga HMS bullet under WIK Technologies on master ATS resume
- Recompile Word and PDF resumes (verified exactly 2 pages)
</commit_message>
<xml_diff>
--- a/Paul-Karonji-Waithaka-Resume.docx
+++ b/Paul-Karonji-Waithaka-Resume.docx
@@ -7,7 +7,7 @@
         <w:pStyle w:val="Heading1"/>
         <w:spacing w:before="0" w:beforeAutospacing="0" w:after="30" w:afterAutospacing="0"/>
         <w:jc w:val="center"/>
-        <w:divId w:val="752166530"/>
+        <w:divId w:val="1025791538"/>
         <w:rPr>
           <w:rFonts w:ascii="Calibri" w:eastAsia="Times New Roman" w:hAnsi="Calibri" w:cs="Calibri"/>
           <w:color w:val="111111"/>
@@ -35,7 +35,7 @@
       <w:pPr>
         <w:pStyle w:val="role-title"/>
         <w:jc w:val="center"/>
-        <w:divId w:val="752166530"/>
+        <w:divId w:val="1025791538"/>
         <w:rPr>
           <w:rFonts w:ascii="Calibri" w:hAnsi="Calibri" w:cs="Calibri"/>
           <w:lang w:val="en"/>
@@ -53,7 +53,7 @@
       <w:pPr>
         <w:pStyle w:val="contact-info"/>
         <w:jc w:val="center"/>
-        <w:divId w:val="752166530"/>
+        <w:divId w:val="1025791538"/>
         <w:rPr>
           <w:rFonts w:ascii="Calibri" w:hAnsi="Calibri" w:cs="Calibri"/>
           <w:lang w:val="en"/>
@@ -84,7 +84,7 @@
     </w:p>
     <w:p>
       <w:pPr>
-        <w:divId w:val="1328707604"/>
+        <w:divId w:val="1330059679"/>
         <w:rPr>
           <w:rFonts w:ascii="Calibri" w:eastAsia="Times New Roman" w:hAnsi="Calibri" w:cs="Calibri"/>
           <w:b/>
@@ -115,7 +115,7 @@
     <w:p>
       <w:pPr>
         <w:pStyle w:val="summary-text"/>
-        <w:divId w:val="1382175177"/>
+        <w:divId w:val="93402138"/>
         <w:rPr>
           <w:rFonts w:ascii="Calibri" w:hAnsi="Calibri" w:cs="Calibri"/>
           <w:lang w:val="en"/>
@@ -242,7 +242,7 @@
     </w:p>
     <w:p>
       <w:pPr>
-        <w:divId w:val="602155549"/>
+        <w:divId w:val="1550342157"/>
         <w:rPr>
           <w:rFonts w:ascii="Calibri" w:eastAsia="Times New Roman" w:hAnsi="Calibri" w:cs="Calibri"/>
           <w:b/>
@@ -278,7 +278,7 @@
         </w:numPr>
         <w:spacing w:before="100" w:beforeAutospacing="1" w:after="38"/>
         <w:ind w:left="0"/>
-        <w:divId w:val="1414207398"/>
+        <w:divId w:val="1491870628"/>
         <w:rPr>
           <w:rFonts w:ascii="Calibri" w:eastAsia="Times New Roman" w:hAnsi="Calibri" w:cs="Calibri"/>
           <w:color w:val="222222"/>
@@ -336,7 +336,7 @@
         </w:numPr>
         <w:spacing w:before="100" w:beforeAutospacing="1" w:after="38"/>
         <w:ind w:left="0"/>
-        <w:divId w:val="1414207398"/>
+        <w:divId w:val="1491870628"/>
         <w:rPr>
           <w:rFonts w:ascii="Calibri" w:eastAsia="Times New Roman" w:hAnsi="Calibri" w:cs="Calibri"/>
           <w:color w:val="222222"/>
@@ -384,7 +384,7 @@
         </w:numPr>
         <w:spacing w:before="100" w:beforeAutospacing="1" w:after="38"/>
         <w:ind w:left="0"/>
-        <w:divId w:val="1414207398"/>
+        <w:divId w:val="1491870628"/>
         <w:rPr>
           <w:rFonts w:ascii="Calibri" w:eastAsia="Times New Roman" w:hAnsi="Calibri" w:cs="Calibri"/>
           <w:color w:val="222222"/>
@@ -442,7 +442,7 @@
         </w:numPr>
         <w:spacing w:before="100" w:beforeAutospacing="1" w:after="38"/>
         <w:ind w:left="0"/>
-        <w:divId w:val="1414207398"/>
+        <w:divId w:val="1491870628"/>
         <w:rPr>
           <w:rFonts w:ascii="Calibri" w:eastAsia="Times New Roman" w:hAnsi="Calibri" w:cs="Calibri"/>
           <w:color w:val="222222"/>
@@ -500,7 +500,7 @@
         </w:numPr>
         <w:spacing w:before="100" w:beforeAutospacing="1" w:after="38"/>
         <w:ind w:left="0"/>
-        <w:divId w:val="1414207398"/>
+        <w:divId w:val="1491870628"/>
         <w:rPr>
           <w:rFonts w:ascii="Calibri" w:eastAsia="Times New Roman" w:hAnsi="Calibri" w:cs="Calibri"/>
           <w:color w:val="222222"/>
@@ -558,7 +558,7 @@
         </w:numPr>
         <w:spacing w:before="100" w:beforeAutospacing="1" w:after="38"/>
         <w:ind w:left="0"/>
-        <w:divId w:val="1414207398"/>
+        <w:divId w:val="1491870628"/>
         <w:rPr>
           <w:rFonts w:ascii="Calibri" w:eastAsia="Times New Roman" w:hAnsi="Calibri" w:cs="Calibri"/>
           <w:color w:val="222222"/>
@@ -606,7 +606,7 @@
         </w:numPr>
         <w:spacing w:before="100" w:beforeAutospacing="1" w:after="38"/>
         <w:ind w:left="0"/>
-        <w:divId w:val="1414207398"/>
+        <w:divId w:val="1491870628"/>
         <w:rPr>
           <w:rFonts w:ascii="Calibri" w:eastAsia="Times New Roman" w:hAnsi="Calibri" w:cs="Calibri"/>
           <w:color w:val="222222"/>
@@ -658,7 +658,7 @@
     </w:p>
     <w:p>
       <w:pPr>
-        <w:divId w:val="1015157950"/>
+        <w:divId w:val="1755206502"/>
         <w:rPr>
           <w:rFonts w:ascii="Calibri" w:eastAsia="Times New Roman" w:hAnsi="Calibri" w:cs="Calibri"/>
           <w:b/>
@@ -702,7 +702,7 @@
     </w:p>
     <w:p>
       <w:pPr>
-        <w:divId w:val="1077629248"/>
+        <w:divId w:val="82922377"/>
         <w:rPr>
           <w:rFonts w:ascii="Calibri" w:eastAsia="Times New Roman" w:hAnsi="Calibri" w:cs="Calibri"/>
           <w:color w:val="222222"/>
@@ -757,7 +757,7 @@
         <w:spacing w:before="100" w:beforeAutospacing="1" w:after="53"/>
         <w:ind w:left="0"/>
         <w:jc w:val="both"/>
-        <w:divId w:val="853765366"/>
+        <w:divId w:val="2015960565"/>
         <w:rPr>
           <w:rFonts w:ascii="Calibri" w:eastAsia="Times New Roman" w:hAnsi="Calibri" w:cs="Calibri"/>
           <w:color w:val="2A2A2A"/>
@@ -816,7 +816,7 @@
         <w:spacing w:before="100" w:beforeAutospacing="1" w:after="53"/>
         <w:ind w:left="0"/>
         <w:jc w:val="both"/>
-        <w:divId w:val="853765366"/>
+        <w:divId w:val="2015960565"/>
         <w:rPr>
           <w:rFonts w:ascii="Calibri" w:eastAsia="Times New Roman" w:hAnsi="Calibri" w:cs="Calibri"/>
           <w:color w:val="2A2A2A"/>
@@ -833,27 +833,27 @@
           <w:szCs w:val="18"/>
           <w:lang w:val="en"/>
         </w:rPr>
-        <w:t>FleetTrack Enterprise Telematics:</w:t>
-      </w:r>
-      <w:r>
-        <w:rPr>
-          <w:rFonts w:ascii="Calibri" w:eastAsia="Times New Roman" w:hAnsi="Calibri" w:cs="Calibri"/>
-          <w:color w:val="2A2A2A"/>
-          <w:sz w:val="18"/>
-          <w:szCs w:val="18"/>
-          <w:lang w:val="en"/>
-        </w:rPr>
-        <w:t xml:space="preserve"> Engineered high-concurrency Go backend for batch IoT telematics ingestion and real-time WebSocke</w:t>
-      </w:r>
-      <w:r>
-        <w:rPr>
-          <w:rFonts w:ascii="Calibri" w:eastAsia="Times New Roman" w:hAnsi="Calibri" w:cs="Calibri"/>
-          <w:color w:val="2A2A2A"/>
-          <w:sz w:val="18"/>
-          <w:szCs w:val="18"/>
-          <w:lang w:val="en"/>
-        </w:rPr>
-        <w:t>t fan-out, paired with an offline-first React Native (Expo 57) driver mobile app buffering telemetry in local SQLite with QR manifest claiming and stoppage detection.</w:t>
+        <w:t>Brixton Makunga Hospital Management System:</w:t>
+      </w:r>
+      <w:r>
+        <w:rPr>
+          <w:rFonts w:ascii="Calibri" w:eastAsia="Times New Roman" w:hAnsi="Calibri" w:cs="Calibri"/>
+          <w:color w:val="2A2A2A"/>
+          <w:sz w:val="18"/>
+          <w:szCs w:val="18"/>
+          <w:lang w:val="en"/>
+        </w:rPr>
+        <w:t xml:space="preserve"> Delivered 200+ endpoint clinical hospital ERP on Laravel 12, React 19, and MySQL 8 wit</w:t>
+      </w:r>
+      <w:r>
+        <w:rPr>
+          <w:rFonts w:ascii="Calibri" w:eastAsia="Times New Roman" w:hAnsi="Calibri" w:cs="Calibri"/>
+          <w:color w:val="2A2A2A"/>
+          <w:sz w:val="18"/>
+          <w:szCs w:val="18"/>
+          <w:lang w:val="en"/>
+        </w:rPr>
+        <w:t>h automated ledger billing via Observer pattern, real-time triage queue management, and pharmacy FEFO batch expiry registers.</w:t>
       </w:r>
     </w:p>
     <w:p>
@@ -865,7 +865,7 @@
         <w:spacing w:before="100" w:beforeAutospacing="1" w:after="53"/>
         <w:ind w:left="0"/>
         <w:jc w:val="both"/>
-        <w:divId w:val="853765366"/>
+        <w:divId w:val="2015960565"/>
         <w:rPr>
           <w:rFonts w:ascii="Calibri" w:eastAsia="Times New Roman" w:hAnsi="Calibri" w:cs="Calibri"/>
           <w:color w:val="2A2A2A"/>
@@ -882,27 +882,27 @@
           <w:szCs w:val="18"/>
           <w:lang w:val="en"/>
         </w:rPr>
-        <w:t>HotBill KE Telecommunications:</w:t>
-      </w:r>
-      <w:r>
-        <w:rPr>
-          <w:rFonts w:ascii="Calibri" w:eastAsia="Times New Roman" w:hAnsi="Calibri" w:cs="Calibri"/>
-          <w:color w:val="2A2A2A"/>
-          <w:sz w:val="18"/>
-          <w:szCs w:val="18"/>
-          <w:lang w:val="en"/>
-        </w:rPr>
-        <w:t xml:space="preserve"> Built automated telecommunications billing daemon integrat</w:t>
-      </w:r>
-      <w:r>
-        <w:rPr>
-          <w:rFonts w:ascii="Calibri" w:eastAsia="Times New Roman" w:hAnsi="Calibri" w:cs="Calibri"/>
-          <w:color w:val="2A2A2A"/>
-          <w:sz w:val="18"/>
-          <w:szCs w:val="18"/>
-          <w:lang w:val="en"/>
-        </w:rPr>
-        <w:t>ing MikroTik RouterOS socket API with M-Pesa Daraja STK push and a Next.js 14 NOC console for ISP/hotspot bandwidth automation in Docker Compose.</w:t>
+        <w:t>FleetTrack Enterprise Telematics:</w:t>
+      </w:r>
+      <w:r>
+        <w:rPr>
+          <w:rFonts w:ascii="Calibri" w:eastAsia="Times New Roman" w:hAnsi="Calibri" w:cs="Calibri"/>
+          <w:color w:val="2A2A2A"/>
+          <w:sz w:val="18"/>
+          <w:szCs w:val="18"/>
+          <w:lang w:val="en"/>
+        </w:rPr>
+        <w:t xml:space="preserve"> Engineered high-concurrency Go backend for batch IoT telematics ingestion and real-time WebSocke</w:t>
+      </w:r>
+      <w:r>
+        <w:rPr>
+          <w:rFonts w:ascii="Calibri" w:eastAsia="Times New Roman" w:hAnsi="Calibri" w:cs="Calibri"/>
+          <w:color w:val="2A2A2A"/>
+          <w:sz w:val="18"/>
+          <w:szCs w:val="18"/>
+          <w:lang w:val="en"/>
+        </w:rPr>
+        <w:t>t fan-out, paired with an offline-first React Native (Expo 57) driver mobile app buffering telemetry in local SQLite with QR manifest claiming and stoppage detection.</w:t>
       </w:r>
     </w:p>
     <w:p>
@@ -914,7 +914,7 @@
         <w:spacing w:before="100" w:beforeAutospacing="1" w:after="53"/>
         <w:ind w:left="0"/>
         <w:jc w:val="both"/>
-        <w:divId w:val="853765366"/>
+        <w:divId w:val="2015960565"/>
         <w:rPr>
           <w:rFonts w:ascii="Calibri" w:eastAsia="Times New Roman" w:hAnsi="Calibri" w:cs="Calibri"/>
           <w:color w:val="2A2A2A"/>
@@ -931,27 +931,27 @@
           <w:szCs w:val="18"/>
           <w:lang w:val="en"/>
         </w:rPr>
-        <w:t>Padi Password Manager:</w:t>
-      </w:r>
-      <w:r>
-        <w:rPr>
-          <w:rFonts w:ascii="Calibri" w:eastAsia="Times New Roman" w:hAnsi="Calibri" w:cs="Calibri"/>
-          <w:color w:val="2A2A2A"/>
-          <w:sz w:val="18"/>
-          <w:szCs w:val="18"/>
-          <w:lang w:val="en"/>
-        </w:rPr>
-        <w:t xml:space="preserve"> Developed zero-knowledge cross-browser extension (Manifest V3) and Web Vault using clie</w:t>
-      </w:r>
-      <w:r>
-        <w:rPr>
-          <w:rFonts w:ascii="Calibri" w:eastAsia="Times New Roman" w:hAnsi="Calibri" w:cs="Calibri"/>
-          <w:color w:val="2A2A2A"/>
-          <w:sz w:val="18"/>
-          <w:szCs w:val="18"/>
-          <w:lang w:val="en"/>
-        </w:rPr>
-        <w:t>nt-side Web Crypto PBKDF2 (100,000 rounds) and AES-GCM-256 with Supabase synchronization.</w:t>
+        <w:t>HotBill KE Telecommunications:</w:t>
+      </w:r>
+      <w:r>
+        <w:rPr>
+          <w:rFonts w:ascii="Calibri" w:eastAsia="Times New Roman" w:hAnsi="Calibri" w:cs="Calibri"/>
+          <w:color w:val="2A2A2A"/>
+          <w:sz w:val="18"/>
+          <w:szCs w:val="18"/>
+          <w:lang w:val="en"/>
+        </w:rPr>
+        <w:t xml:space="preserve"> Built automated telecommunications billing daemon integrat</w:t>
+      </w:r>
+      <w:r>
+        <w:rPr>
+          <w:rFonts w:ascii="Calibri" w:eastAsia="Times New Roman" w:hAnsi="Calibri" w:cs="Calibri"/>
+          <w:color w:val="2A2A2A"/>
+          <w:sz w:val="18"/>
+          <w:szCs w:val="18"/>
+          <w:lang w:val="en"/>
+        </w:rPr>
+        <w:t>ing MikroTik RouterOS socket API with M-Pesa Daraja STK push and a Next.js 14 NOC console for ISP/hotspot bandwidth automation in Docker Compose.</w:t>
       </w:r>
     </w:p>
     <w:p>
@@ -963,7 +963,7 @@
         <w:spacing w:before="100" w:beforeAutospacing="1" w:after="53"/>
         <w:ind w:left="0"/>
         <w:jc w:val="both"/>
-        <w:divId w:val="853765366"/>
+        <w:divId w:val="2015960565"/>
         <w:rPr>
           <w:rFonts w:ascii="Calibri" w:eastAsia="Times New Roman" w:hAnsi="Calibri" w:cs="Calibri"/>
           <w:color w:val="2A2A2A"/>
@@ -980,27 +980,27 @@
           <w:szCs w:val="18"/>
           <w:lang w:val="en"/>
         </w:rPr>
-        <w:t>WIK-POS Desktop Suite &amp; Licensing Authority:</w:t>
-      </w:r>
-      <w:r>
-        <w:rPr>
-          <w:rFonts w:ascii="Calibri" w:eastAsia="Times New Roman" w:hAnsi="Calibri" w:cs="Calibri"/>
-          <w:color w:val="2A2A2A"/>
-          <w:sz w:val="18"/>
-          <w:szCs w:val="18"/>
-          <w:lang w:val="en"/>
-        </w:rPr>
-        <w:t xml:space="preserve"> Shipped offline-first Electron + SQLite retail suite featuring hardware-bound licensing (CPU+MAC fingerprinting), 30-day </w:t>
-      </w:r>
-      <w:r>
-        <w:rPr>
-          <w:rFonts w:ascii="Calibri" w:eastAsia="Times New Roman" w:hAnsi="Calibri" w:cs="Calibri"/>
-          <w:color w:val="2A2A2A"/>
-          <w:sz w:val="18"/>
-          <w:szCs w:val="18"/>
-          <w:lang w:val="en"/>
-        </w:rPr>
-        <w:t>offline grace periods, FEFO pharmacy expiry batching (v1.3.33), and hotel multi-terminal LAN F&amp;B ordering (v1.3.26).</w:t>
+        <w:t>Padi Password Manager:</w:t>
+      </w:r>
+      <w:r>
+        <w:rPr>
+          <w:rFonts w:ascii="Calibri" w:eastAsia="Times New Roman" w:hAnsi="Calibri" w:cs="Calibri"/>
+          <w:color w:val="2A2A2A"/>
+          <w:sz w:val="18"/>
+          <w:szCs w:val="18"/>
+          <w:lang w:val="en"/>
+        </w:rPr>
+        <w:t xml:space="preserve"> Developed zero-knowledge cross-browser extension (Manifest V3) and Web Vault using clie</w:t>
+      </w:r>
+      <w:r>
+        <w:rPr>
+          <w:rFonts w:ascii="Calibri" w:eastAsia="Times New Roman" w:hAnsi="Calibri" w:cs="Calibri"/>
+          <w:color w:val="2A2A2A"/>
+          <w:sz w:val="18"/>
+          <w:szCs w:val="18"/>
+          <w:lang w:val="en"/>
+        </w:rPr>
+        <w:t>nt-side Web Crypto PBKDF2 (100,000 iterations) and AES-GCM-256 with Supabase synchronization.</w:t>
       </w:r>
     </w:p>
     <w:p>
@@ -1012,7 +1012,7 @@
         <w:spacing w:before="100" w:beforeAutospacing="1" w:after="53"/>
         <w:ind w:left="0"/>
         <w:jc w:val="both"/>
-        <w:divId w:val="853765366"/>
+        <w:divId w:val="2015960565"/>
         <w:rPr>
           <w:rFonts w:ascii="Calibri" w:eastAsia="Times New Roman" w:hAnsi="Calibri" w:cs="Calibri"/>
           <w:color w:val="2A2A2A"/>
@@ -1029,32 +1029,82 @@
           <w:szCs w:val="18"/>
           <w:lang w:val="en"/>
         </w:rPr>
-        <w:t>DueSync Smart Task Management &amp; MCP:</w:t>
-      </w:r>
-      <w:r>
-        <w:rPr>
-          <w:rFonts w:ascii="Calibri" w:eastAsia="Times New Roman" w:hAnsi="Calibri" w:cs="Calibri"/>
-          <w:color w:val="2A2A2A"/>
-          <w:sz w:val="18"/>
-          <w:szCs w:val="18"/>
-          <w:lang w:val="en"/>
-        </w:rPr>
-        <w:t xml:space="preserve"> Shipped task-management SaaS on Next.js 15 featuring two-way Google Calendar OAuth2 sync, Upstash Redi</w:t>
-      </w:r>
-      <w:r>
-        <w:rPr>
-          <w:rFonts w:ascii="Calibri" w:eastAsia="Times New Roman" w:hAnsi="Calibri" w:cs="Calibri"/>
-          <w:color w:val="2A2A2A"/>
-          <w:sz w:val="18"/>
-          <w:szCs w:val="18"/>
-          <w:lang w:val="en"/>
-        </w:rPr>
-        <w:t>s rate limiting, and a native 13-tool MCP server allowing AI agents to orchestrate schedule planning.</w:t>
+        <w:lastRenderedPageBreak/>
+        <w:t>WIK-POS Desktop Suite &amp; Licensing Authority:</w:t>
+      </w:r>
+      <w:r>
+        <w:rPr>
+          <w:rFonts w:ascii="Calibri" w:eastAsia="Times New Roman" w:hAnsi="Calibri" w:cs="Calibri"/>
+          <w:color w:val="2A2A2A"/>
+          <w:sz w:val="18"/>
+          <w:szCs w:val="18"/>
+          <w:lang w:val="en"/>
+        </w:rPr>
+        <w:t xml:space="preserve"> Shipped offline-first Electron + SQLite retail suite featuring hardware-bound licensing (CPU+MAC fingerprinting), 30-</w:t>
+      </w:r>
+      <w:r>
+        <w:rPr>
+          <w:rFonts w:ascii="Calibri" w:eastAsia="Times New Roman" w:hAnsi="Calibri" w:cs="Calibri"/>
+          <w:color w:val="2A2A2A"/>
+          <w:sz w:val="18"/>
+          <w:szCs w:val="18"/>
+          <w:lang w:val="en"/>
+        </w:rPr>
+        <w:t>day offline grace periods, FEFO pharmacy expiry batching (v1.3.33), and hotel multi-terminal LAN F&amp;B ordering (v1.3.26).</w:t>
       </w:r>
     </w:p>
     <w:p>
       <w:pPr>
-        <w:divId w:val="926307881"/>
+        <w:numPr>
+          <w:ilvl w:val="0"/>
+          <w:numId w:val="2"/>
+        </w:numPr>
+        <w:spacing w:before="100" w:beforeAutospacing="1" w:after="53"/>
+        <w:ind w:left="0"/>
+        <w:jc w:val="both"/>
+        <w:divId w:val="2015960565"/>
+        <w:rPr>
+          <w:rFonts w:ascii="Calibri" w:eastAsia="Times New Roman" w:hAnsi="Calibri" w:cs="Calibri"/>
+          <w:color w:val="2A2A2A"/>
+          <w:sz w:val="18"/>
+          <w:szCs w:val="18"/>
+          <w:lang w:val="en"/>
+        </w:rPr>
+      </w:pPr>
+      <w:r>
+        <w:rPr>
+          <w:rStyle w:val="lead-bold1"/>
+          <w:rFonts w:ascii="Calibri" w:eastAsia="Times New Roman" w:hAnsi="Calibri" w:cs="Calibri"/>
+          <w:sz w:val="18"/>
+          <w:szCs w:val="18"/>
+          <w:lang w:val="en"/>
+        </w:rPr>
+        <w:t>DueSync Smart Task Management &amp; MCP:</w:t>
+      </w:r>
+      <w:r>
+        <w:rPr>
+          <w:rFonts w:ascii="Calibri" w:eastAsia="Times New Roman" w:hAnsi="Calibri" w:cs="Calibri"/>
+          <w:color w:val="2A2A2A"/>
+          <w:sz w:val="18"/>
+          <w:szCs w:val="18"/>
+          <w:lang w:val="en"/>
+        </w:rPr>
+        <w:t xml:space="preserve"> Shipped task-management SaaS on Next.js 15 featuring two-way Google Calendar OAuth2 sync, Upstash </w:t>
+      </w:r>
+      <w:r>
+        <w:rPr>
+          <w:rFonts w:ascii="Calibri" w:eastAsia="Times New Roman" w:hAnsi="Calibri" w:cs="Calibri"/>
+          <w:color w:val="2A2A2A"/>
+          <w:sz w:val="18"/>
+          <w:szCs w:val="18"/>
+          <w:lang w:val="en"/>
+        </w:rPr>
+        <w:t>Redis rate limiting, and a native 13-tool MCP server allowing AI agents to orchestrate schedule planning.</w:t>
+      </w:r>
+    </w:p>
+    <w:p>
+      <w:pPr>
+        <w:divId w:val="1505825321"/>
         <w:rPr>
           <w:rFonts w:ascii="Calibri" w:eastAsia="Times New Roman" w:hAnsi="Calibri" w:cs="Calibri"/>
           <w:color w:val="222222"/>
@@ -1069,7 +1119,6 @@
           <w:rFonts w:ascii="Calibri" w:eastAsia="Times New Roman" w:hAnsi="Calibri" w:cs="Calibri"/>
           <w:lang w:val="en"/>
         </w:rPr>
-        <w:lastRenderedPageBreak/>
         <w:t>Technical Lead (Industrial Attachment) | JHUB Africa</w:t>
       </w:r>
       <w:r>
@@ -1110,7 +1159,7 @@
         <w:spacing w:before="100" w:beforeAutospacing="1" w:after="53"/>
         <w:ind w:left="0"/>
         <w:jc w:val="both"/>
-        <w:divId w:val="944924691"/>
+        <w:divId w:val="638732019"/>
         <w:rPr>
           <w:rFonts w:ascii="Calibri" w:eastAsia="Times New Roman" w:hAnsi="Calibri" w:cs="Calibri"/>
           <w:color w:val="2A2A2A"/>
@@ -1159,7 +1208,7 @@
         <w:spacing w:before="100" w:beforeAutospacing="1" w:after="53"/>
         <w:ind w:left="0"/>
         <w:jc w:val="both"/>
-        <w:divId w:val="944924691"/>
+        <w:divId w:val="638732019"/>
         <w:rPr>
           <w:rFonts w:ascii="Calibri" w:eastAsia="Times New Roman" w:hAnsi="Calibri" w:cs="Calibri"/>
           <w:color w:val="2A2A2A"/>
@@ -1201,7 +1250,7 @@
     </w:p>
     <w:p>
       <w:pPr>
-        <w:divId w:val="897477716"/>
+        <w:divId w:val="117989325"/>
         <w:rPr>
           <w:rFonts w:ascii="Calibri" w:eastAsia="Times New Roman" w:hAnsi="Calibri" w:cs="Calibri"/>
           <w:color w:val="222222"/>
@@ -1264,7 +1313,7 @@
         <w:spacing w:before="100" w:beforeAutospacing="1" w:after="53"/>
         <w:ind w:left="0"/>
         <w:jc w:val="both"/>
-        <w:divId w:val="653023462"/>
+        <w:divId w:val="526214509"/>
         <w:rPr>
           <w:rFonts w:ascii="Calibri" w:eastAsia="Times New Roman" w:hAnsi="Calibri" w:cs="Calibri"/>
           <w:color w:val="2A2A2A"/>
@@ -1313,7 +1362,7 @@
         <w:spacing w:before="100" w:beforeAutospacing="1" w:after="53"/>
         <w:ind w:left="0"/>
         <w:jc w:val="both"/>
-        <w:divId w:val="653023462"/>
+        <w:divId w:val="526214509"/>
         <w:rPr>
           <w:rFonts w:ascii="Calibri" w:eastAsia="Times New Roman" w:hAnsi="Calibri" w:cs="Calibri"/>
           <w:color w:val="2A2A2A"/>
@@ -1330,27 +1379,27 @@
           <w:szCs w:val="18"/>
           <w:lang w:val="en"/>
         </w:rPr>
-        <w:t>Brixton Makunga Hospital Management System:</w:t>
-      </w:r>
-      <w:r>
-        <w:rPr>
-          <w:rFonts w:ascii="Calibri" w:eastAsia="Times New Roman" w:hAnsi="Calibri" w:cs="Calibri"/>
-          <w:color w:val="2A2A2A"/>
-          <w:sz w:val="18"/>
-          <w:szCs w:val="18"/>
-          <w:lang w:val="en"/>
-        </w:rPr>
-        <w:t xml:space="preserve"> Delivered 200+ endpoint hospital management ERP (Laravel 12, React 19, MySQL) with automated billing via Observer pattern, real-time queue management, and </w:t>
-      </w:r>
-      <w:r>
-        <w:rPr>
-          <w:rFonts w:ascii="Calibri" w:eastAsia="Times New Roman" w:hAnsi="Calibri" w:cs="Calibri"/>
-          <w:color w:val="2A2A2A"/>
-          <w:sz w:val="18"/>
-          <w:szCs w:val="18"/>
-          <w:lang w:val="en"/>
-        </w:rPr>
-        <w:t>pharmacy FEFO inventory.</w:t>
+        <w:t>K-Track Commission SaaS:</w:t>
+      </w:r>
+      <w:r>
+        <w:rPr>
+          <w:rFonts w:ascii="Calibri" w:eastAsia="Times New Roman" w:hAnsi="Calibri" w:cs="Calibri"/>
+          <w:color w:val="2A2A2A"/>
+          <w:sz w:val="18"/>
+          <w:szCs w:val="18"/>
+          <w:lang w:val="en"/>
+        </w:rPr>
+        <w:t xml:space="preserve"> Built multi-tutor agency commission platform (React 19, Express 5, TiDB Serverless, Cloudflare R2, Socket.IO) with timing-safe HMAC guest checkout URLs and idempotent boot-ti</w:t>
+      </w:r>
+      <w:r>
+        <w:rPr>
+          <w:rFonts w:ascii="Calibri" w:eastAsia="Times New Roman" w:hAnsi="Calibri" w:cs="Calibri"/>
+          <w:color w:val="2A2A2A"/>
+          <w:sz w:val="18"/>
+          <w:szCs w:val="18"/>
+          <w:lang w:val="en"/>
+        </w:rPr>
+        <w:t>me database patching.</w:t>
       </w:r>
     </w:p>
     <w:p>
@@ -1362,7 +1411,7 @@
         <w:spacing w:before="100" w:beforeAutospacing="1" w:after="53"/>
         <w:ind w:left="0"/>
         <w:jc w:val="both"/>
-        <w:divId w:val="653023462"/>
+        <w:divId w:val="526214509"/>
         <w:rPr>
           <w:rFonts w:ascii="Calibri" w:eastAsia="Times New Roman" w:hAnsi="Calibri" w:cs="Calibri"/>
           <w:color w:val="2A2A2A"/>
@@ -1379,71 +1428,22 @@
           <w:szCs w:val="18"/>
           <w:lang w:val="en"/>
         </w:rPr>
-        <w:t>K-Track Commission SaaS:</w:t>
-      </w:r>
-      <w:r>
-        <w:rPr>
-          <w:rFonts w:ascii="Calibri" w:eastAsia="Times New Roman" w:hAnsi="Calibri" w:cs="Calibri"/>
-          <w:color w:val="2A2A2A"/>
-          <w:sz w:val="18"/>
-          <w:szCs w:val="18"/>
-          <w:lang w:val="en"/>
-        </w:rPr>
-        <w:t xml:space="preserve"> Built multi-tutor agency commission platform (React 19, Express 5, TiDB Serverless, Cloudflare R2, Socket.IO) with timing-safe HMAC guest checkout URLs and idempotent boot-time database patching.</w:t>
+        <w:t>Biashara Hub Headless Commerce:</w:t>
+      </w:r>
+      <w:r>
+        <w:rPr>
+          <w:rFonts w:ascii="Calibri" w:eastAsia="Times New Roman" w:hAnsi="Calibri" w:cs="Calibri"/>
+          <w:color w:val="2A2A2A"/>
+          <w:sz w:val="18"/>
+          <w:szCs w:val="18"/>
+          <w:lang w:val="en"/>
+        </w:rPr>
+        <w:t xml:space="preserve"> Engineered production headless e-commerce for Kenyan retail using Medusa.js v2 and Next.js App Router with native M-Pesa payment rails.</w:t>
       </w:r>
     </w:p>
     <w:p>
       <w:pPr>
-        <w:numPr>
-          <w:ilvl w:val="0"/>
-          <w:numId w:val="4"/>
-        </w:numPr>
-        <w:spacing w:before="100" w:beforeAutospacing="1" w:after="53"/>
-        <w:ind w:left="0"/>
-        <w:jc w:val="both"/>
-        <w:divId w:val="653023462"/>
-        <w:rPr>
-          <w:rFonts w:ascii="Calibri" w:eastAsia="Times New Roman" w:hAnsi="Calibri" w:cs="Calibri"/>
-          <w:color w:val="2A2A2A"/>
-          <w:sz w:val="18"/>
-          <w:szCs w:val="18"/>
-          <w:lang w:val="en"/>
-        </w:rPr>
-      </w:pPr>
-      <w:r>
-        <w:rPr>
-          <w:rStyle w:val="lead-bold1"/>
-          <w:rFonts w:ascii="Calibri" w:eastAsia="Times New Roman" w:hAnsi="Calibri" w:cs="Calibri"/>
-          <w:sz w:val="18"/>
-          <w:szCs w:val="18"/>
-          <w:lang w:val="en"/>
-        </w:rPr>
-        <w:t>Biashara H</w:t>
-      </w:r>
-      <w:r>
-        <w:rPr>
-          <w:rStyle w:val="lead-bold1"/>
-          <w:rFonts w:ascii="Calibri" w:eastAsia="Times New Roman" w:hAnsi="Calibri" w:cs="Calibri"/>
-          <w:sz w:val="18"/>
-          <w:szCs w:val="18"/>
-          <w:lang w:val="en"/>
-        </w:rPr>
-        <w:t>ub Headless Commerce:</w:t>
-      </w:r>
-      <w:r>
-        <w:rPr>
-          <w:rFonts w:ascii="Calibri" w:eastAsia="Times New Roman" w:hAnsi="Calibri" w:cs="Calibri"/>
-          <w:color w:val="2A2A2A"/>
-          <w:sz w:val="18"/>
-          <w:szCs w:val="18"/>
-          <w:lang w:val="en"/>
-        </w:rPr>
-        <w:t xml:space="preserve"> Engineered production headless e-commerce for Kenyan retail using Medusa.js v2 and Next.js App Router with native M-Pesa payment rails.</w:t>
-      </w:r>
-    </w:p>
-    <w:p>
-      <w:pPr>
-        <w:divId w:val="364983710"/>
+        <w:divId w:val="1875658016"/>
         <w:rPr>
           <w:rFonts w:ascii="Calibri" w:eastAsia="Times New Roman" w:hAnsi="Calibri" w:cs="Calibri"/>
           <w:b/>
@@ -1473,7 +1473,7 @@
     </w:p>
     <w:p>
       <w:pPr>
-        <w:divId w:val="156268202"/>
+        <w:divId w:val="1850944226"/>
         <w:rPr>
           <w:rFonts w:ascii="Calibri" w:eastAsia="Times New Roman" w:hAnsi="Calibri" w:cs="Calibri"/>
           <w:color w:val="222222"/>
@@ -1488,7 +1488,15 @@
           <w:rFonts w:ascii="Calibri" w:eastAsia="Times New Roman" w:hAnsi="Calibri" w:cs="Calibri"/>
           <w:lang w:val="en"/>
         </w:rPr>
-        <w:t>Bachelor of Science in Software Development | KCA University</w:t>
+        <w:t>Bachelor of Science in Software Developmen</w:t>
+      </w:r>
+      <w:r>
+        <w:rPr>
+          <w:rStyle w:val="job-title-company1"/>
+          <w:rFonts w:ascii="Calibri" w:eastAsia="Times New Roman" w:hAnsi="Calibri" w:cs="Calibri"/>
+          <w:lang w:val="en"/>
+        </w:rPr>
+        <w:t>t | KCA University</w:t>
       </w:r>
       <w:r>
         <w:rPr>
@@ -1506,15 +1514,7 @@
           <w:rFonts w:ascii="Calibri" w:eastAsia="Times New Roman" w:hAnsi="Calibri" w:cs="Calibri"/>
           <w:lang w:val="en"/>
         </w:rPr>
-        <w:t>Nairobi, Keny</w:t>
-      </w:r>
-      <w:r>
-        <w:rPr>
-          <w:rStyle w:val="job-meta1"/>
-          <w:rFonts w:ascii="Calibri" w:eastAsia="Times New Roman" w:hAnsi="Calibri" w:cs="Calibri"/>
-          <w:lang w:val="en"/>
-        </w:rPr>
-        <w:t>a  ·  Sep 2021 – Dec 2026 Expected</w:t>
+        <w:t>Nairobi, Kenya  ·  Sep 2021 – Dec 2026 Expected</w:t>
       </w:r>
       <w:r>
         <w:rPr>
@@ -1536,7 +1536,7 @@
         <w:spacing w:before="100" w:beforeAutospacing="1" w:after="53"/>
         <w:ind w:left="0"/>
         <w:jc w:val="both"/>
-        <w:divId w:val="530386495"/>
+        <w:divId w:val="798382043"/>
         <w:rPr>
           <w:rFonts w:ascii="Calibri" w:eastAsia="Times New Roman" w:hAnsi="Calibri" w:cs="Calibri"/>
           <w:color w:val="2A2A2A"/>
@@ -1563,7 +1563,17 @@
           <w:szCs w:val="18"/>
           <w:lang w:val="en"/>
         </w:rPr>
-        <w:t xml:space="preserve"> Advanced Web Development, Data Structures &amp; Algorithms, Database Management, Network Security, Software Engineering, System Integration, Mobile Application Development, OOP, Agile Project Management.</w:t>
+        <w:t xml:space="preserve"> Advanced Web Development, Data Structures &amp; Algorithms, Database Management, Network Security, Software Engineering, System Integration, Mobile Application Development</w:t>
+      </w:r>
+      <w:r>
+        <w:rPr>
+          <w:rFonts w:ascii="Calibri" w:eastAsia="Times New Roman" w:hAnsi="Calibri" w:cs="Calibri"/>
+          <w:color w:val="2A2A2A"/>
+          <w:sz w:val="18"/>
+          <w:szCs w:val="18"/>
+          <w:lang w:val="en"/>
+        </w:rPr>
+        <w:t>, OOP, Agile Project Management.</w:t>
       </w:r>
     </w:p>
     <w:p>
@@ -1575,7 +1585,7 @@
         <w:spacing w:before="100" w:beforeAutospacing="1" w:after="53"/>
         <w:ind w:left="0"/>
         <w:jc w:val="both"/>
-        <w:divId w:val="530386495"/>
+        <w:divId w:val="798382043"/>
         <w:rPr>
           <w:rFonts w:ascii="Calibri" w:eastAsia="Times New Roman" w:hAnsi="Calibri" w:cs="Calibri"/>
           <w:color w:val="2A2A2A"/>
@@ -1618,9 +1628,9 @@
 <file path=word/numbering.xml><?xml version="1.0" encoding="utf-8"?>
 <w:numbering xmlns:wpc="http://schemas.microsoft.com/office/word/2010/wordprocessingCanvas" xmlns:cx="http://schemas.microsoft.com/office/drawing/2014/chartex" xmlns:cx1="http://schemas.microsoft.com/office/drawing/2015/9/8/chartex" xmlns:cx2="http://schemas.microsoft.com/office/drawing/2015/10/21/chartex" xmlns:cx3="http://schemas.microsoft.com/office/drawing/2016/5/9/chartex" xmlns:cx4="http://schemas.microsoft.com/office/drawing/2016/5/10/chartex" xmlns:cx5="http://schemas.microsoft.com/office/drawing/2016/5/11/chartex" xmlns:cx6="http://schemas.microsoft.com/office/drawing/2016/5/12/chartex" xmlns:cx7="http://schemas.microsoft.com/office/drawing/2016/5/13/chartex" xmlns:cx8="http://schemas.microsoft.com/office/drawing/2016/5/14/chartex" xmlns:mc="http://schemas.openxmlformats.org/markup-compatibility/2006" xmlns:aink="http://schemas.microsoft.com/office/drawing/2016/ink" xmlns:am3d="http://schemas.microsoft.com/office/drawing/2017/model3d" xmlns:o="urn:schemas-microsoft-com:office:office" xmlns:r="http://schemas.openxmlformats.org/officeDocument/2006/relationships" xmlns:m="http://schemas.openxmlformats.org/officeDocument/2006/math" xmlns:v="urn:schemas-microsoft-com:vml" xmlns:wp14="http://schemas.microsoft.com/office/word/2010/wordprocessingDrawing" xmlns:wp="http://schemas.openxmlformats.org/drawingml/2006/wordprocessingDrawing" xmlns:w10="urn:schemas-microsoft-com:office:word" xmlns:w="http://schemas.openxmlformats.org/wordprocessingml/2006/main" xmlns:w14="http://schemas.microsoft.com/office/word/2010/wordml" xmlns:w15="http://schemas.microsoft.com/office/word/2012/wordml" xmlns:w16cid="http://schemas.microsoft.com/office/word/2016/wordml/cid" xmlns:w16se="http://schemas.microsoft.com/office/word/2015/wordml/symex" xmlns:wpg="http://schemas.microsoft.com/office/word/2010/wordprocessingGroup" xmlns:wpi="http://schemas.microsoft.com/office/word/2010/wordprocessingInk" xmlns:wne="http://schemas.microsoft.com/office/word/2006/wordml" xmlns:wps="http://schemas.microsoft.com/office/word/2010/wordprocessingShape" mc:Ignorable="w14 w15 w16se w16cid wp14">
   <w:abstractNum w:abstractNumId="0" w15:restartNumberingAfterBreak="0">
-    <w:nsid w:val="011F2B10"/>
+    <w:nsid w:val="05315DBE"/>
     <w:multiLevelType w:val="multilevel"/>
-    <w:tmpl w:val="9B9AD5D8"/>
+    <w:tmpl w:val="FCFCD90E"/>
     <w:lvl w:ilvl="0">
       <w:start w:val="1"/>
       <w:numFmt w:val="bullet"/>
@@ -1767,9 +1777,9 @@
     </w:lvl>
   </w:abstractNum>
   <w:abstractNum w:abstractNumId="1" w15:restartNumberingAfterBreak="0">
-    <w:nsid w:val="142B74F0"/>
+    <w:nsid w:val="2AE07FC7"/>
     <w:multiLevelType w:val="multilevel"/>
-    <w:tmpl w:val="D9509040"/>
+    <w:tmpl w:val="8C005B2E"/>
     <w:lvl w:ilvl="0">
       <w:start w:val="1"/>
       <w:numFmt w:val="bullet"/>
@@ -1916,9 +1926,9 @@
     </w:lvl>
   </w:abstractNum>
   <w:abstractNum w:abstractNumId="2" w15:restartNumberingAfterBreak="0">
-    <w:nsid w:val="1F110140"/>
+    <w:nsid w:val="32582587"/>
     <w:multiLevelType w:val="multilevel"/>
-    <w:tmpl w:val="49F21B82"/>
+    <w:tmpl w:val="DEB8E344"/>
     <w:lvl w:ilvl="0">
       <w:start w:val="1"/>
       <w:numFmt w:val="bullet"/>
@@ -2065,9 +2075,9 @@
     </w:lvl>
   </w:abstractNum>
   <w:abstractNum w:abstractNumId="3" w15:restartNumberingAfterBreak="0">
-    <w:nsid w:val="35831782"/>
+    <w:nsid w:val="56E31351"/>
     <w:multiLevelType w:val="multilevel"/>
-    <w:tmpl w:val="343A16B4"/>
+    <w:tmpl w:val="9B7A2704"/>
     <w:lvl w:ilvl="0">
       <w:start w:val="1"/>
       <w:numFmt w:val="bullet"/>
@@ -2214,9 +2224,9 @@
     </w:lvl>
   </w:abstractNum>
   <w:abstractNum w:abstractNumId="4" w15:restartNumberingAfterBreak="0">
-    <w:nsid w:val="70215F7E"/>
+    <w:nsid w:val="6A214BB9"/>
     <w:multiLevelType w:val="multilevel"/>
-    <w:tmpl w:val="64268E44"/>
+    <w:tmpl w:val="65143C26"/>
     <w:lvl w:ilvl="0">
       <w:start w:val="1"/>
       <w:numFmt w:val="bullet"/>
@@ -2363,19 +2373,19 @@
     </w:lvl>
   </w:abstractNum>
   <w:num w:numId="1">
-    <w:abstractNumId w:val="2"/>
+    <w:abstractNumId w:val="0"/>
   </w:num>
   <w:num w:numId="2">
-    <w:abstractNumId w:val="3"/>
+    <w:abstractNumId w:val="4"/>
   </w:num>
   <w:num w:numId="3">
     <w:abstractNumId w:val="1"/>
   </w:num>
   <w:num w:numId="4">
-    <w:abstractNumId w:val="4"/>
+    <w:abstractNumId w:val="3"/>
   </w:num>
   <w:num w:numId="5">
-    <w:abstractNumId w:val="0"/>
+    <w:abstractNumId w:val="2"/>
   </w:num>
 </w:numbering>
 </file>

</xml_diff>

<commit_message>
fix(portfolio): update project links, downloads, and remove VPS edition phrasing
</commit_message>
<xml_diff>
--- a/Paul-Karonji-Waithaka-Resume.docx
+++ b/Paul-Karonji-Waithaka-Resume.docx
@@ -7,7 +7,7 @@
         <w:pStyle w:val="Heading1"/>
         <w:spacing w:before="0" w:beforeAutospacing="0" w:after="30" w:afterAutospacing="0"/>
         <w:jc w:val="center"/>
-        <w:divId w:val="1025791538"/>
+        <w:divId w:val="770786535"/>
         <w:rPr>
           <w:rFonts w:ascii="Calibri" w:eastAsia="Times New Roman" w:hAnsi="Calibri" w:cs="Calibri"/>
           <w:color w:val="111111"/>
@@ -35,7 +35,7 @@
       <w:pPr>
         <w:pStyle w:val="role-title"/>
         <w:jc w:val="center"/>
-        <w:divId w:val="1025791538"/>
+        <w:divId w:val="770786535"/>
         <w:rPr>
           <w:rFonts w:ascii="Calibri" w:hAnsi="Calibri" w:cs="Calibri"/>
           <w:lang w:val="en"/>
@@ -53,7 +53,7 @@
       <w:pPr>
         <w:pStyle w:val="contact-info"/>
         <w:jc w:val="center"/>
-        <w:divId w:val="1025791538"/>
+        <w:divId w:val="770786535"/>
         <w:rPr>
           <w:rFonts w:ascii="Calibri" w:hAnsi="Calibri" w:cs="Calibri"/>
           <w:lang w:val="en"/>
@@ -72,19 +72,12 @@
           <w:lang w:val="en"/>
         </w:rPr>
         <w:br/>
-        <w:t xml:space="preserve">LinkedIn: linkedin.com/in/paul-karonji-562080381  |  </w:t>
-      </w:r>
-      <w:r>
-        <w:rPr>
-          <w:rFonts w:ascii="Calibri" w:hAnsi="Calibri" w:cs="Calibri"/>
-          <w:lang w:val="en"/>
-        </w:rPr>
-        <w:t xml:space="preserve">GitHub: github.com/Paul-Karonji </w:t>
-      </w:r>
-    </w:p>
-    <w:p>
-      <w:pPr>
-        <w:divId w:val="1330059679"/>
+        <w:t xml:space="preserve">LinkedIn: linkedin.com/in/paul-karonji-562080381  |  GitHub: github.com/Paul-Karonji </w:t>
+      </w:r>
+    </w:p>
+    <w:p>
+      <w:pPr>
+        <w:divId w:val="1541473215"/>
         <w:rPr>
           <w:rFonts w:ascii="Calibri" w:eastAsia="Times New Roman" w:hAnsi="Calibri" w:cs="Calibri"/>
           <w:b/>
@@ -115,7 +108,7 @@
     <w:p>
       <w:pPr>
         <w:pStyle w:val="summary-text"/>
-        <w:divId w:val="93402138"/>
+        <w:divId w:val="1327366724"/>
         <w:rPr>
           <w:rFonts w:ascii="Calibri" w:hAnsi="Calibri" w:cs="Calibri"/>
           <w:lang w:val="en"/>
@@ -126,14 +119,7 @@
           <w:rFonts w:ascii="Calibri" w:hAnsi="Calibri" w:cs="Calibri"/>
           <w:lang w:val="en"/>
         </w:rPr>
-        <w:t>Full-Stack Software Engineer and Systems Architect with 3+ years delivering production-grade systems spanning distributed backends, enterprise cloud platforms, offline-first desktop/mobile architectures</w:t>
-      </w:r>
-      <w:r>
-        <w:rPr>
-          <w:rFonts w:ascii="Calibri" w:hAnsi="Calibri" w:cs="Calibri"/>
-          <w:lang w:val="en"/>
-        </w:rPr>
-        <w:t xml:space="preserve">, and cryptographic tooling. Founder of WIK Technologies, creator of </w:t>
+        <w:t xml:space="preserve">Full-Stack Software Engineer and Systems Architect with 3+ years delivering production-grade systems spanning distributed backends, enterprise cloud platforms, offline-first desktop/mobile architectures, and cryptographic tooling. Founder of WIK Technologies, creator of </w:t>
       </w:r>
       <w:r>
         <w:rPr>
@@ -193,14 +179,7 @@
           <w:rFonts w:ascii="Calibri" w:hAnsi="Calibri" w:cs="Calibri"/>
           <w:lang w:val="en"/>
         </w:rPr>
-        <w:t xml:space="preserve"> (prope</w:t>
-      </w:r>
-      <w:r>
-        <w:rPr>
-          <w:rFonts w:ascii="Calibri" w:hAnsi="Calibri" w:cs="Calibri"/>
-          <w:lang w:val="en"/>
-        </w:rPr>
-        <w:t xml:space="preserve">rty marketplace monorepo), </w:t>
+        <w:t xml:space="preserve"> (property marketplace monorepo), </w:t>
       </w:r>
       <w:r>
         <w:rPr>
@@ -230,19 +209,12 @@
           <w:rFonts w:ascii="Calibri" w:hAnsi="Calibri" w:cs="Calibri"/>
           <w:lang w:val="en"/>
         </w:rPr>
-        <w:t xml:space="preserve"> (zero-knowledge PBKDF2 password manager). Deep expertise in Go, TypeScript, Python, and PHP, offline-first SQLite synchronization, emerging-market payment rails (M-P</w:t>
-      </w:r>
-      <w:r>
-        <w:rPr>
-          <w:rFonts w:ascii="Calibri" w:hAnsi="Calibri" w:cs="Calibri"/>
-          <w:lang w:val="en"/>
-        </w:rPr>
-        <w:t xml:space="preserve">esa, Paystack), and end-to-end production delivery. Final-year Software Development student at KCA University (Expected 2026). </w:t>
-      </w:r>
-    </w:p>
-    <w:p>
-      <w:pPr>
-        <w:divId w:val="1550342157"/>
+        <w:t xml:space="preserve"> (zero-knowledge PBKDF2 password manager). Deep expertise in Go, TypeScript, Python, and PHP, offline-first SQLite synchronization, emerging-market payment rails (M-Pesa, Paystack), and end-to-end production delivery. Final-year Software Development student at KCA University (Expected 2026). </w:t>
+      </w:r>
+    </w:p>
+    <w:p>
+      <w:pPr>
+        <w:divId w:val="2134784583"/>
         <w:rPr>
           <w:rFonts w:ascii="Calibri" w:eastAsia="Times New Roman" w:hAnsi="Calibri" w:cs="Calibri"/>
           <w:b/>
@@ -278,7 +250,7 @@
         </w:numPr>
         <w:spacing w:before="100" w:beforeAutospacing="1" w:after="38"/>
         <w:ind w:left="0"/>
-        <w:divId w:val="1491870628"/>
+        <w:divId w:val="1663193460"/>
         <w:rPr>
           <w:rFonts w:ascii="Calibri" w:eastAsia="Times New Roman" w:hAnsi="Calibri" w:cs="Calibri"/>
           <w:color w:val="222222"/>
@@ -315,17 +287,7 @@
           <w:szCs w:val="18"/>
           <w:lang w:val="en"/>
         </w:rPr>
-        <w:t xml:space="preserve"> Go (Golang), TypeScript, JavaScript (ES6+), Python, PHP 8, Kotlin, SQL (PostgreSQL, MySQL, SQ</w:t>
-      </w:r>
-      <w:r>
-        <w:rPr>
-          <w:rFonts w:ascii="Calibri" w:eastAsia="Times New Roman" w:hAnsi="Calibri" w:cs="Calibri"/>
-          <w:color w:val="222222"/>
-          <w:sz w:val="18"/>
-          <w:szCs w:val="18"/>
-          <w:lang w:val="en"/>
-        </w:rPr>
-        <w:t>Lite), HTML5, CSS3, Bash</w:t>
+        <w:t xml:space="preserve"> Go (Golang), TypeScript, JavaScript (ES6+), Python, PHP 8, Kotlin, SQL (PostgreSQL, MySQL, SQLite), HTML5, CSS3, Bash</w:t>
       </w:r>
     </w:p>
     <w:p>
@@ -336,7 +298,7 @@
         </w:numPr>
         <w:spacing w:before="100" w:beforeAutospacing="1" w:after="38"/>
         <w:ind w:left="0"/>
-        <w:divId w:val="1491870628"/>
+        <w:divId w:val="1663193460"/>
         <w:rPr>
           <w:rFonts w:ascii="Calibri" w:eastAsia="Times New Roman" w:hAnsi="Calibri" w:cs="Calibri"/>
           <w:color w:val="222222"/>
@@ -384,7 +346,7 @@
         </w:numPr>
         <w:spacing w:before="100" w:beforeAutospacing="1" w:after="38"/>
         <w:ind w:left="0"/>
-        <w:divId w:val="1491870628"/>
+        <w:divId w:val="1663193460"/>
         <w:rPr>
           <w:rFonts w:ascii="Calibri" w:eastAsia="Times New Roman" w:hAnsi="Calibri" w:cs="Calibri"/>
           <w:color w:val="222222"/>
@@ -421,17 +383,7 @@
           <w:szCs w:val="18"/>
           <w:lang w:val="en"/>
         </w:rPr>
-        <w:t xml:space="preserve"> React 19, Next.js 16/15, React Nati</w:t>
-      </w:r>
-      <w:r>
-        <w:rPr>
-          <w:rFonts w:ascii="Calibri" w:eastAsia="Times New Roman" w:hAnsi="Calibri" w:cs="Calibri"/>
-          <w:color w:val="222222"/>
-          <w:sz w:val="18"/>
-          <w:szCs w:val="18"/>
-          <w:lang w:val="en"/>
-        </w:rPr>
-        <w:t>ve 0.86, Expo 57, Electron, Vite, Tailwind CSS, Radix UI, TanStack Query, Progressive Web Apps (PWAs), IndexedDB</w:t>
+        <w:t xml:space="preserve"> React 19, Next.js 16/15, React Native 0.86, Expo 57, Electron, Vite, Tailwind CSS, Radix UI, TanStack Query, Progressive Web Apps (PWAs), IndexedDB</w:t>
       </w:r>
     </w:p>
     <w:p>
@@ -442,7 +394,7 @@
         </w:numPr>
         <w:spacing w:before="100" w:beforeAutospacing="1" w:after="38"/>
         <w:ind w:left="0"/>
-        <w:divId w:val="1491870628"/>
+        <w:divId w:val="1663193460"/>
         <w:rPr>
           <w:rFonts w:ascii="Calibri" w:eastAsia="Times New Roman" w:hAnsi="Calibri" w:cs="Calibri"/>
           <w:color w:val="222222"/>
@@ -479,17 +431,7 @@
           <w:szCs w:val="18"/>
           <w:lang w:val="en"/>
         </w:rPr>
-        <w:t xml:space="preserve"> PostgreSQL, MySQL 8 / TiDB Serverless, SQLite (better-sqlite3, Expo SQLite), Prisma ORM, Drizzle ORM, Eloquent ORM, Supab</w:t>
-      </w:r>
-      <w:r>
-        <w:rPr>
-          <w:rFonts w:ascii="Calibri" w:eastAsia="Times New Roman" w:hAnsi="Calibri" w:cs="Calibri"/>
-          <w:color w:val="222222"/>
-          <w:sz w:val="18"/>
-          <w:szCs w:val="18"/>
-          <w:lang w:val="en"/>
-        </w:rPr>
-        <w:t>ase, Cloudflare R2, AWS S3, Upstash Redis</w:t>
+        <w:t xml:space="preserve"> PostgreSQL, MySQL 8 / TiDB Serverless, SQLite (better-sqlite3, Expo SQLite), Prisma ORM, Drizzle ORM, Eloquent ORM, Supabase, Cloudflare R2, AWS S3, Upstash Redis</w:t>
       </w:r>
     </w:p>
     <w:p>
@@ -500,7 +442,7 @@
         </w:numPr>
         <w:spacing w:before="100" w:beforeAutospacing="1" w:after="38"/>
         <w:ind w:left="0"/>
-        <w:divId w:val="1491870628"/>
+        <w:divId w:val="1663193460"/>
         <w:rPr>
           <w:rFonts w:ascii="Calibri" w:eastAsia="Times New Roman" w:hAnsi="Calibri" w:cs="Calibri"/>
           <w:color w:val="222222"/>
@@ -537,17 +479,7 @@
           <w:szCs w:val="18"/>
           <w:lang w:val="en"/>
         </w:rPr>
-        <w:t xml:space="preserve"> Zero-Knowledge client-side encryption (Web Crypto PBKDF2/SHA-256 100k rounds, AES-GCM-256), hardware-bound CPU/MAC fingerprinting, timing-safe HMAC-SHA256, RLS, Helmet, rate limiting, KRA </w:t>
-      </w:r>
-      <w:r>
-        <w:rPr>
-          <w:rFonts w:ascii="Calibri" w:eastAsia="Times New Roman" w:hAnsi="Calibri" w:cs="Calibri"/>
-          <w:color w:val="222222"/>
-          <w:sz w:val="18"/>
-          <w:szCs w:val="18"/>
-          <w:lang w:val="en"/>
-        </w:rPr>
-        <w:t>eTIMS AES-256 keys, CVE patching</w:t>
+        <w:t xml:space="preserve"> Zero-Knowledge client-side encryption (Web Crypto PBKDF2/SHA-256 100k rounds, AES-GCM-256), hardware-bound CPU/MAC fingerprinting, timing-safe HMAC-SHA256, RLS, Helmet, rate limiting, KRA eTIMS AES-256 keys, CVE patching</w:t>
       </w:r>
     </w:p>
     <w:p>
@@ -558,7 +490,7 @@
         </w:numPr>
         <w:spacing w:before="100" w:beforeAutospacing="1" w:after="38"/>
         <w:ind w:left="0"/>
-        <w:divId w:val="1491870628"/>
+        <w:divId w:val="1663193460"/>
         <w:rPr>
           <w:rFonts w:ascii="Calibri" w:eastAsia="Times New Roman" w:hAnsi="Calibri" w:cs="Calibri"/>
           <w:color w:val="222222"/>
@@ -606,7 +538,7 @@
         </w:numPr>
         <w:spacing w:before="100" w:beforeAutospacing="1" w:after="38"/>
         <w:ind w:left="0"/>
-        <w:divId w:val="1491870628"/>
+        <w:divId w:val="1663193460"/>
         <w:rPr>
           <w:rFonts w:ascii="Calibri" w:eastAsia="Times New Roman" w:hAnsi="Calibri" w:cs="Calibri"/>
           <w:color w:val="222222"/>
@@ -643,22 +575,12 @@
           <w:szCs w:val="18"/>
           <w:lang w:val="en"/>
         </w:rPr>
-        <w:t xml:space="preserve"> KRA eTIMS </w:t>
-      </w:r>
-      <w:r>
-        <w:rPr>
-          <w:rFonts w:ascii="Calibri" w:eastAsia="Times New Roman" w:hAnsi="Calibri" w:cs="Calibri"/>
-          <w:color w:val="222222"/>
-          <w:sz w:val="18"/>
-          <w:szCs w:val="18"/>
-          <w:lang w:val="en"/>
-        </w:rPr>
-        <w:t>(OSCU/VSCU automated fiscalization), M-Pesa Daraja (STK Push &amp; C2B Webhook queues), Paystack (SaaS subscriptions &amp; split payments), Model Context Protocol (MCP), Google Calendar API v3 (OAuth 2.0), Africa's Talking, Cloudinary, Resend</w:t>
-      </w:r>
-    </w:p>
-    <w:p>
-      <w:pPr>
-        <w:divId w:val="1755206502"/>
+        <w:t xml:space="preserve"> KRA eTIMS (OSCU/VSCU automated fiscalization), M-Pesa Daraja (STK Push &amp; C2B Webhook queues), Paystack (SaaS subscriptions &amp; split payments), Model Context Protocol (MCP), Google Calendar API v3 (OAuth 2.0), Africa's Talking, Cloudinary, Resend</w:t>
+      </w:r>
+    </w:p>
+    <w:p>
+      <w:pPr>
+        <w:divId w:val="1875919673"/>
         <w:rPr>
           <w:rFonts w:ascii="Calibri" w:eastAsia="Times New Roman" w:hAnsi="Calibri" w:cs="Calibri"/>
           <w:b/>
@@ -683,9 +605,625 @@
           <w:szCs w:val="22"/>
           <w:lang w:val="en"/>
         </w:rPr>
-        <w:t>Professional Experien</w:t>
-      </w:r>
-      <w:r>
+        <w:t>Professional Experience</w:t>
+      </w:r>
+    </w:p>
+    <w:p>
+      <w:pPr>
+        <w:divId w:val="47650863"/>
+        <w:rPr>
+          <w:rFonts w:ascii="Calibri" w:eastAsia="Times New Roman" w:hAnsi="Calibri" w:cs="Calibri"/>
+          <w:color w:val="222222"/>
+          <w:sz w:val="19"/>
+          <w:szCs w:val="19"/>
+          <w:lang w:val="en"/>
+        </w:rPr>
+      </w:pPr>
+      <w:r>
+        <w:rPr>
+          <w:rStyle w:val="job-title-company1"/>
+          <w:rFonts w:ascii="Calibri" w:eastAsia="Times New Roman" w:hAnsi="Calibri" w:cs="Calibri"/>
+          <w:lang w:val="en"/>
+        </w:rPr>
+        <w:t>Founder &amp; Systems Architect | WIK Technologies</w:t>
+      </w:r>
+      <w:r>
+        <w:rPr>
+          <w:rFonts w:ascii="Calibri" w:eastAsia="Times New Roman" w:hAnsi="Calibri" w:cs="Calibri"/>
+          <w:color w:val="222222"/>
+          <w:sz w:val="19"/>
+          <w:szCs w:val="19"/>
+          <w:lang w:val="en"/>
+        </w:rPr>
+        <w:t xml:space="preserve"> </w:t>
+      </w:r>
+      <w:r>
+        <w:rPr>
+          <w:rStyle w:val="job-meta1"/>
+          <w:rFonts w:ascii="Calibri" w:eastAsia="Times New Roman" w:hAnsi="Calibri" w:cs="Calibri"/>
+          <w:lang w:val="en"/>
+        </w:rPr>
+        <w:t>Nairobi, Kenya  ·  Oct 2025 – Present</w:t>
+      </w:r>
+      <w:r>
+        <w:rPr>
+          <w:rFonts w:ascii="Calibri" w:eastAsia="Times New Roman" w:hAnsi="Calibri" w:cs="Calibri"/>
+          <w:color w:val="222222"/>
+          <w:sz w:val="19"/>
+          <w:szCs w:val="19"/>
+          <w:lang w:val="en"/>
+        </w:rPr>
+        <w:t xml:space="preserve"> </w:t>
+      </w:r>
+    </w:p>
+    <w:p>
+      <w:pPr>
+        <w:numPr>
+          <w:ilvl w:val="0"/>
+          <w:numId w:val="2"/>
+        </w:numPr>
+        <w:spacing w:before="100" w:beforeAutospacing="1" w:after="53"/>
+        <w:ind w:left="0"/>
+        <w:jc w:val="both"/>
+        <w:divId w:val="716053816"/>
+        <w:rPr>
+          <w:rFonts w:ascii="Calibri" w:eastAsia="Times New Roman" w:hAnsi="Calibri" w:cs="Calibri"/>
+          <w:color w:val="2A2A2A"/>
+          <w:sz w:val="18"/>
+          <w:szCs w:val="18"/>
+          <w:lang w:val="en"/>
+        </w:rPr>
+      </w:pPr>
+      <w:r>
+        <w:rPr>
+          <w:rStyle w:val="lead-bold1"/>
+          <w:rFonts w:ascii="Calibri" w:eastAsia="Times New Roman" w:hAnsi="Calibri" w:cs="Calibri"/>
+          <w:sz w:val="18"/>
+          <w:szCs w:val="18"/>
+          <w:lang w:val="en"/>
+        </w:rPr>
+        <w:t>WIK Online Cloud POS:</w:t>
+      </w:r>
+      <w:r>
+        <w:rPr>
+          <w:rFonts w:ascii="Calibri" w:eastAsia="Times New Roman" w:hAnsi="Calibri" w:cs="Calibri"/>
+          <w:color w:val="2A2A2A"/>
+          <w:sz w:val="18"/>
+          <w:szCs w:val="18"/>
+          <w:lang w:val="en"/>
+        </w:rPr>
+        <w:t xml:space="preserve"> Architected multi-tenant cloud retail operations platform on NestJS 11, React 19, and PostgreSQL; built automated KRA eTIMS fiscalization worker (OSCU/VSCU) with AES-256 encrypted tax credentials, real-time M-Pesa STK push &amp; C2B Paybill cashier reconciliation queue (C2BQueueModal), and Paystack recurring SaaS billing with lifecycle walls (ActiveSubscriptionGuard, SuspendedWall).</w:t>
+      </w:r>
+    </w:p>
+    <w:p>
+      <w:pPr>
+        <w:numPr>
+          <w:ilvl w:val="0"/>
+          <w:numId w:val="2"/>
+        </w:numPr>
+        <w:spacing w:before="100" w:beforeAutospacing="1" w:after="53"/>
+        <w:ind w:left="0"/>
+        <w:jc w:val="both"/>
+        <w:divId w:val="716053816"/>
+        <w:rPr>
+          <w:rFonts w:ascii="Calibri" w:eastAsia="Times New Roman" w:hAnsi="Calibri" w:cs="Calibri"/>
+          <w:color w:val="2A2A2A"/>
+          <w:sz w:val="18"/>
+          <w:szCs w:val="18"/>
+          <w:lang w:val="en"/>
+        </w:rPr>
+      </w:pPr>
+      <w:r>
+        <w:rPr>
+          <w:rStyle w:val="lead-bold1"/>
+          <w:rFonts w:ascii="Calibri" w:eastAsia="Times New Roman" w:hAnsi="Calibri" w:cs="Calibri"/>
+          <w:sz w:val="18"/>
+          <w:szCs w:val="18"/>
+          <w:lang w:val="en"/>
+        </w:rPr>
+        <w:t>Brixton Makunga Hospital Management System:</w:t>
+      </w:r>
+      <w:r>
+        <w:rPr>
+          <w:rFonts w:ascii="Calibri" w:eastAsia="Times New Roman" w:hAnsi="Calibri" w:cs="Calibri"/>
+          <w:color w:val="2A2A2A"/>
+          <w:sz w:val="18"/>
+          <w:szCs w:val="18"/>
+          <w:lang w:val="en"/>
+        </w:rPr>
+        <w:t xml:space="preserve"> Delivered 200+ endpoint clinical hospital ERP on Laravel 12, React 19, and MySQL 8 with automated ledger billing via Observer pattern, real-time triage queue management, and pharmacy FEFO batch expiry registers.</w:t>
+      </w:r>
+    </w:p>
+    <w:p>
+      <w:pPr>
+        <w:numPr>
+          <w:ilvl w:val="0"/>
+          <w:numId w:val="2"/>
+        </w:numPr>
+        <w:spacing w:before="100" w:beforeAutospacing="1" w:after="53"/>
+        <w:ind w:left="0"/>
+        <w:jc w:val="both"/>
+        <w:divId w:val="716053816"/>
+        <w:rPr>
+          <w:rFonts w:ascii="Calibri" w:eastAsia="Times New Roman" w:hAnsi="Calibri" w:cs="Calibri"/>
+          <w:color w:val="2A2A2A"/>
+          <w:sz w:val="18"/>
+          <w:szCs w:val="18"/>
+          <w:lang w:val="en"/>
+        </w:rPr>
+      </w:pPr>
+      <w:r>
+        <w:rPr>
+          <w:rStyle w:val="lead-bold1"/>
+          <w:rFonts w:ascii="Calibri" w:eastAsia="Times New Roman" w:hAnsi="Calibri" w:cs="Calibri"/>
+          <w:sz w:val="18"/>
+          <w:szCs w:val="18"/>
+          <w:lang w:val="en"/>
+        </w:rPr>
+        <w:t>FleetTrack Enterprise Telematics:</w:t>
+      </w:r>
+      <w:r>
+        <w:rPr>
+          <w:rFonts w:ascii="Calibri" w:eastAsia="Times New Roman" w:hAnsi="Calibri" w:cs="Calibri"/>
+          <w:color w:val="2A2A2A"/>
+          <w:sz w:val="18"/>
+          <w:szCs w:val="18"/>
+          <w:lang w:val="en"/>
+        </w:rPr>
+        <w:t xml:space="preserve"> Engineered high-concurrency Go backend for batch IoT telematics ingestion and real-time WebSocket fan-out, paired with an offline-first React Native (Expo 57) driver mobile app buffering telemetry in local SQLite with QR manifest claiming and stoppage detection.</w:t>
+      </w:r>
+    </w:p>
+    <w:p>
+      <w:pPr>
+        <w:numPr>
+          <w:ilvl w:val="0"/>
+          <w:numId w:val="2"/>
+        </w:numPr>
+        <w:spacing w:before="100" w:beforeAutospacing="1" w:after="53"/>
+        <w:ind w:left="0"/>
+        <w:jc w:val="both"/>
+        <w:divId w:val="716053816"/>
+        <w:rPr>
+          <w:rFonts w:ascii="Calibri" w:eastAsia="Times New Roman" w:hAnsi="Calibri" w:cs="Calibri"/>
+          <w:color w:val="2A2A2A"/>
+          <w:sz w:val="18"/>
+          <w:szCs w:val="18"/>
+          <w:lang w:val="en"/>
+        </w:rPr>
+      </w:pPr>
+      <w:r>
+        <w:rPr>
+          <w:rStyle w:val="lead-bold1"/>
+          <w:rFonts w:ascii="Calibri" w:eastAsia="Times New Roman" w:hAnsi="Calibri" w:cs="Calibri"/>
+          <w:sz w:val="18"/>
+          <w:szCs w:val="18"/>
+          <w:lang w:val="en"/>
+        </w:rPr>
+        <w:t>HotBill KE Telecommunications:</w:t>
+      </w:r>
+      <w:r>
+        <w:rPr>
+          <w:rFonts w:ascii="Calibri" w:eastAsia="Times New Roman" w:hAnsi="Calibri" w:cs="Calibri"/>
+          <w:color w:val="2A2A2A"/>
+          <w:sz w:val="18"/>
+          <w:szCs w:val="18"/>
+          <w:lang w:val="en"/>
+        </w:rPr>
+        <w:t xml:space="preserve"> Built automated telecommunications billing daemon integrating MikroTik RouterOS socket API with M-Pesa Daraja STK push and a Next.js 14 NOC console for ISP/hotspot bandwidth automation in Docker Compose.</w:t>
+      </w:r>
+    </w:p>
+    <w:p>
+      <w:pPr>
+        <w:numPr>
+          <w:ilvl w:val="0"/>
+          <w:numId w:val="2"/>
+        </w:numPr>
+        <w:spacing w:before="100" w:beforeAutospacing="1" w:after="53"/>
+        <w:ind w:left="0"/>
+        <w:jc w:val="both"/>
+        <w:divId w:val="716053816"/>
+        <w:rPr>
+          <w:rFonts w:ascii="Calibri" w:eastAsia="Times New Roman" w:hAnsi="Calibri" w:cs="Calibri"/>
+          <w:color w:val="2A2A2A"/>
+          <w:sz w:val="18"/>
+          <w:szCs w:val="18"/>
+          <w:lang w:val="en"/>
+        </w:rPr>
+      </w:pPr>
+      <w:r>
+        <w:rPr>
+          <w:rStyle w:val="lead-bold1"/>
+          <w:rFonts w:ascii="Calibri" w:eastAsia="Times New Roman" w:hAnsi="Calibri" w:cs="Calibri"/>
+          <w:sz w:val="18"/>
+          <w:szCs w:val="18"/>
+          <w:lang w:val="en"/>
+        </w:rPr>
+        <w:t>Padi Password Manager:</w:t>
+      </w:r>
+      <w:r>
+        <w:rPr>
+          <w:rFonts w:ascii="Calibri" w:eastAsia="Times New Roman" w:hAnsi="Calibri" w:cs="Calibri"/>
+          <w:color w:val="2A2A2A"/>
+          <w:sz w:val="18"/>
+          <w:szCs w:val="18"/>
+          <w:lang w:val="en"/>
+        </w:rPr>
+        <w:t xml:space="preserve"> Developed zero-knowledge cross-browser extension (Manifest V3) and Web Vault using client-side Web Crypto PBKDF2 (100,000 iterations) and AES-GCM-256 with Supabase synchronization.</w:t>
+      </w:r>
+    </w:p>
+    <w:p>
+      <w:pPr>
+        <w:numPr>
+          <w:ilvl w:val="0"/>
+          <w:numId w:val="2"/>
+        </w:numPr>
+        <w:spacing w:before="100" w:beforeAutospacing="1" w:after="53"/>
+        <w:ind w:left="0"/>
+        <w:jc w:val="both"/>
+        <w:divId w:val="716053816"/>
+        <w:rPr>
+          <w:rFonts w:ascii="Calibri" w:eastAsia="Times New Roman" w:hAnsi="Calibri" w:cs="Calibri"/>
+          <w:color w:val="2A2A2A"/>
+          <w:sz w:val="18"/>
+          <w:szCs w:val="18"/>
+          <w:lang w:val="en"/>
+        </w:rPr>
+      </w:pPr>
+      <w:r>
+        <w:rPr>
+          <w:rStyle w:val="lead-bold1"/>
+          <w:rFonts w:ascii="Calibri" w:eastAsia="Times New Roman" w:hAnsi="Calibri" w:cs="Calibri"/>
+          <w:sz w:val="18"/>
+          <w:szCs w:val="18"/>
+          <w:lang w:val="en"/>
+        </w:rPr>
+        <w:lastRenderedPageBreak/>
+        <w:t>WIK-POS Desktop Suite &amp; Licensing Authority:</w:t>
+      </w:r>
+      <w:r>
+        <w:rPr>
+          <w:rFonts w:ascii="Calibri" w:eastAsia="Times New Roman" w:hAnsi="Calibri" w:cs="Calibri"/>
+          <w:color w:val="2A2A2A"/>
+          <w:sz w:val="18"/>
+          <w:szCs w:val="18"/>
+          <w:lang w:val="en"/>
+        </w:rPr>
+        <w:t xml:space="preserve"> Shipped offline-first Electron + SQLite retail suite featuring hardware-bound licensing (CPU+MAC fingerprinting), 30-day offline grace periods, FEFO pharmacy expiry batching (v1.3.33), and hotel multi-terminal LAN F&amp;B ordering (v1.3.26).</w:t>
+      </w:r>
+    </w:p>
+    <w:p>
+      <w:pPr>
+        <w:numPr>
+          <w:ilvl w:val="0"/>
+          <w:numId w:val="2"/>
+        </w:numPr>
+        <w:spacing w:before="100" w:beforeAutospacing="1" w:after="53"/>
+        <w:ind w:left="0"/>
+        <w:jc w:val="both"/>
+        <w:divId w:val="716053816"/>
+        <w:rPr>
+          <w:rFonts w:ascii="Calibri" w:eastAsia="Times New Roman" w:hAnsi="Calibri" w:cs="Calibri"/>
+          <w:color w:val="2A2A2A"/>
+          <w:sz w:val="18"/>
+          <w:szCs w:val="18"/>
+          <w:lang w:val="en"/>
+        </w:rPr>
+      </w:pPr>
+      <w:r>
+        <w:rPr>
+          <w:rStyle w:val="lead-bold1"/>
+          <w:rFonts w:ascii="Calibri" w:eastAsia="Times New Roman" w:hAnsi="Calibri" w:cs="Calibri"/>
+          <w:sz w:val="18"/>
+          <w:szCs w:val="18"/>
+          <w:lang w:val="en"/>
+        </w:rPr>
+        <w:t>DueSync Smart Task Management &amp; MCP:</w:t>
+      </w:r>
+      <w:r>
+        <w:rPr>
+          <w:rFonts w:ascii="Calibri" w:eastAsia="Times New Roman" w:hAnsi="Calibri" w:cs="Calibri"/>
+          <w:color w:val="2A2A2A"/>
+          <w:sz w:val="18"/>
+          <w:szCs w:val="18"/>
+          <w:lang w:val="en"/>
+        </w:rPr>
+        <w:t xml:space="preserve"> Shipped task-management SaaS on Next.js 15 featuring two-way Google Calendar OAuth2 sync, Upstash Redis rate limiting, and a native 13-tool MCP server allowing AI agents to orchestrate schedule planning.</w:t>
+      </w:r>
+    </w:p>
+    <w:p>
+      <w:pPr>
+        <w:divId w:val="2035686391"/>
+        <w:rPr>
+          <w:rFonts w:ascii="Calibri" w:eastAsia="Times New Roman" w:hAnsi="Calibri" w:cs="Calibri"/>
+          <w:color w:val="222222"/>
+          <w:sz w:val="19"/>
+          <w:szCs w:val="19"/>
+          <w:lang w:val="en"/>
+        </w:rPr>
+      </w:pPr>
+      <w:r>
+        <w:rPr>
+          <w:rStyle w:val="job-title-company1"/>
+          <w:rFonts w:ascii="Calibri" w:eastAsia="Times New Roman" w:hAnsi="Calibri" w:cs="Calibri"/>
+          <w:lang w:val="en"/>
+        </w:rPr>
+        <w:t>Technical Lead (Industrial Attachment) | JHUB Africa</w:t>
+      </w:r>
+      <w:r>
+        <w:rPr>
+          <w:rFonts w:ascii="Calibri" w:eastAsia="Times New Roman" w:hAnsi="Calibri" w:cs="Calibri"/>
+          <w:color w:val="222222"/>
+          <w:sz w:val="19"/>
+          <w:szCs w:val="19"/>
+          <w:lang w:val="en"/>
+        </w:rPr>
+        <w:t xml:space="preserve"> </w:t>
+      </w:r>
+      <w:r>
+        <w:rPr>
+          <w:rStyle w:val="job-meta1"/>
+          <w:rFonts w:ascii="Calibri" w:eastAsia="Times New Roman" w:hAnsi="Calibri" w:cs="Calibri"/>
+          <w:lang w:val="en"/>
+        </w:rPr>
+        <w:t>Nairobi, Kenya  ·  Sep 2025 – Dec 2025</w:t>
+      </w:r>
+      <w:r>
+        <w:rPr>
+          <w:rFonts w:ascii="Calibri" w:eastAsia="Times New Roman" w:hAnsi="Calibri" w:cs="Calibri"/>
+          <w:color w:val="222222"/>
+          <w:sz w:val="19"/>
+          <w:szCs w:val="19"/>
+          <w:lang w:val="en"/>
+        </w:rPr>
+        <w:t xml:space="preserve"> </w:t>
+      </w:r>
+    </w:p>
+    <w:p>
+      <w:pPr>
+        <w:numPr>
+          <w:ilvl w:val="0"/>
+          <w:numId w:val="3"/>
+        </w:numPr>
+        <w:spacing w:before="100" w:beforeAutospacing="1" w:after="53"/>
+        <w:ind w:left="0"/>
+        <w:jc w:val="both"/>
+        <w:divId w:val="1040058729"/>
+        <w:rPr>
+          <w:rFonts w:ascii="Calibri" w:eastAsia="Times New Roman" w:hAnsi="Calibri" w:cs="Calibri"/>
+          <w:color w:val="2A2A2A"/>
+          <w:sz w:val="18"/>
+          <w:szCs w:val="18"/>
+          <w:lang w:val="en"/>
+        </w:rPr>
+      </w:pPr>
+      <w:r>
+        <w:rPr>
+          <w:rStyle w:val="lead-bold1"/>
+          <w:rFonts w:ascii="Calibri" w:eastAsia="Times New Roman" w:hAnsi="Calibri" w:cs="Calibri"/>
+          <w:sz w:val="18"/>
+          <w:szCs w:val="18"/>
+          <w:lang w:val="en"/>
+        </w:rPr>
+        <w:t>JHUB Africa Innovation Tracker:</w:t>
+      </w:r>
+      <w:r>
+        <w:rPr>
+          <w:rFonts w:ascii="Calibri" w:eastAsia="Times New Roman" w:hAnsi="Calibri" w:cs="Calibri"/>
+          <w:color w:val="2A2A2A"/>
+          <w:sz w:val="18"/>
+          <w:szCs w:val="18"/>
+          <w:lang w:val="en"/>
+        </w:rPr>
+        <w:t xml:space="preserve"> Directed engineering of the JKUAT innovation management platform (PHP 8.1, MySQL, Docker, JavaScript) across 4 user roles, 6 project lifecycle stages, and automated mentor assignment engines; delivered in production for active nationwide use.</w:t>
+      </w:r>
+    </w:p>
+    <w:p>
+      <w:pPr>
+        <w:numPr>
+          <w:ilvl w:val="0"/>
+          <w:numId w:val="3"/>
+        </w:numPr>
+        <w:spacing w:before="100" w:beforeAutospacing="1" w:after="53"/>
+        <w:ind w:left="0"/>
+        <w:jc w:val="both"/>
+        <w:divId w:val="1040058729"/>
+        <w:rPr>
+          <w:rFonts w:ascii="Calibri" w:eastAsia="Times New Roman" w:hAnsi="Calibri" w:cs="Calibri"/>
+          <w:color w:val="2A2A2A"/>
+          <w:sz w:val="18"/>
+          <w:szCs w:val="18"/>
+          <w:lang w:val="en"/>
+        </w:rPr>
+      </w:pPr>
+      <w:r>
+        <w:rPr>
+          <w:rStyle w:val="lead-bold1"/>
+          <w:rFonts w:ascii="Calibri" w:eastAsia="Times New Roman" w:hAnsi="Calibri" w:cs="Calibri"/>
+          <w:sz w:val="18"/>
+          <w:szCs w:val="18"/>
+          <w:lang w:val="en"/>
+        </w:rPr>
+        <w:t>Quality &amp; DevOps Standards:</w:t>
+      </w:r>
+      <w:r>
+        <w:rPr>
+          <w:rFonts w:ascii="Calibri" w:eastAsia="Times New Roman" w:hAnsi="Calibri" w:cs="Calibri"/>
+          <w:color w:val="2A2A2A"/>
+          <w:sz w:val="18"/>
+          <w:szCs w:val="18"/>
+          <w:lang w:val="en"/>
+        </w:rPr>
+        <w:t xml:space="preserve"> Established PSR-12 coding standards, conducted code reviews, and containerized the platform with Docker Compose, ensuring high reliability for innovators and investors.</w:t>
+      </w:r>
+    </w:p>
+    <w:p>
+      <w:pPr>
+        <w:divId w:val="183446064"/>
+        <w:rPr>
+          <w:rFonts w:ascii="Calibri" w:eastAsia="Times New Roman" w:hAnsi="Calibri" w:cs="Calibri"/>
+          <w:color w:val="222222"/>
+          <w:sz w:val="19"/>
+          <w:szCs w:val="19"/>
+          <w:lang w:val="en"/>
+        </w:rPr>
+      </w:pPr>
+      <w:r>
+        <w:rPr>
+          <w:rStyle w:val="job-title-company1"/>
+          <w:rFonts w:ascii="Calibri" w:eastAsia="Times New Roman" w:hAnsi="Calibri" w:cs="Calibri"/>
+          <w:lang w:val="en"/>
+        </w:rPr>
+        <w:t>Freelance Software Engineer &amp; Systems Consultant | Independent Contractor</w:t>
+      </w:r>
+      <w:r>
+        <w:rPr>
+          <w:rFonts w:ascii="Calibri" w:eastAsia="Times New Roman" w:hAnsi="Calibri" w:cs="Calibri"/>
+          <w:color w:val="222222"/>
+          <w:sz w:val="19"/>
+          <w:szCs w:val="19"/>
+          <w:lang w:val="en"/>
+        </w:rPr>
+        <w:t xml:space="preserve"> </w:t>
+      </w:r>
+      <w:r>
+        <w:rPr>
+          <w:rStyle w:val="job-meta1"/>
+          <w:rFonts w:ascii="Calibri" w:eastAsia="Times New Roman" w:hAnsi="Calibri" w:cs="Calibri"/>
+          <w:lang w:val="en"/>
+        </w:rPr>
+        <w:t>Remote &amp; Nairobi  ·  2023 – Present</w:t>
+      </w:r>
+      <w:r>
+        <w:rPr>
+          <w:rFonts w:ascii="Calibri" w:eastAsia="Times New Roman" w:hAnsi="Calibri" w:cs="Calibri"/>
+          <w:color w:val="222222"/>
+          <w:sz w:val="19"/>
+          <w:szCs w:val="19"/>
+          <w:lang w:val="en"/>
+        </w:rPr>
+        <w:t xml:space="preserve"> </w:t>
+      </w:r>
+    </w:p>
+    <w:p>
+      <w:pPr>
+        <w:numPr>
+          <w:ilvl w:val="0"/>
+          <w:numId w:val="4"/>
+        </w:numPr>
+        <w:spacing w:before="100" w:beforeAutospacing="1" w:after="53"/>
+        <w:ind w:left="0"/>
+        <w:jc w:val="both"/>
+        <w:divId w:val="910967553"/>
+        <w:rPr>
+          <w:rFonts w:ascii="Calibri" w:eastAsia="Times New Roman" w:hAnsi="Calibri" w:cs="Calibri"/>
+          <w:color w:val="2A2A2A"/>
+          <w:sz w:val="18"/>
+          <w:szCs w:val="18"/>
+          <w:lang w:val="en"/>
+        </w:rPr>
+      </w:pPr>
+      <w:r>
+        <w:rPr>
+          <w:rStyle w:val="lead-bold1"/>
+          <w:rFonts w:ascii="Calibri" w:eastAsia="Times New Roman" w:hAnsi="Calibri" w:cs="Calibri"/>
+          <w:sz w:val="18"/>
+          <w:szCs w:val="18"/>
+          <w:lang w:val="en"/>
+        </w:rPr>
+        <w:t>MtaaKeys Property Marketplace:</w:t>
+      </w:r>
+      <w:r>
+        <w:rPr>
+          <w:rFonts w:ascii="Calibri" w:eastAsia="Times New Roman" w:hAnsi="Calibri" w:cs="Calibri"/>
+          <w:color w:val="2A2A2A"/>
+          <w:sz w:val="18"/>
+          <w:szCs w:val="18"/>
+          <w:lang w:val="en"/>
+        </w:rPr>
+        <w:t xml:space="preserve"> Shipped full-stack property marketplace monorepo (Next.js 16, Express 5, PostgreSQL, Prisma, Socket.IO) with dual Paystack subscription tiers (agents &amp; land agents), logarithmic listing curation algorithms, and CI/CD security invariant tests.</w:t>
+      </w:r>
+    </w:p>
+    <w:p>
+      <w:pPr>
+        <w:numPr>
+          <w:ilvl w:val="0"/>
+          <w:numId w:val="4"/>
+        </w:numPr>
+        <w:spacing w:before="100" w:beforeAutospacing="1" w:after="53"/>
+        <w:ind w:left="0"/>
+        <w:jc w:val="both"/>
+        <w:divId w:val="910967553"/>
+        <w:rPr>
+          <w:rFonts w:ascii="Calibri" w:eastAsia="Times New Roman" w:hAnsi="Calibri" w:cs="Calibri"/>
+          <w:color w:val="2A2A2A"/>
+          <w:sz w:val="18"/>
+          <w:szCs w:val="18"/>
+          <w:lang w:val="en"/>
+        </w:rPr>
+      </w:pPr>
+      <w:r>
+        <w:rPr>
+          <w:rStyle w:val="lead-bold1"/>
+          <w:rFonts w:ascii="Calibri" w:eastAsia="Times New Roman" w:hAnsi="Calibri" w:cs="Calibri"/>
+          <w:sz w:val="18"/>
+          <w:szCs w:val="18"/>
+          <w:lang w:val="en"/>
+        </w:rPr>
+        <w:t>K-Track Commission SaaS:</w:t>
+      </w:r>
+      <w:r>
+        <w:rPr>
+          <w:rFonts w:ascii="Calibri" w:eastAsia="Times New Roman" w:hAnsi="Calibri" w:cs="Calibri"/>
+          <w:color w:val="2A2A2A"/>
+          <w:sz w:val="18"/>
+          <w:szCs w:val="18"/>
+          <w:lang w:val="en"/>
+        </w:rPr>
+        <w:t xml:space="preserve"> Built multi-tutor agency commission platform (React 19, Express 5, TiDB Serverless, Cloudflare R2, Socket.IO) with timing-safe HMAC guest checkout URLs and idempotent boot-time database patching.</w:t>
+      </w:r>
+    </w:p>
+    <w:p>
+      <w:pPr>
+        <w:numPr>
+          <w:ilvl w:val="0"/>
+          <w:numId w:val="4"/>
+        </w:numPr>
+        <w:spacing w:before="100" w:beforeAutospacing="1" w:after="53"/>
+        <w:ind w:left="0"/>
+        <w:jc w:val="both"/>
+        <w:divId w:val="910967553"/>
+        <w:rPr>
+          <w:rFonts w:ascii="Calibri" w:eastAsia="Times New Roman" w:hAnsi="Calibri" w:cs="Calibri"/>
+          <w:color w:val="2A2A2A"/>
+          <w:sz w:val="18"/>
+          <w:szCs w:val="18"/>
+          <w:lang w:val="en"/>
+        </w:rPr>
+      </w:pPr>
+      <w:r>
+        <w:rPr>
+          <w:rStyle w:val="lead-bold1"/>
+          <w:rFonts w:ascii="Calibri" w:eastAsia="Times New Roman" w:hAnsi="Calibri" w:cs="Calibri"/>
+          <w:sz w:val="18"/>
+          <w:szCs w:val="18"/>
+          <w:lang w:val="en"/>
+        </w:rPr>
+        <w:t>Biashara Hub Headless Commerce:</w:t>
+      </w:r>
+      <w:r>
+        <w:rPr>
+          <w:rFonts w:ascii="Calibri" w:eastAsia="Times New Roman" w:hAnsi="Calibri" w:cs="Calibri"/>
+          <w:color w:val="2A2A2A"/>
+          <w:sz w:val="18"/>
+          <w:szCs w:val="18"/>
+          <w:lang w:val="en"/>
+        </w:rPr>
+        <w:t xml:space="preserve"> Engineered production headless e-commerce for Kenyan retail using Medusa.js v2 and Next.js App Router with native M-Pesa payment rails.</w:t>
+      </w:r>
+    </w:p>
+    <w:p>
+      <w:pPr>
+        <w:divId w:val="946471981"/>
         <w:rPr>
           <w:rFonts w:ascii="Calibri" w:eastAsia="Times New Roman" w:hAnsi="Calibri" w:cs="Calibri"/>
           <w:b/>
@@ -697,753 +1235,8 @@
           <w:szCs w:val="22"/>
           <w:lang w:val="en"/>
         </w:rPr>
-        <w:t>ce</w:t>
-      </w:r>
-    </w:p>
-    <w:p>
-      <w:pPr>
-        <w:divId w:val="82922377"/>
-        <w:rPr>
-          <w:rFonts w:ascii="Calibri" w:eastAsia="Times New Roman" w:hAnsi="Calibri" w:cs="Calibri"/>
-          <w:color w:val="222222"/>
-          <w:sz w:val="19"/>
-          <w:szCs w:val="19"/>
-          <w:lang w:val="en"/>
-        </w:rPr>
-      </w:pPr>
-      <w:r>
-        <w:rPr>
-          <w:rStyle w:val="job-title-company1"/>
-          <w:rFonts w:ascii="Calibri" w:eastAsia="Times New Roman" w:hAnsi="Calibri" w:cs="Calibri"/>
-          <w:lang w:val="en"/>
-        </w:rPr>
-        <w:t>Founder &amp; Systems Architect | WIK Technologies</w:t>
-      </w:r>
-      <w:r>
-        <w:rPr>
-          <w:rFonts w:ascii="Calibri" w:eastAsia="Times New Roman" w:hAnsi="Calibri" w:cs="Calibri"/>
-          <w:color w:val="222222"/>
-          <w:sz w:val="19"/>
-          <w:szCs w:val="19"/>
-          <w:lang w:val="en"/>
-        </w:rPr>
-        <w:t xml:space="preserve"> </w:t>
-      </w:r>
-      <w:r>
-        <w:rPr>
-          <w:rStyle w:val="job-meta1"/>
-          <w:rFonts w:ascii="Calibri" w:eastAsia="Times New Roman" w:hAnsi="Calibri" w:cs="Calibri"/>
-          <w:lang w:val="en"/>
-        </w:rPr>
-        <w:t>Nairobi, Kenya  ·  Oct 2025 – Present</w:t>
-      </w:r>
-      <w:r>
-        <w:rPr>
-          <w:rFonts w:ascii="Calibri" w:eastAsia="Times New Roman" w:hAnsi="Calibri" w:cs="Calibri"/>
-          <w:color w:val="222222"/>
-          <w:sz w:val="19"/>
-          <w:szCs w:val="19"/>
-          <w:lang w:val="en"/>
-        </w:rPr>
-        <w:t xml:space="preserve"> </w:t>
-      </w:r>
-    </w:p>
-    <w:p>
-      <w:pPr>
-        <w:numPr>
-          <w:ilvl w:val="0"/>
-          <w:numId w:val="2"/>
-        </w:numPr>
-        <w:spacing w:before="100" w:beforeAutospacing="1" w:after="53"/>
-        <w:ind w:left="0"/>
-        <w:jc w:val="both"/>
-        <w:divId w:val="2015960565"/>
-        <w:rPr>
-          <w:rFonts w:ascii="Calibri" w:eastAsia="Times New Roman" w:hAnsi="Calibri" w:cs="Calibri"/>
-          <w:color w:val="2A2A2A"/>
-          <w:sz w:val="18"/>
-          <w:szCs w:val="18"/>
-          <w:lang w:val="en"/>
-        </w:rPr>
-      </w:pPr>
-      <w:r>
-        <w:rPr>
-          <w:rStyle w:val="lead-bold1"/>
-          <w:rFonts w:ascii="Calibri" w:eastAsia="Times New Roman" w:hAnsi="Calibri" w:cs="Calibri"/>
-          <w:sz w:val="18"/>
-          <w:szCs w:val="18"/>
-          <w:lang w:val="en"/>
-        </w:rPr>
-        <w:t>WIK Online Cloud POS (VPS Edition):</w:t>
-      </w:r>
-      <w:r>
-        <w:rPr>
-          <w:rFonts w:ascii="Calibri" w:eastAsia="Times New Roman" w:hAnsi="Calibri" w:cs="Calibri"/>
-          <w:color w:val="2A2A2A"/>
-          <w:sz w:val="18"/>
-          <w:szCs w:val="18"/>
-          <w:lang w:val="en"/>
-        </w:rPr>
-        <w:t xml:space="preserve"> </w:t>
-      </w:r>
-      <w:r>
-        <w:rPr>
-          <w:rFonts w:ascii="Calibri" w:eastAsia="Times New Roman" w:hAnsi="Calibri" w:cs="Calibri"/>
-          <w:color w:val="2A2A2A"/>
-          <w:sz w:val="18"/>
-          <w:szCs w:val="18"/>
-          <w:lang w:val="en"/>
-        </w:rPr>
-        <w:t>Architected multi-tenant cloud retail operations platform on NestJS 11, React 19, and PostgreSQL; built automated KRA eTIMS fiscalization worker (OSCU/VSCU) with AES-256 encrypted tax credentials, real-time M-Pesa STK push &amp; C2B Paybill cashier reconciliat</w:t>
-      </w:r>
-      <w:r>
-        <w:rPr>
-          <w:rFonts w:ascii="Calibri" w:eastAsia="Times New Roman" w:hAnsi="Calibri" w:cs="Calibri"/>
-          <w:color w:val="2A2A2A"/>
-          <w:sz w:val="18"/>
-          <w:szCs w:val="18"/>
-          <w:lang w:val="en"/>
-        </w:rPr>
-        <w:t>ion queue (C2BQueueModal), and Paystack recurring SaaS billing with lifecycle walls (ActiveSubscriptionGuard, SuspendedWall).</w:t>
-      </w:r>
-    </w:p>
-    <w:p>
-      <w:pPr>
-        <w:numPr>
-          <w:ilvl w:val="0"/>
-          <w:numId w:val="2"/>
-        </w:numPr>
-        <w:spacing w:before="100" w:beforeAutospacing="1" w:after="53"/>
-        <w:ind w:left="0"/>
-        <w:jc w:val="both"/>
-        <w:divId w:val="2015960565"/>
-        <w:rPr>
-          <w:rFonts w:ascii="Calibri" w:eastAsia="Times New Roman" w:hAnsi="Calibri" w:cs="Calibri"/>
-          <w:color w:val="2A2A2A"/>
-          <w:sz w:val="18"/>
-          <w:szCs w:val="18"/>
-          <w:lang w:val="en"/>
-        </w:rPr>
-      </w:pPr>
-      <w:r>
-        <w:rPr>
-          <w:rStyle w:val="lead-bold1"/>
-          <w:rFonts w:ascii="Calibri" w:eastAsia="Times New Roman" w:hAnsi="Calibri" w:cs="Calibri"/>
-          <w:sz w:val="18"/>
-          <w:szCs w:val="18"/>
-          <w:lang w:val="en"/>
-        </w:rPr>
-        <w:t>Brixton Makunga Hospital Management System:</w:t>
-      </w:r>
-      <w:r>
-        <w:rPr>
-          <w:rFonts w:ascii="Calibri" w:eastAsia="Times New Roman" w:hAnsi="Calibri" w:cs="Calibri"/>
-          <w:color w:val="2A2A2A"/>
-          <w:sz w:val="18"/>
-          <w:szCs w:val="18"/>
-          <w:lang w:val="en"/>
-        </w:rPr>
-        <w:t xml:space="preserve"> Delivered 200+ endpoint clinical hospital ERP on Laravel 12, React 19, and MySQL 8 wit</w:t>
-      </w:r>
-      <w:r>
-        <w:rPr>
-          <w:rFonts w:ascii="Calibri" w:eastAsia="Times New Roman" w:hAnsi="Calibri" w:cs="Calibri"/>
-          <w:color w:val="2A2A2A"/>
-          <w:sz w:val="18"/>
-          <w:szCs w:val="18"/>
-          <w:lang w:val="en"/>
-        </w:rPr>
-        <w:t>h automated ledger billing via Observer pattern, real-time triage queue management, and pharmacy FEFO batch expiry registers.</w:t>
-      </w:r>
-    </w:p>
-    <w:p>
-      <w:pPr>
-        <w:numPr>
-          <w:ilvl w:val="0"/>
-          <w:numId w:val="2"/>
-        </w:numPr>
-        <w:spacing w:before="100" w:beforeAutospacing="1" w:after="53"/>
-        <w:ind w:left="0"/>
-        <w:jc w:val="both"/>
-        <w:divId w:val="2015960565"/>
-        <w:rPr>
-          <w:rFonts w:ascii="Calibri" w:eastAsia="Times New Roman" w:hAnsi="Calibri" w:cs="Calibri"/>
-          <w:color w:val="2A2A2A"/>
-          <w:sz w:val="18"/>
-          <w:szCs w:val="18"/>
-          <w:lang w:val="en"/>
-        </w:rPr>
-      </w:pPr>
-      <w:r>
-        <w:rPr>
-          <w:rStyle w:val="lead-bold1"/>
-          <w:rFonts w:ascii="Calibri" w:eastAsia="Times New Roman" w:hAnsi="Calibri" w:cs="Calibri"/>
-          <w:sz w:val="18"/>
-          <w:szCs w:val="18"/>
-          <w:lang w:val="en"/>
-        </w:rPr>
-        <w:t>FleetTrack Enterprise Telematics:</w:t>
-      </w:r>
-      <w:r>
-        <w:rPr>
-          <w:rFonts w:ascii="Calibri" w:eastAsia="Times New Roman" w:hAnsi="Calibri" w:cs="Calibri"/>
-          <w:color w:val="2A2A2A"/>
-          <w:sz w:val="18"/>
-          <w:szCs w:val="18"/>
-          <w:lang w:val="en"/>
-        </w:rPr>
-        <w:t xml:space="preserve"> Engineered high-concurrency Go backend for batch IoT telematics ingestion and real-time WebSocke</w:t>
-      </w:r>
-      <w:r>
-        <w:rPr>
-          <w:rFonts w:ascii="Calibri" w:eastAsia="Times New Roman" w:hAnsi="Calibri" w:cs="Calibri"/>
-          <w:color w:val="2A2A2A"/>
-          <w:sz w:val="18"/>
-          <w:szCs w:val="18"/>
-          <w:lang w:val="en"/>
-        </w:rPr>
-        <w:t>t fan-out, paired with an offline-first React Native (Expo 57) driver mobile app buffering telemetry in local SQLite with QR manifest claiming and stoppage detection.</w:t>
-      </w:r>
-    </w:p>
-    <w:p>
-      <w:pPr>
-        <w:numPr>
-          <w:ilvl w:val="0"/>
-          <w:numId w:val="2"/>
-        </w:numPr>
-        <w:spacing w:before="100" w:beforeAutospacing="1" w:after="53"/>
-        <w:ind w:left="0"/>
-        <w:jc w:val="both"/>
-        <w:divId w:val="2015960565"/>
-        <w:rPr>
-          <w:rFonts w:ascii="Calibri" w:eastAsia="Times New Roman" w:hAnsi="Calibri" w:cs="Calibri"/>
-          <w:color w:val="2A2A2A"/>
-          <w:sz w:val="18"/>
-          <w:szCs w:val="18"/>
-          <w:lang w:val="en"/>
-        </w:rPr>
-      </w:pPr>
-      <w:r>
-        <w:rPr>
-          <w:rStyle w:val="lead-bold1"/>
-          <w:rFonts w:ascii="Calibri" w:eastAsia="Times New Roman" w:hAnsi="Calibri" w:cs="Calibri"/>
-          <w:sz w:val="18"/>
-          <w:szCs w:val="18"/>
-          <w:lang w:val="en"/>
-        </w:rPr>
-        <w:t>HotBill KE Telecommunications:</w:t>
-      </w:r>
-      <w:r>
-        <w:rPr>
-          <w:rFonts w:ascii="Calibri" w:eastAsia="Times New Roman" w:hAnsi="Calibri" w:cs="Calibri"/>
-          <w:color w:val="2A2A2A"/>
-          <w:sz w:val="18"/>
-          <w:szCs w:val="18"/>
-          <w:lang w:val="en"/>
-        </w:rPr>
-        <w:t xml:space="preserve"> Built automated telecommunications billing daemon integrat</w:t>
-      </w:r>
-      <w:r>
-        <w:rPr>
-          <w:rFonts w:ascii="Calibri" w:eastAsia="Times New Roman" w:hAnsi="Calibri" w:cs="Calibri"/>
-          <w:color w:val="2A2A2A"/>
-          <w:sz w:val="18"/>
-          <w:szCs w:val="18"/>
-          <w:lang w:val="en"/>
-        </w:rPr>
-        <w:t>ing MikroTik RouterOS socket API with M-Pesa Daraja STK push and a Next.js 14 NOC console for ISP/hotspot bandwidth automation in Docker Compose.</w:t>
-      </w:r>
-    </w:p>
-    <w:p>
-      <w:pPr>
-        <w:numPr>
-          <w:ilvl w:val="0"/>
-          <w:numId w:val="2"/>
-        </w:numPr>
-        <w:spacing w:before="100" w:beforeAutospacing="1" w:after="53"/>
-        <w:ind w:left="0"/>
-        <w:jc w:val="both"/>
-        <w:divId w:val="2015960565"/>
-        <w:rPr>
-          <w:rFonts w:ascii="Calibri" w:eastAsia="Times New Roman" w:hAnsi="Calibri" w:cs="Calibri"/>
-          <w:color w:val="2A2A2A"/>
-          <w:sz w:val="18"/>
-          <w:szCs w:val="18"/>
-          <w:lang w:val="en"/>
-        </w:rPr>
-      </w:pPr>
-      <w:r>
-        <w:rPr>
-          <w:rStyle w:val="lead-bold1"/>
-          <w:rFonts w:ascii="Calibri" w:eastAsia="Times New Roman" w:hAnsi="Calibri" w:cs="Calibri"/>
-          <w:sz w:val="18"/>
-          <w:szCs w:val="18"/>
-          <w:lang w:val="en"/>
-        </w:rPr>
-        <w:t>Padi Password Manager:</w:t>
-      </w:r>
-      <w:r>
-        <w:rPr>
-          <w:rFonts w:ascii="Calibri" w:eastAsia="Times New Roman" w:hAnsi="Calibri" w:cs="Calibri"/>
-          <w:color w:val="2A2A2A"/>
-          <w:sz w:val="18"/>
-          <w:szCs w:val="18"/>
-          <w:lang w:val="en"/>
-        </w:rPr>
-        <w:t xml:space="preserve"> Developed zero-knowledge cross-browser extension (Manifest V3) and Web Vault using clie</w:t>
-      </w:r>
-      <w:r>
-        <w:rPr>
-          <w:rFonts w:ascii="Calibri" w:eastAsia="Times New Roman" w:hAnsi="Calibri" w:cs="Calibri"/>
-          <w:color w:val="2A2A2A"/>
-          <w:sz w:val="18"/>
-          <w:szCs w:val="18"/>
-          <w:lang w:val="en"/>
-        </w:rPr>
-        <w:t>nt-side Web Crypto PBKDF2 (100,000 iterations) and AES-GCM-256 with Supabase synchronization.</w:t>
-      </w:r>
-    </w:p>
-    <w:p>
-      <w:pPr>
-        <w:numPr>
-          <w:ilvl w:val="0"/>
-          <w:numId w:val="2"/>
-        </w:numPr>
-        <w:spacing w:before="100" w:beforeAutospacing="1" w:after="53"/>
-        <w:ind w:left="0"/>
-        <w:jc w:val="both"/>
-        <w:divId w:val="2015960565"/>
-        <w:rPr>
-          <w:rFonts w:ascii="Calibri" w:eastAsia="Times New Roman" w:hAnsi="Calibri" w:cs="Calibri"/>
-          <w:color w:val="2A2A2A"/>
-          <w:sz w:val="18"/>
-          <w:szCs w:val="18"/>
-          <w:lang w:val="en"/>
-        </w:rPr>
-      </w:pPr>
-      <w:r>
-        <w:rPr>
-          <w:rStyle w:val="lead-bold1"/>
-          <w:rFonts w:ascii="Calibri" w:eastAsia="Times New Roman" w:hAnsi="Calibri" w:cs="Calibri"/>
-          <w:sz w:val="18"/>
-          <w:szCs w:val="18"/>
-          <w:lang w:val="en"/>
-        </w:rPr>
-        <w:lastRenderedPageBreak/>
-        <w:t>WIK-POS Desktop Suite &amp; Licensing Authority:</w:t>
-      </w:r>
-      <w:r>
-        <w:rPr>
-          <w:rFonts w:ascii="Calibri" w:eastAsia="Times New Roman" w:hAnsi="Calibri" w:cs="Calibri"/>
-          <w:color w:val="2A2A2A"/>
-          <w:sz w:val="18"/>
-          <w:szCs w:val="18"/>
-          <w:lang w:val="en"/>
-        </w:rPr>
-        <w:t xml:space="preserve"> Shipped offline-first Electron + SQLite retail suite featuring hardware-bound licensing (CPU+MAC fingerprinting), 30-</w:t>
-      </w:r>
-      <w:r>
-        <w:rPr>
-          <w:rFonts w:ascii="Calibri" w:eastAsia="Times New Roman" w:hAnsi="Calibri" w:cs="Calibri"/>
-          <w:color w:val="2A2A2A"/>
-          <w:sz w:val="18"/>
-          <w:szCs w:val="18"/>
-          <w:lang w:val="en"/>
-        </w:rPr>
-        <w:t>day offline grace periods, FEFO pharmacy expiry batching (v1.3.33), and hotel multi-terminal LAN F&amp;B ordering (v1.3.26).</w:t>
-      </w:r>
-    </w:p>
-    <w:p>
-      <w:pPr>
-        <w:numPr>
-          <w:ilvl w:val="0"/>
-          <w:numId w:val="2"/>
-        </w:numPr>
-        <w:spacing w:before="100" w:beforeAutospacing="1" w:after="53"/>
-        <w:ind w:left="0"/>
-        <w:jc w:val="both"/>
-        <w:divId w:val="2015960565"/>
-        <w:rPr>
-          <w:rFonts w:ascii="Calibri" w:eastAsia="Times New Roman" w:hAnsi="Calibri" w:cs="Calibri"/>
-          <w:color w:val="2A2A2A"/>
-          <w:sz w:val="18"/>
-          <w:szCs w:val="18"/>
-          <w:lang w:val="en"/>
-        </w:rPr>
-      </w:pPr>
-      <w:r>
-        <w:rPr>
-          <w:rStyle w:val="lead-bold1"/>
-          <w:rFonts w:ascii="Calibri" w:eastAsia="Times New Roman" w:hAnsi="Calibri" w:cs="Calibri"/>
-          <w:sz w:val="18"/>
-          <w:szCs w:val="18"/>
-          <w:lang w:val="en"/>
-        </w:rPr>
-        <w:t>DueSync Smart Task Management &amp; MCP:</w:t>
-      </w:r>
-      <w:r>
-        <w:rPr>
-          <w:rFonts w:ascii="Calibri" w:eastAsia="Times New Roman" w:hAnsi="Calibri" w:cs="Calibri"/>
-          <w:color w:val="2A2A2A"/>
-          <w:sz w:val="18"/>
-          <w:szCs w:val="18"/>
-          <w:lang w:val="en"/>
-        </w:rPr>
-        <w:t xml:space="preserve"> Shipped task-management SaaS on Next.js 15 featuring two-way Google Calendar OAuth2 sync, Upstash </w:t>
-      </w:r>
-      <w:r>
-        <w:rPr>
-          <w:rFonts w:ascii="Calibri" w:eastAsia="Times New Roman" w:hAnsi="Calibri" w:cs="Calibri"/>
-          <w:color w:val="2A2A2A"/>
-          <w:sz w:val="18"/>
-          <w:szCs w:val="18"/>
-          <w:lang w:val="en"/>
-        </w:rPr>
-        <w:t>Redis rate limiting, and a native 13-tool MCP server allowing AI agents to orchestrate schedule planning.</w:t>
-      </w:r>
-    </w:p>
-    <w:p>
-      <w:pPr>
-        <w:divId w:val="1505825321"/>
-        <w:rPr>
-          <w:rFonts w:ascii="Calibri" w:eastAsia="Times New Roman" w:hAnsi="Calibri" w:cs="Calibri"/>
-          <w:color w:val="222222"/>
-          <w:sz w:val="19"/>
-          <w:szCs w:val="19"/>
-          <w:lang w:val="en"/>
-        </w:rPr>
-      </w:pPr>
-      <w:r>
-        <w:rPr>
-          <w:rStyle w:val="job-title-company1"/>
-          <w:rFonts w:ascii="Calibri" w:eastAsia="Times New Roman" w:hAnsi="Calibri" w:cs="Calibri"/>
-          <w:lang w:val="en"/>
-        </w:rPr>
-        <w:t>Technical Lead (Industrial Attachment) | JHUB Africa</w:t>
-      </w:r>
-      <w:r>
-        <w:rPr>
-          <w:rFonts w:ascii="Calibri" w:eastAsia="Times New Roman" w:hAnsi="Calibri" w:cs="Calibri"/>
-          <w:color w:val="222222"/>
-          <w:sz w:val="19"/>
-          <w:szCs w:val="19"/>
-          <w:lang w:val="en"/>
-        </w:rPr>
-        <w:t xml:space="preserve"> </w:t>
-      </w:r>
-      <w:r>
-        <w:rPr>
-          <w:rStyle w:val="job-meta1"/>
-          <w:rFonts w:ascii="Calibri" w:eastAsia="Times New Roman" w:hAnsi="Calibri" w:cs="Calibri"/>
-          <w:lang w:val="en"/>
-        </w:rPr>
-        <w:t>Nairobi, Kenya  ·  Sep 2025 – Dec 2025</w:t>
-      </w:r>
-      <w:r>
-        <w:rPr>
-          <w:rFonts w:ascii="Calibri" w:eastAsia="Times New Roman" w:hAnsi="Calibri" w:cs="Calibri"/>
-          <w:color w:val="222222"/>
-          <w:sz w:val="19"/>
-          <w:szCs w:val="19"/>
-          <w:lang w:val="en"/>
-        </w:rPr>
-        <w:t xml:space="preserve"> </w:t>
-      </w:r>
-    </w:p>
-    <w:p>
-      <w:pPr>
-        <w:numPr>
-          <w:ilvl w:val="0"/>
-          <w:numId w:val="3"/>
-        </w:numPr>
-        <w:spacing w:before="100" w:beforeAutospacing="1" w:after="53"/>
-        <w:ind w:left="0"/>
-        <w:jc w:val="both"/>
-        <w:divId w:val="638732019"/>
-        <w:rPr>
-          <w:rFonts w:ascii="Calibri" w:eastAsia="Times New Roman" w:hAnsi="Calibri" w:cs="Calibri"/>
-          <w:color w:val="2A2A2A"/>
-          <w:sz w:val="18"/>
-          <w:szCs w:val="18"/>
-          <w:lang w:val="en"/>
-        </w:rPr>
-      </w:pPr>
-      <w:r>
-        <w:rPr>
-          <w:rStyle w:val="lead-bold1"/>
-          <w:rFonts w:ascii="Calibri" w:eastAsia="Times New Roman" w:hAnsi="Calibri" w:cs="Calibri"/>
-          <w:sz w:val="18"/>
-          <w:szCs w:val="18"/>
-          <w:lang w:val="en"/>
-        </w:rPr>
-        <w:t>JHUB Africa Innovation Tracker:</w:t>
-      </w:r>
-      <w:r>
-        <w:rPr>
-          <w:rFonts w:ascii="Calibri" w:eastAsia="Times New Roman" w:hAnsi="Calibri" w:cs="Calibri"/>
-          <w:color w:val="2A2A2A"/>
-          <w:sz w:val="18"/>
-          <w:szCs w:val="18"/>
-          <w:lang w:val="en"/>
-        </w:rPr>
-        <w:t xml:space="preserve"> </w:t>
-      </w:r>
-      <w:r>
-        <w:rPr>
-          <w:rFonts w:ascii="Calibri" w:eastAsia="Times New Roman" w:hAnsi="Calibri" w:cs="Calibri"/>
-          <w:color w:val="2A2A2A"/>
-          <w:sz w:val="18"/>
-          <w:szCs w:val="18"/>
-          <w:lang w:val="en"/>
-        </w:rPr>
-        <w:t>Directed engineering of the JKUAT innovation management platform (PHP 8.1, MySQL, Docker, JavaScript) across 4 user roles, 6 project lifecycle stages, and automated mentor assignment engines; delivered in production for active nationwide use.</w:t>
-      </w:r>
-    </w:p>
-    <w:p>
-      <w:pPr>
-        <w:numPr>
-          <w:ilvl w:val="0"/>
-          <w:numId w:val="3"/>
-        </w:numPr>
-        <w:spacing w:before="100" w:beforeAutospacing="1" w:after="53"/>
-        <w:ind w:left="0"/>
-        <w:jc w:val="both"/>
-        <w:divId w:val="638732019"/>
-        <w:rPr>
-          <w:rFonts w:ascii="Calibri" w:eastAsia="Times New Roman" w:hAnsi="Calibri" w:cs="Calibri"/>
-          <w:color w:val="2A2A2A"/>
-          <w:sz w:val="18"/>
-          <w:szCs w:val="18"/>
-          <w:lang w:val="en"/>
-        </w:rPr>
-      </w:pPr>
-      <w:r>
-        <w:rPr>
-          <w:rStyle w:val="lead-bold1"/>
-          <w:rFonts w:ascii="Calibri" w:eastAsia="Times New Roman" w:hAnsi="Calibri" w:cs="Calibri"/>
-          <w:sz w:val="18"/>
-          <w:szCs w:val="18"/>
-          <w:lang w:val="en"/>
-        </w:rPr>
-        <w:t>Quality &amp; Dev</w:t>
-      </w:r>
-      <w:r>
-        <w:rPr>
-          <w:rStyle w:val="lead-bold1"/>
-          <w:rFonts w:ascii="Calibri" w:eastAsia="Times New Roman" w:hAnsi="Calibri" w:cs="Calibri"/>
-          <w:sz w:val="18"/>
-          <w:szCs w:val="18"/>
-          <w:lang w:val="en"/>
-        </w:rPr>
-        <w:t>Ops Standards:</w:t>
-      </w:r>
-      <w:r>
-        <w:rPr>
-          <w:rFonts w:ascii="Calibri" w:eastAsia="Times New Roman" w:hAnsi="Calibri" w:cs="Calibri"/>
-          <w:color w:val="2A2A2A"/>
-          <w:sz w:val="18"/>
-          <w:szCs w:val="18"/>
-          <w:lang w:val="en"/>
-        </w:rPr>
-        <w:t xml:space="preserve"> Established PSR-12 coding standards, conducted code reviews, and containerized the platform with Docker Compose, ensuring high reliability for innovators and investors.</w:t>
-      </w:r>
-    </w:p>
-    <w:p>
-      <w:pPr>
-        <w:divId w:val="117989325"/>
-        <w:rPr>
-          <w:rFonts w:ascii="Calibri" w:eastAsia="Times New Roman" w:hAnsi="Calibri" w:cs="Calibri"/>
-          <w:color w:val="222222"/>
-          <w:sz w:val="19"/>
-          <w:szCs w:val="19"/>
-          <w:lang w:val="en"/>
-        </w:rPr>
-      </w:pPr>
-      <w:r>
-        <w:rPr>
-          <w:rStyle w:val="job-title-company1"/>
-          <w:rFonts w:ascii="Calibri" w:eastAsia="Times New Roman" w:hAnsi="Calibri" w:cs="Calibri"/>
-          <w:lang w:val="en"/>
-        </w:rPr>
-        <w:t>Freelance Software Engineer &amp; Systems Consultant | Independent Contracto</w:t>
-      </w:r>
-      <w:r>
-        <w:rPr>
-          <w:rStyle w:val="job-title-company1"/>
-          <w:rFonts w:ascii="Calibri" w:eastAsia="Times New Roman" w:hAnsi="Calibri" w:cs="Calibri"/>
-          <w:lang w:val="en"/>
-        </w:rPr>
-        <w:t>r</w:t>
-      </w:r>
-      <w:r>
-        <w:rPr>
-          <w:rFonts w:ascii="Calibri" w:eastAsia="Times New Roman" w:hAnsi="Calibri" w:cs="Calibri"/>
-          <w:color w:val="222222"/>
-          <w:sz w:val="19"/>
-          <w:szCs w:val="19"/>
-          <w:lang w:val="en"/>
-        </w:rPr>
-        <w:t xml:space="preserve"> </w:t>
-      </w:r>
-      <w:r>
-        <w:rPr>
-          <w:rStyle w:val="job-meta1"/>
-          <w:rFonts w:ascii="Calibri" w:eastAsia="Times New Roman" w:hAnsi="Calibri" w:cs="Calibri"/>
-          <w:lang w:val="en"/>
-        </w:rPr>
-        <w:t>Remote &amp; Nairobi  ·  2023 – Present</w:t>
-      </w:r>
-      <w:r>
-        <w:rPr>
-          <w:rFonts w:ascii="Calibri" w:eastAsia="Times New Roman" w:hAnsi="Calibri" w:cs="Calibri"/>
-          <w:color w:val="222222"/>
-          <w:sz w:val="19"/>
-          <w:szCs w:val="19"/>
-          <w:lang w:val="en"/>
-        </w:rPr>
-        <w:t xml:space="preserve"> </w:t>
-      </w:r>
-    </w:p>
-    <w:p>
-      <w:pPr>
-        <w:numPr>
-          <w:ilvl w:val="0"/>
-          <w:numId w:val="4"/>
-        </w:numPr>
-        <w:spacing w:before="100" w:beforeAutospacing="1" w:after="53"/>
-        <w:ind w:left="0"/>
-        <w:jc w:val="both"/>
-        <w:divId w:val="526214509"/>
-        <w:rPr>
-          <w:rFonts w:ascii="Calibri" w:eastAsia="Times New Roman" w:hAnsi="Calibri" w:cs="Calibri"/>
-          <w:color w:val="2A2A2A"/>
-          <w:sz w:val="18"/>
-          <w:szCs w:val="18"/>
-          <w:lang w:val="en"/>
-        </w:rPr>
-      </w:pPr>
-      <w:r>
-        <w:rPr>
-          <w:rStyle w:val="lead-bold1"/>
-          <w:rFonts w:ascii="Calibri" w:eastAsia="Times New Roman" w:hAnsi="Calibri" w:cs="Calibri"/>
-          <w:sz w:val="18"/>
-          <w:szCs w:val="18"/>
-          <w:lang w:val="en"/>
-        </w:rPr>
-        <w:t>MtaaKeys Property Marketplace:</w:t>
-      </w:r>
-      <w:r>
-        <w:rPr>
-          <w:rFonts w:ascii="Calibri" w:eastAsia="Times New Roman" w:hAnsi="Calibri" w:cs="Calibri"/>
-          <w:color w:val="2A2A2A"/>
-          <w:sz w:val="18"/>
-          <w:szCs w:val="18"/>
-          <w:lang w:val="en"/>
-        </w:rPr>
-        <w:t xml:space="preserve"> Shipped full-stack property marketplace monorepo (Next.js 16, Express 5, PostgreSQL, Prisma, Socket.IO) with dual Paystack subscription tiers (agents &amp; land agents), logarithmic listing </w:t>
-      </w:r>
-      <w:r>
-        <w:rPr>
-          <w:rFonts w:ascii="Calibri" w:eastAsia="Times New Roman" w:hAnsi="Calibri" w:cs="Calibri"/>
-          <w:color w:val="2A2A2A"/>
-          <w:sz w:val="18"/>
-          <w:szCs w:val="18"/>
-          <w:lang w:val="en"/>
-        </w:rPr>
-        <w:t>curation algorithms, and CI/CD security invariant tests.</w:t>
-      </w:r>
-    </w:p>
-    <w:p>
-      <w:pPr>
-        <w:numPr>
-          <w:ilvl w:val="0"/>
-          <w:numId w:val="4"/>
-        </w:numPr>
-        <w:spacing w:before="100" w:beforeAutospacing="1" w:after="53"/>
-        <w:ind w:left="0"/>
-        <w:jc w:val="both"/>
-        <w:divId w:val="526214509"/>
-        <w:rPr>
-          <w:rFonts w:ascii="Calibri" w:eastAsia="Times New Roman" w:hAnsi="Calibri" w:cs="Calibri"/>
-          <w:color w:val="2A2A2A"/>
-          <w:sz w:val="18"/>
-          <w:szCs w:val="18"/>
-          <w:lang w:val="en"/>
-        </w:rPr>
-      </w:pPr>
-      <w:r>
-        <w:rPr>
-          <w:rStyle w:val="lead-bold1"/>
-          <w:rFonts w:ascii="Calibri" w:eastAsia="Times New Roman" w:hAnsi="Calibri" w:cs="Calibri"/>
-          <w:sz w:val="18"/>
-          <w:szCs w:val="18"/>
-          <w:lang w:val="en"/>
-        </w:rPr>
-        <w:t>K-Track Commission SaaS:</w:t>
-      </w:r>
-      <w:r>
-        <w:rPr>
-          <w:rFonts w:ascii="Calibri" w:eastAsia="Times New Roman" w:hAnsi="Calibri" w:cs="Calibri"/>
-          <w:color w:val="2A2A2A"/>
-          <w:sz w:val="18"/>
-          <w:szCs w:val="18"/>
-          <w:lang w:val="en"/>
-        </w:rPr>
-        <w:t xml:space="preserve"> Built multi-tutor agency commission platform (React 19, Express 5, TiDB Serverless, Cloudflare R2, Socket.IO) with timing-safe HMAC guest checkout URLs and idempotent boot-ti</w:t>
-      </w:r>
-      <w:r>
-        <w:rPr>
-          <w:rFonts w:ascii="Calibri" w:eastAsia="Times New Roman" w:hAnsi="Calibri" w:cs="Calibri"/>
-          <w:color w:val="2A2A2A"/>
-          <w:sz w:val="18"/>
-          <w:szCs w:val="18"/>
-          <w:lang w:val="en"/>
-        </w:rPr>
-        <w:t>me database patching.</w:t>
-      </w:r>
-    </w:p>
-    <w:p>
-      <w:pPr>
-        <w:numPr>
-          <w:ilvl w:val="0"/>
-          <w:numId w:val="4"/>
-        </w:numPr>
-        <w:spacing w:before="100" w:beforeAutospacing="1" w:after="53"/>
-        <w:ind w:left="0"/>
-        <w:jc w:val="both"/>
-        <w:divId w:val="526214509"/>
-        <w:rPr>
-          <w:rFonts w:ascii="Calibri" w:eastAsia="Times New Roman" w:hAnsi="Calibri" w:cs="Calibri"/>
-          <w:color w:val="2A2A2A"/>
-          <w:sz w:val="18"/>
-          <w:szCs w:val="18"/>
-          <w:lang w:val="en"/>
-        </w:rPr>
-      </w:pPr>
-      <w:r>
-        <w:rPr>
-          <w:rStyle w:val="lead-bold1"/>
-          <w:rFonts w:ascii="Calibri" w:eastAsia="Times New Roman" w:hAnsi="Calibri" w:cs="Calibri"/>
-          <w:sz w:val="18"/>
-          <w:szCs w:val="18"/>
-          <w:lang w:val="en"/>
-        </w:rPr>
-        <w:t>Biashara Hub Headless Commerce:</w:t>
-      </w:r>
-      <w:r>
-        <w:rPr>
-          <w:rFonts w:ascii="Calibri" w:eastAsia="Times New Roman" w:hAnsi="Calibri" w:cs="Calibri"/>
-          <w:color w:val="2A2A2A"/>
-          <w:sz w:val="18"/>
-          <w:szCs w:val="18"/>
-          <w:lang w:val="en"/>
-        </w:rPr>
-        <w:t xml:space="preserve"> Engineered production headless e-commerce for Kenyan retail using Medusa.js v2 and Next.js App Router with native M-Pesa payment rails.</w:t>
-      </w:r>
-    </w:p>
-    <w:p>
-      <w:pPr>
-        <w:divId w:val="1875658016"/>
+      </w:pPr>
+      <w:r>
         <w:rPr>
           <w:rFonts w:ascii="Calibri" w:eastAsia="Times New Roman" w:hAnsi="Calibri" w:cs="Calibri"/>
           <w:b/>
@@ -1455,25 +1248,12 @@
           <w:szCs w:val="22"/>
           <w:lang w:val="en"/>
         </w:rPr>
-      </w:pPr>
-      <w:r>
-        <w:rPr>
-          <w:rFonts w:ascii="Calibri" w:eastAsia="Times New Roman" w:hAnsi="Calibri" w:cs="Calibri"/>
-          <w:b/>
-          <w:bCs/>
-          <w:caps/>
-          <w:color w:val="111111"/>
-          <w:spacing w:val="10"/>
-          <w:sz w:val="22"/>
-          <w:szCs w:val="22"/>
-          <w:lang w:val="en"/>
-        </w:rPr>
         <w:t>Education &amp; Credentials</w:t>
       </w:r>
     </w:p>
     <w:p>
       <w:pPr>
-        <w:divId w:val="1850944226"/>
+        <w:divId w:val="1177574749"/>
         <w:rPr>
           <w:rFonts w:ascii="Calibri" w:eastAsia="Times New Roman" w:hAnsi="Calibri" w:cs="Calibri"/>
           <w:color w:val="222222"/>
@@ -1488,15 +1268,7 @@
           <w:rFonts w:ascii="Calibri" w:eastAsia="Times New Roman" w:hAnsi="Calibri" w:cs="Calibri"/>
           <w:lang w:val="en"/>
         </w:rPr>
-        <w:t>Bachelor of Science in Software Developmen</w:t>
-      </w:r>
-      <w:r>
-        <w:rPr>
-          <w:rStyle w:val="job-title-company1"/>
-          <w:rFonts w:ascii="Calibri" w:eastAsia="Times New Roman" w:hAnsi="Calibri" w:cs="Calibri"/>
-          <w:lang w:val="en"/>
-        </w:rPr>
-        <w:t>t | KCA University</w:t>
+        <w:t>Bachelor of Science in Software Development | KCA University</w:t>
       </w:r>
       <w:r>
         <w:rPr>
@@ -1536,7 +1308,7 @@
         <w:spacing w:before="100" w:beforeAutospacing="1" w:after="53"/>
         <w:ind w:left="0"/>
         <w:jc w:val="both"/>
-        <w:divId w:val="798382043"/>
+        <w:divId w:val="2082672452"/>
         <w:rPr>
           <w:rFonts w:ascii="Calibri" w:eastAsia="Times New Roman" w:hAnsi="Calibri" w:cs="Calibri"/>
           <w:color w:val="2A2A2A"/>
@@ -1563,17 +1335,7 @@
           <w:szCs w:val="18"/>
           <w:lang w:val="en"/>
         </w:rPr>
-        <w:t xml:space="preserve"> Advanced Web Development, Data Structures &amp; Algorithms, Database Management, Network Security, Software Engineering, System Integration, Mobile Application Development</w:t>
-      </w:r>
-      <w:r>
-        <w:rPr>
-          <w:rFonts w:ascii="Calibri" w:eastAsia="Times New Roman" w:hAnsi="Calibri" w:cs="Calibri"/>
-          <w:color w:val="2A2A2A"/>
-          <w:sz w:val="18"/>
-          <w:szCs w:val="18"/>
-          <w:lang w:val="en"/>
-        </w:rPr>
-        <w:t>, OOP, Agile Project Management.</w:t>
+        <w:t xml:space="preserve"> Advanced Web Development, Data Structures &amp; Algorithms, Database Management, Network Security, Software Engineering, System Integration, Mobile Application Development, OOP, Agile Project Management.</w:t>
       </w:r>
     </w:p>
     <w:p>
@@ -1585,7 +1347,7 @@
         <w:spacing w:before="100" w:beforeAutospacing="1" w:after="53"/>
         <w:ind w:left="0"/>
         <w:jc w:val="both"/>
-        <w:divId w:val="798382043"/>
+        <w:divId w:val="2082672452"/>
         <w:rPr>
           <w:rFonts w:ascii="Calibri" w:eastAsia="Times New Roman" w:hAnsi="Calibri" w:cs="Calibri"/>
           <w:color w:val="2A2A2A"/>
@@ -1628,9 +1390,9 @@
 <file path=word/numbering.xml><?xml version="1.0" encoding="utf-8"?>
 <w:numbering xmlns:wpc="http://schemas.microsoft.com/office/word/2010/wordprocessingCanvas" xmlns:cx="http://schemas.microsoft.com/office/drawing/2014/chartex" xmlns:cx1="http://schemas.microsoft.com/office/drawing/2015/9/8/chartex" xmlns:cx2="http://schemas.microsoft.com/office/drawing/2015/10/21/chartex" xmlns:cx3="http://schemas.microsoft.com/office/drawing/2016/5/9/chartex" xmlns:cx4="http://schemas.microsoft.com/office/drawing/2016/5/10/chartex" xmlns:cx5="http://schemas.microsoft.com/office/drawing/2016/5/11/chartex" xmlns:cx6="http://schemas.microsoft.com/office/drawing/2016/5/12/chartex" xmlns:cx7="http://schemas.microsoft.com/office/drawing/2016/5/13/chartex" xmlns:cx8="http://schemas.microsoft.com/office/drawing/2016/5/14/chartex" xmlns:mc="http://schemas.openxmlformats.org/markup-compatibility/2006" xmlns:aink="http://schemas.microsoft.com/office/drawing/2016/ink" xmlns:am3d="http://schemas.microsoft.com/office/drawing/2017/model3d" xmlns:o="urn:schemas-microsoft-com:office:office" xmlns:r="http://schemas.openxmlformats.org/officeDocument/2006/relationships" xmlns:m="http://schemas.openxmlformats.org/officeDocument/2006/math" xmlns:v="urn:schemas-microsoft-com:vml" xmlns:wp14="http://schemas.microsoft.com/office/word/2010/wordprocessingDrawing" xmlns:wp="http://schemas.openxmlformats.org/drawingml/2006/wordprocessingDrawing" xmlns:w10="urn:schemas-microsoft-com:office:word" xmlns:w="http://schemas.openxmlformats.org/wordprocessingml/2006/main" xmlns:w14="http://schemas.microsoft.com/office/word/2010/wordml" xmlns:w15="http://schemas.microsoft.com/office/word/2012/wordml" xmlns:w16cid="http://schemas.microsoft.com/office/word/2016/wordml/cid" xmlns:w16se="http://schemas.microsoft.com/office/word/2015/wordml/symex" xmlns:wpg="http://schemas.microsoft.com/office/word/2010/wordprocessingGroup" xmlns:wpi="http://schemas.microsoft.com/office/word/2010/wordprocessingInk" xmlns:wne="http://schemas.microsoft.com/office/word/2006/wordml" xmlns:wps="http://schemas.microsoft.com/office/word/2010/wordprocessingShape" mc:Ignorable="w14 w15 w16se w16cid wp14">
   <w:abstractNum w:abstractNumId="0" w15:restartNumberingAfterBreak="0">
-    <w:nsid w:val="05315DBE"/>
+    <w:nsid w:val="188D0842"/>
     <w:multiLevelType w:val="multilevel"/>
-    <w:tmpl w:val="FCFCD90E"/>
+    <w:tmpl w:val="1E96CEEA"/>
     <w:lvl w:ilvl="0">
       <w:start w:val="1"/>
       <w:numFmt w:val="bullet"/>
@@ -1777,9 +1539,9 @@
     </w:lvl>
   </w:abstractNum>
   <w:abstractNum w:abstractNumId="1" w15:restartNumberingAfterBreak="0">
-    <w:nsid w:val="2AE07FC7"/>
+    <w:nsid w:val="46B66F8C"/>
     <w:multiLevelType w:val="multilevel"/>
-    <w:tmpl w:val="8C005B2E"/>
+    <w:tmpl w:val="15F0EF4C"/>
     <w:lvl w:ilvl="0">
       <w:start w:val="1"/>
       <w:numFmt w:val="bullet"/>
@@ -1926,9 +1688,9 @@
     </w:lvl>
   </w:abstractNum>
   <w:abstractNum w:abstractNumId="2" w15:restartNumberingAfterBreak="0">
-    <w:nsid w:val="32582587"/>
+    <w:nsid w:val="4AA31F31"/>
     <w:multiLevelType w:val="multilevel"/>
-    <w:tmpl w:val="DEB8E344"/>
+    <w:tmpl w:val="AA006766"/>
     <w:lvl w:ilvl="0">
       <w:start w:val="1"/>
       <w:numFmt w:val="bullet"/>
@@ -2075,9 +1837,9 @@
     </w:lvl>
   </w:abstractNum>
   <w:abstractNum w:abstractNumId="3" w15:restartNumberingAfterBreak="0">
-    <w:nsid w:val="56E31351"/>
+    <w:nsid w:val="4E5137F4"/>
     <w:multiLevelType w:val="multilevel"/>
-    <w:tmpl w:val="9B7A2704"/>
+    <w:tmpl w:val="AB34940C"/>
     <w:lvl w:ilvl="0">
       <w:start w:val="1"/>
       <w:numFmt w:val="bullet"/>
@@ -2224,9 +1986,9 @@
     </w:lvl>
   </w:abstractNum>
   <w:abstractNum w:abstractNumId="4" w15:restartNumberingAfterBreak="0">
-    <w:nsid w:val="6A214BB9"/>
+    <w:nsid w:val="559C1B87"/>
     <w:multiLevelType w:val="multilevel"/>
-    <w:tmpl w:val="65143C26"/>
+    <w:tmpl w:val="836E8DE8"/>
     <w:lvl w:ilvl="0">
       <w:start w:val="1"/>
       <w:numFmt w:val="bullet"/>
@@ -2373,19 +2135,19 @@
     </w:lvl>
   </w:abstractNum>
   <w:num w:numId="1">
+    <w:abstractNumId w:val="1"/>
+  </w:num>
+  <w:num w:numId="2">
+    <w:abstractNumId w:val="2"/>
+  </w:num>
+  <w:num w:numId="3">
+    <w:abstractNumId w:val="4"/>
+  </w:num>
+  <w:num w:numId="4">
     <w:abstractNumId w:val="0"/>
   </w:num>
-  <w:num w:numId="2">
-    <w:abstractNumId w:val="4"/>
-  </w:num>
-  <w:num w:numId="3">
-    <w:abstractNumId w:val="1"/>
-  </w:num>
-  <w:num w:numId="4">
+  <w:num w:numId="5">
     <w:abstractNumId w:val="3"/>
-  </w:num>
-  <w:num w:numId="5">
-    <w:abstractNumId w:val="2"/>
   </w:num>
 </w:numbering>
 </file>
@@ -2861,8 +2623,8 @@
       <w:spacing w:before="100" w:beforeAutospacing="1" w:after="100" w:afterAutospacing="1"/>
     </w:pPr>
   </w:style>
-  <w:style w:type="paragraph" w:customStyle="1" w:styleId="header">
-    <w:name w:val="header"/>
+  <w:style w:type="paragraph" w:customStyle="1" w:styleId="Header1">
+    <w:name w:val="Header1"/>
     <w:basedOn w:val="Normal"/>
     <w:pPr>
       <w:spacing w:before="100" w:beforeAutospacing="1" w:after="120"/>

</xml_diff>

<commit_message>
feat(freelance): attribute BikeLab Parts Manager to Freelance across portfolio and resume
</commit_message>
<xml_diff>
--- a/Paul-Karonji-Waithaka-Resume.docx
+++ b/Paul-Karonji-Waithaka-Resume.docx
@@ -7,7 +7,7 @@
         <w:pStyle w:val="Heading1"/>
         <w:spacing w:before="0" w:beforeAutospacing="0" w:after="30" w:afterAutospacing="0"/>
         <w:jc w:val="center"/>
-        <w:divId w:val="770786535"/>
+        <w:divId w:val="1626503168"/>
         <w:rPr>
           <w:rFonts w:ascii="Calibri" w:eastAsia="Times New Roman" w:hAnsi="Calibri" w:cs="Calibri"/>
           <w:color w:val="111111"/>
@@ -35,7 +35,7 @@
       <w:pPr>
         <w:pStyle w:val="role-title"/>
         <w:jc w:val="center"/>
-        <w:divId w:val="770786535"/>
+        <w:divId w:val="1626503168"/>
         <w:rPr>
           <w:rFonts w:ascii="Calibri" w:hAnsi="Calibri" w:cs="Calibri"/>
           <w:lang w:val="en"/>
@@ -53,7 +53,7 @@
       <w:pPr>
         <w:pStyle w:val="contact-info"/>
         <w:jc w:val="center"/>
-        <w:divId w:val="770786535"/>
+        <w:divId w:val="1626503168"/>
         <w:rPr>
           <w:rFonts w:ascii="Calibri" w:hAnsi="Calibri" w:cs="Calibri"/>
           <w:lang w:val="en"/>
@@ -77,7 +77,7 @@
     </w:p>
     <w:p>
       <w:pPr>
-        <w:divId w:val="1541473215"/>
+        <w:divId w:val="1312711218"/>
         <w:rPr>
           <w:rFonts w:ascii="Calibri" w:eastAsia="Times New Roman" w:hAnsi="Calibri" w:cs="Calibri"/>
           <w:b/>
@@ -108,7 +108,7 @@
     <w:p>
       <w:pPr>
         <w:pStyle w:val="summary-text"/>
-        <w:divId w:val="1327366724"/>
+        <w:divId w:val="1002198417"/>
         <w:rPr>
           <w:rFonts w:ascii="Calibri" w:hAnsi="Calibri" w:cs="Calibri"/>
           <w:lang w:val="en"/>
@@ -214,7 +214,7 @@
     </w:p>
     <w:p>
       <w:pPr>
-        <w:divId w:val="2134784583"/>
+        <w:divId w:val="877933792"/>
         <w:rPr>
           <w:rFonts w:ascii="Calibri" w:eastAsia="Times New Roman" w:hAnsi="Calibri" w:cs="Calibri"/>
           <w:b/>
@@ -250,7 +250,7 @@
         </w:numPr>
         <w:spacing w:before="100" w:beforeAutospacing="1" w:after="38"/>
         <w:ind w:left="0"/>
-        <w:divId w:val="1663193460"/>
+        <w:divId w:val="1930918928"/>
         <w:rPr>
           <w:rFonts w:ascii="Calibri" w:eastAsia="Times New Roman" w:hAnsi="Calibri" w:cs="Calibri"/>
           <w:color w:val="222222"/>
@@ -298,7 +298,7 @@
         </w:numPr>
         <w:spacing w:before="100" w:beforeAutospacing="1" w:after="38"/>
         <w:ind w:left="0"/>
-        <w:divId w:val="1663193460"/>
+        <w:divId w:val="1930918928"/>
         <w:rPr>
           <w:rFonts w:ascii="Calibri" w:eastAsia="Times New Roman" w:hAnsi="Calibri" w:cs="Calibri"/>
           <w:color w:val="222222"/>
@@ -346,7 +346,7 @@
         </w:numPr>
         <w:spacing w:before="100" w:beforeAutospacing="1" w:after="38"/>
         <w:ind w:left="0"/>
-        <w:divId w:val="1663193460"/>
+        <w:divId w:val="1930918928"/>
         <w:rPr>
           <w:rFonts w:ascii="Calibri" w:eastAsia="Times New Roman" w:hAnsi="Calibri" w:cs="Calibri"/>
           <w:color w:val="222222"/>
@@ -394,7 +394,7 @@
         </w:numPr>
         <w:spacing w:before="100" w:beforeAutospacing="1" w:after="38"/>
         <w:ind w:left="0"/>
-        <w:divId w:val="1663193460"/>
+        <w:divId w:val="1930918928"/>
         <w:rPr>
           <w:rFonts w:ascii="Calibri" w:eastAsia="Times New Roman" w:hAnsi="Calibri" w:cs="Calibri"/>
           <w:color w:val="222222"/>
@@ -442,7 +442,7 @@
         </w:numPr>
         <w:spacing w:before="100" w:beforeAutospacing="1" w:after="38"/>
         <w:ind w:left="0"/>
-        <w:divId w:val="1663193460"/>
+        <w:divId w:val="1930918928"/>
         <w:rPr>
           <w:rFonts w:ascii="Calibri" w:eastAsia="Times New Roman" w:hAnsi="Calibri" w:cs="Calibri"/>
           <w:color w:val="222222"/>
@@ -490,7 +490,7 @@
         </w:numPr>
         <w:spacing w:before="100" w:beforeAutospacing="1" w:after="38"/>
         <w:ind w:left="0"/>
-        <w:divId w:val="1663193460"/>
+        <w:divId w:val="1930918928"/>
         <w:rPr>
           <w:rFonts w:ascii="Calibri" w:eastAsia="Times New Roman" w:hAnsi="Calibri" w:cs="Calibri"/>
           <w:color w:val="222222"/>
@@ -538,7 +538,7 @@
         </w:numPr>
         <w:spacing w:before="100" w:beforeAutospacing="1" w:after="38"/>
         <w:ind w:left="0"/>
-        <w:divId w:val="1663193460"/>
+        <w:divId w:val="1930918928"/>
         <w:rPr>
           <w:rFonts w:ascii="Calibri" w:eastAsia="Times New Roman" w:hAnsi="Calibri" w:cs="Calibri"/>
           <w:color w:val="222222"/>
@@ -580,7 +580,7 @@
     </w:p>
     <w:p>
       <w:pPr>
-        <w:divId w:val="1875919673"/>
+        <w:divId w:val="270432707"/>
         <w:rPr>
           <w:rFonts w:ascii="Calibri" w:eastAsia="Times New Roman" w:hAnsi="Calibri" w:cs="Calibri"/>
           <w:b/>
@@ -610,7 +610,7 @@
     </w:p>
     <w:p>
       <w:pPr>
-        <w:divId w:val="47650863"/>
+        <w:divId w:val="1800492656"/>
         <w:rPr>
           <w:rFonts w:ascii="Calibri" w:eastAsia="Times New Roman" w:hAnsi="Calibri" w:cs="Calibri"/>
           <w:color w:val="222222"/>
@@ -665,7 +665,7 @@
         <w:spacing w:before="100" w:beforeAutospacing="1" w:after="53"/>
         <w:ind w:left="0"/>
         <w:jc w:val="both"/>
-        <w:divId w:val="716053816"/>
+        <w:divId w:val="1575506196"/>
         <w:rPr>
           <w:rFonts w:ascii="Calibri" w:eastAsia="Times New Roman" w:hAnsi="Calibri" w:cs="Calibri"/>
           <w:color w:val="2A2A2A"/>
@@ -704,7 +704,7 @@
         <w:spacing w:before="100" w:beforeAutospacing="1" w:after="53"/>
         <w:ind w:left="0"/>
         <w:jc w:val="both"/>
-        <w:divId w:val="716053816"/>
+        <w:divId w:val="1575506196"/>
         <w:rPr>
           <w:rFonts w:ascii="Calibri" w:eastAsia="Times New Roman" w:hAnsi="Calibri" w:cs="Calibri"/>
           <w:color w:val="2A2A2A"/>
@@ -743,7 +743,7 @@
         <w:spacing w:before="100" w:beforeAutospacing="1" w:after="53"/>
         <w:ind w:left="0"/>
         <w:jc w:val="both"/>
-        <w:divId w:val="716053816"/>
+        <w:divId w:val="1575506196"/>
         <w:rPr>
           <w:rFonts w:ascii="Calibri" w:eastAsia="Times New Roman" w:hAnsi="Calibri" w:cs="Calibri"/>
           <w:color w:val="2A2A2A"/>
@@ -782,7 +782,7 @@
         <w:spacing w:before="100" w:beforeAutospacing="1" w:after="53"/>
         <w:ind w:left="0"/>
         <w:jc w:val="both"/>
-        <w:divId w:val="716053816"/>
+        <w:divId w:val="1575506196"/>
         <w:rPr>
           <w:rFonts w:ascii="Calibri" w:eastAsia="Times New Roman" w:hAnsi="Calibri" w:cs="Calibri"/>
           <w:color w:val="2A2A2A"/>
@@ -821,7 +821,7 @@
         <w:spacing w:before="100" w:beforeAutospacing="1" w:after="53"/>
         <w:ind w:left="0"/>
         <w:jc w:val="both"/>
-        <w:divId w:val="716053816"/>
+        <w:divId w:val="1575506196"/>
         <w:rPr>
           <w:rFonts w:ascii="Calibri" w:eastAsia="Times New Roman" w:hAnsi="Calibri" w:cs="Calibri"/>
           <w:color w:val="2A2A2A"/>
@@ -860,7 +860,7 @@
         <w:spacing w:before="100" w:beforeAutospacing="1" w:after="53"/>
         <w:ind w:left="0"/>
         <w:jc w:val="both"/>
-        <w:divId w:val="716053816"/>
+        <w:divId w:val="1575506196"/>
         <w:rPr>
           <w:rFonts w:ascii="Calibri" w:eastAsia="Times New Roman" w:hAnsi="Calibri" w:cs="Calibri"/>
           <w:color w:val="2A2A2A"/>
@@ -900,7 +900,7 @@
         <w:spacing w:before="100" w:beforeAutospacing="1" w:after="53"/>
         <w:ind w:left="0"/>
         <w:jc w:val="both"/>
-        <w:divId w:val="716053816"/>
+        <w:divId w:val="1575506196"/>
         <w:rPr>
           <w:rFonts w:ascii="Calibri" w:eastAsia="Times New Roman" w:hAnsi="Calibri" w:cs="Calibri"/>
           <w:color w:val="2A2A2A"/>
@@ -932,7 +932,7 @@
     </w:p>
     <w:p>
       <w:pPr>
-        <w:divId w:val="2035686391"/>
+        <w:divId w:val="330570503"/>
         <w:rPr>
           <w:rFonts w:ascii="Calibri" w:eastAsia="Times New Roman" w:hAnsi="Calibri" w:cs="Calibri"/>
           <w:color w:val="222222"/>
@@ -987,7 +987,7 @@
         <w:spacing w:before="100" w:beforeAutospacing="1" w:after="53"/>
         <w:ind w:left="0"/>
         <w:jc w:val="both"/>
-        <w:divId w:val="1040058729"/>
+        <w:divId w:val="595483393"/>
         <w:rPr>
           <w:rFonts w:ascii="Calibri" w:eastAsia="Times New Roman" w:hAnsi="Calibri" w:cs="Calibri"/>
           <w:color w:val="2A2A2A"/>
@@ -1026,7 +1026,7 @@
         <w:spacing w:before="100" w:beforeAutospacing="1" w:after="53"/>
         <w:ind w:left="0"/>
         <w:jc w:val="both"/>
-        <w:divId w:val="1040058729"/>
+        <w:divId w:val="595483393"/>
         <w:rPr>
           <w:rFonts w:ascii="Calibri" w:eastAsia="Times New Roman" w:hAnsi="Calibri" w:cs="Calibri"/>
           <w:color w:val="2A2A2A"/>
@@ -1058,7 +1058,7 @@
     </w:p>
     <w:p>
       <w:pPr>
-        <w:divId w:val="183446064"/>
+        <w:divId w:val="1194265301"/>
         <w:rPr>
           <w:rFonts w:ascii="Calibri" w:eastAsia="Times New Roman" w:hAnsi="Calibri" w:cs="Calibri"/>
           <w:color w:val="222222"/>
@@ -1113,7 +1113,7 @@
         <w:spacing w:before="100" w:beforeAutospacing="1" w:after="53"/>
         <w:ind w:left="0"/>
         <w:jc w:val="both"/>
-        <w:divId w:val="910967553"/>
+        <w:divId w:val="379208666"/>
         <w:rPr>
           <w:rFonts w:ascii="Calibri" w:eastAsia="Times New Roman" w:hAnsi="Calibri" w:cs="Calibri"/>
           <w:color w:val="2A2A2A"/>
@@ -1152,7 +1152,7 @@
         <w:spacing w:before="100" w:beforeAutospacing="1" w:after="53"/>
         <w:ind w:left="0"/>
         <w:jc w:val="both"/>
-        <w:divId w:val="910967553"/>
+        <w:divId w:val="379208666"/>
         <w:rPr>
           <w:rFonts w:ascii="Calibri" w:eastAsia="Times New Roman" w:hAnsi="Calibri" w:cs="Calibri"/>
           <w:color w:val="2A2A2A"/>
@@ -1191,7 +1191,7 @@
         <w:spacing w:before="100" w:beforeAutospacing="1" w:after="53"/>
         <w:ind w:left="0"/>
         <w:jc w:val="both"/>
-        <w:divId w:val="910967553"/>
+        <w:divId w:val="379208666"/>
         <w:rPr>
           <w:rFonts w:ascii="Calibri" w:eastAsia="Times New Roman" w:hAnsi="Calibri" w:cs="Calibri"/>
           <w:color w:val="2A2A2A"/>
@@ -1208,6 +1208,45 @@
           <w:szCs w:val="18"/>
           <w:lang w:val="en"/>
         </w:rPr>
+        <w:t>BikeLab Parts Manager:</w:t>
+      </w:r>
+      <w:r>
+        <w:rPr>
+          <w:rFonts w:ascii="Calibri" w:eastAsia="Times New Roman" w:hAnsi="Calibri" w:cs="Calibri"/>
+          <w:color w:val="2A2A2A"/>
+          <w:sz w:val="18"/>
+          <w:szCs w:val="18"/>
+          <w:lang w:val="en"/>
+        </w:rPr>
+        <w:t xml:space="preserve"> Built desktop parts catalog and workshop inventory manager with Electron, Vite, React, and local SQLite, providing high-performance hardware acceleration for warehouse cataloging.</w:t>
+      </w:r>
+    </w:p>
+    <w:p>
+      <w:pPr>
+        <w:numPr>
+          <w:ilvl w:val="0"/>
+          <w:numId w:val="4"/>
+        </w:numPr>
+        <w:spacing w:before="100" w:beforeAutospacing="1" w:after="53"/>
+        <w:ind w:left="0"/>
+        <w:jc w:val="both"/>
+        <w:divId w:val="379208666"/>
+        <w:rPr>
+          <w:rFonts w:ascii="Calibri" w:eastAsia="Times New Roman" w:hAnsi="Calibri" w:cs="Calibri"/>
+          <w:color w:val="2A2A2A"/>
+          <w:sz w:val="18"/>
+          <w:szCs w:val="18"/>
+          <w:lang w:val="en"/>
+        </w:rPr>
+      </w:pPr>
+      <w:r>
+        <w:rPr>
+          <w:rStyle w:val="lead-bold1"/>
+          <w:rFonts w:ascii="Calibri" w:eastAsia="Times New Roman" w:hAnsi="Calibri" w:cs="Calibri"/>
+          <w:sz w:val="18"/>
+          <w:szCs w:val="18"/>
+          <w:lang w:val="en"/>
+        </w:rPr>
         <w:t>Biashara Hub Headless Commerce:</w:t>
       </w:r>
       <w:r>
@@ -1223,7 +1262,7 @@
     </w:p>
     <w:p>
       <w:pPr>
-        <w:divId w:val="946471981"/>
+        <w:divId w:val="1092776054"/>
         <w:rPr>
           <w:rFonts w:ascii="Calibri" w:eastAsia="Times New Roman" w:hAnsi="Calibri" w:cs="Calibri"/>
           <w:b/>
@@ -1253,7 +1292,7 @@
     </w:p>
     <w:p>
       <w:pPr>
-        <w:divId w:val="1177574749"/>
+        <w:divId w:val="233585203"/>
         <w:rPr>
           <w:rFonts w:ascii="Calibri" w:eastAsia="Times New Roman" w:hAnsi="Calibri" w:cs="Calibri"/>
           <w:color w:val="222222"/>
@@ -1308,7 +1347,7 @@
         <w:spacing w:before="100" w:beforeAutospacing="1" w:after="53"/>
         <w:ind w:left="0"/>
         <w:jc w:val="both"/>
-        <w:divId w:val="2082672452"/>
+        <w:divId w:val="1372070981"/>
         <w:rPr>
           <w:rFonts w:ascii="Calibri" w:eastAsia="Times New Roman" w:hAnsi="Calibri" w:cs="Calibri"/>
           <w:color w:val="2A2A2A"/>
@@ -1347,7 +1386,7 @@
         <w:spacing w:before="100" w:beforeAutospacing="1" w:after="53"/>
         <w:ind w:left="0"/>
         <w:jc w:val="both"/>
-        <w:divId w:val="2082672452"/>
+        <w:divId w:val="1372070981"/>
         <w:rPr>
           <w:rFonts w:ascii="Calibri" w:eastAsia="Times New Roman" w:hAnsi="Calibri" w:cs="Calibri"/>
           <w:color w:val="2A2A2A"/>
@@ -1390,9 +1429,9 @@
 <file path=word/numbering.xml><?xml version="1.0" encoding="utf-8"?>
 <w:numbering xmlns:wpc="http://schemas.microsoft.com/office/word/2010/wordprocessingCanvas" xmlns:cx="http://schemas.microsoft.com/office/drawing/2014/chartex" xmlns:cx1="http://schemas.microsoft.com/office/drawing/2015/9/8/chartex" xmlns:cx2="http://schemas.microsoft.com/office/drawing/2015/10/21/chartex" xmlns:cx3="http://schemas.microsoft.com/office/drawing/2016/5/9/chartex" xmlns:cx4="http://schemas.microsoft.com/office/drawing/2016/5/10/chartex" xmlns:cx5="http://schemas.microsoft.com/office/drawing/2016/5/11/chartex" xmlns:cx6="http://schemas.microsoft.com/office/drawing/2016/5/12/chartex" xmlns:cx7="http://schemas.microsoft.com/office/drawing/2016/5/13/chartex" xmlns:cx8="http://schemas.microsoft.com/office/drawing/2016/5/14/chartex" xmlns:mc="http://schemas.openxmlformats.org/markup-compatibility/2006" xmlns:aink="http://schemas.microsoft.com/office/drawing/2016/ink" xmlns:am3d="http://schemas.microsoft.com/office/drawing/2017/model3d" xmlns:o="urn:schemas-microsoft-com:office:office" xmlns:r="http://schemas.openxmlformats.org/officeDocument/2006/relationships" xmlns:m="http://schemas.openxmlformats.org/officeDocument/2006/math" xmlns:v="urn:schemas-microsoft-com:vml" xmlns:wp14="http://schemas.microsoft.com/office/word/2010/wordprocessingDrawing" xmlns:wp="http://schemas.openxmlformats.org/drawingml/2006/wordprocessingDrawing" xmlns:w10="urn:schemas-microsoft-com:office:word" xmlns:w="http://schemas.openxmlformats.org/wordprocessingml/2006/main" xmlns:w14="http://schemas.microsoft.com/office/word/2010/wordml" xmlns:w15="http://schemas.microsoft.com/office/word/2012/wordml" xmlns:w16cid="http://schemas.microsoft.com/office/word/2016/wordml/cid" xmlns:w16se="http://schemas.microsoft.com/office/word/2015/wordml/symex" xmlns:wpg="http://schemas.microsoft.com/office/word/2010/wordprocessingGroup" xmlns:wpi="http://schemas.microsoft.com/office/word/2010/wordprocessingInk" xmlns:wne="http://schemas.microsoft.com/office/word/2006/wordml" xmlns:wps="http://schemas.microsoft.com/office/word/2010/wordprocessingShape" mc:Ignorable="w14 w15 w16se w16cid wp14">
   <w:abstractNum w:abstractNumId="0" w15:restartNumberingAfterBreak="0">
-    <w:nsid w:val="188D0842"/>
+    <w:nsid w:val="0A4D6EC1"/>
     <w:multiLevelType w:val="multilevel"/>
-    <w:tmpl w:val="1E96CEEA"/>
+    <w:tmpl w:val="854075C0"/>
     <w:lvl w:ilvl="0">
       <w:start w:val="1"/>
       <w:numFmt w:val="bullet"/>
@@ -1539,9 +1578,9 @@
     </w:lvl>
   </w:abstractNum>
   <w:abstractNum w:abstractNumId="1" w15:restartNumberingAfterBreak="0">
-    <w:nsid w:val="46B66F8C"/>
+    <w:nsid w:val="149B3A23"/>
     <w:multiLevelType w:val="multilevel"/>
-    <w:tmpl w:val="15F0EF4C"/>
+    <w:tmpl w:val="16029470"/>
     <w:lvl w:ilvl="0">
       <w:start w:val="1"/>
       <w:numFmt w:val="bullet"/>
@@ -1688,9 +1727,9 @@
     </w:lvl>
   </w:abstractNum>
   <w:abstractNum w:abstractNumId="2" w15:restartNumberingAfterBreak="0">
-    <w:nsid w:val="4AA31F31"/>
+    <w:nsid w:val="1752578C"/>
     <w:multiLevelType w:val="multilevel"/>
-    <w:tmpl w:val="AA006766"/>
+    <w:tmpl w:val="C3AE9124"/>
     <w:lvl w:ilvl="0">
       <w:start w:val="1"/>
       <w:numFmt w:val="bullet"/>
@@ -1837,9 +1876,9 @@
     </w:lvl>
   </w:abstractNum>
   <w:abstractNum w:abstractNumId="3" w15:restartNumberingAfterBreak="0">
-    <w:nsid w:val="4E5137F4"/>
+    <w:nsid w:val="496B433C"/>
     <w:multiLevelType w:val="multilevel"/>
-    <w:tmpl w:val="AB34940C"/>
+    <w:tmpl w:val="388CB3E4"/>
     <w:lvl w:ilvl="0">
       <w:start w:val="1"/>
       <w:numFmt w:val="bullet"/>
@@ -1986,9 +2025,9 @@
     </w:lvl>
   </w:abstractNum>
   <w:abstractNum w:abstractNumId="4" w15:restartNumberingAfterBreak="0">
-    <w:nsid w:val="559C1B87"/>
+    <w:nsid w:val="6F5427B9"/>
     <w:multiLevelType w:val="multilevel"/>
-    <w:tmpl w:val="836E8DE8"/>
+    <w:tmpl w:val="42345B7E"/>
     <w:lvl w:ilvl="0">
       <w:start w:val="1"/>
       <w:numFmt w:val="bullet"/>
@@ -2135,7 +2174,7 @@
     </w:lvl>
   </w:abstractNum>
   <w:num w:numId="1">
-    <w:abstractNumId w:val="1"/>
+    <w:abstractNumId w:val="0"/>
   </w:num>
   <w:num w:numId="2">
     <w:abstractNumId w:val="2"/>
@@ -2144,7 +2183,7 @@
     <w:abstractNumId w:val="4"/>
   </w:num>
   <w:num w:numId="4">
-    <w:abstractNumId w:val="0"/>
+    <w:abstractNumId w:val="1"/>
   </w:num>
   <w:num w:numId="5">
     <w:abstractNumId w:val="3"/>

</xml_diff>

<commit_message>
chore: clean repository by removing temporary planning docs, pycache, and obsolete scripts
</commit_message>
<xml_diff>
--- a/Paul-Karonji-Waithaka-Resume.docx
+++ b/Paul-Karonji-Waithaka-Resume.docx
@@ -7,7 +7,7 @@
         <w:pStyle w:val="Heading1"/>
         <w:spacing w:before="0" w:beforeAutospacing="0" w:after="30" w:afterAutospacing="0"/>
         <w:jc w:val="center"/>
-        <w:divId w:val="1626503168"/>
+        <w:divId w:val="1263951923"/>
         <w:rPr>
           <w:rFonts w:ascii="Calibri" w:eastAsia="Times New Roman" w:hAnsi="Calibri" w:cs="Calibri"/>
           <w:color w:val="111111"/>
@@ -35,7 +35,7 @@
       <w:pPr>
         <w:pStyle w:val="role-title"/>
         <w:jc w:val="center"/>
-        <w:divId w:val="1626503168"/>
+        <w:divId w:val="1263951923"/>
         <w:rPr>
           <w:rFonts w:ascii="Calibri" w:hAnsi="Calibri" w:cs="Calibri"/>
           <w:lang w:val="en"/>
@@ -53,7 +53,7 @@
       <w:pPr>
         <w:pStyle w:val="contact-info"/>
         <w:jc w:val="center"/>
-        <w:divId w:val="1626503168"/>
+        <w:divId w:val="1263951923"/>
         <w:rPr>
           <w:rFonts w:ascii="Calibri" w:hAnsi="Calibri" w:cs="Calibri"/>
           <w:lang w:val="en"/>
@@ -72,12 +72,19 @@
           <w:lang w:val="en"/>
         </w:rPr>
         <w:br/>
-        <w:t xml:space="preserve">LinkedIn: linkedin.com/in/paul-karonji-562080381  |  GitHub: github.com/Paul-Karonji </w:t>
+        <w:t xml:space="preserve">LinkedIn: linkedin.com/in/paul-karonji-562080381  |  </w:t>
+      </w:r>
+      <w:r>
+        <w:rPr>
+          <w:rFonts w:ascii="Calibri" w:hAnsi="Calibri" w:cs="Calibri"/>
+          <w:lang w:val="en"/>
+        </w:rPr>
+        <w:t xml:space="preserve">GitHub: github.com/Paul-Karonji </w:t>
       </w:r>
     </w:p>
     <w:p>
       <w:pPr>
-        <w:divId w:val="1312711218"/>
+        <w:divId w:val="742607256"/>
         <w:rPr>
           <w:rFonts w:ascii="Calibri" w:eastAsia="Times New Roman" w:hAnsi="Calibri" w:cs="Calibri"/>
           <w:b/>
@@ -108,7 +115,7 @@
     <w:p>
       <w:pPr>
         <w:pStyle w:val="summary-text"/>
-        <w:divId w:val="1002198417"/>
+        <w:divId w:val="1489445275"/>
         <w:rPr>
           <w:rFonts w:ascii="Calibri" w:hAnsi="Calibri" w:cs="Calibri"/>
           <w:lang w:val="en"/>
@@ -119,7 +126,14 @@
           <w:rFonts w:ascii="Calibri" w:hAnsi="Calibri" w:cs="Calibri"/>
           <w:lang w:val="en"/>
         </w:rPr>
-        <w:t xml:space="preserve">Full-Stack Software Engineer and Systems Architect with 3+ years delivering production-grade systems spanning distributed backends, enterprise cloud platforms, offline-first desktop/mobile architectures, and cryptographic tooling. Founder of WIK Technologies, creator of </w:t>
+        <w:t>Full-Stack Software Engineer and Systems Architect with 3+ years delivering production-grade systems spanning distributed backends, enterprise cloud platforms, offline-first desktop/mobile architectures</w:t>
+      </w:r>
+      <w:r>
+        <w:rPr>
+          <w:rFonts w:ascii="Calibri" w:hAnsi="Calibri" w:cs="Calibri"/>
+          <w:lang w:val="en"/>
+        </w:rPr>
+        <w:t xml:space="preserve">, and cryptographic tooling. Founder of WIK Technologies, creator of </w:t>
       </w:r>
       <w:r>
         <w:rPr>
@@ -179,7 +193,14 @@
           <w:rFonts w:ascii="Calibri" w:hAnsi="Calibri" w:cs="Calibri"/>
           <w:lang w:val="en"/>
         </w:rPr>
-        <w:t xml:space="preserve"> (property marketplace monorepo), </w:t>
+        <w:t xml:space="preserve"> (prope</w:t>
+      </w:r>
+      <w:r>
+        <w:rPr>
+          <w:rFonts w:ascii="Calibri" w:hAnsi="Calibri" w:cs="Calibri"/>
+          <w:lang w:val="en"/>
+        </w:rPr>
+        <w:t xml:space="preserve">rty marketplace monorepo), </w:t>
       </w:r>
       <w:r>
         <w:rPr>
@@ -209,12 +230,19 @@
           <w:rFonts w:ascii="Calibri" w:hAnsi="Calibri" w:cs="Calibri"/>
           <w:lang w:val="en"/>
         </w:rPr>
-        <w:t xml:space="preserve"> (zero-knowledge PBKDF2 password manager). Deep expertise in Go, TypeScript, Python, and PHP, offline-first SQLite synchronization, emerging-market payment rails (M-Pesa, Paystack), and end-to-end production delivery. Final-year Software Development student at KCA University (Expected 2026). </w:t>
+        <w:t xml:space="preserve"> (zero-knowledge PBKDF2 password manager). Deep expertise in Go, TypeScript, Python, and PHP, offline-first SQLite synchronization, emerging-market payment rails (M-P</w:t>
+      </w:r>
+      <w:r>
+        <w:rPr>
+          <w:rFonts w:ascii="Calibri" w:hAnsi="Calibri" w:cs="Calibri"/>
+          <w:lang w:val="en"/>
+        </w:rPr>
+        <w:t xml:space="preserve">esa, Paystack), and end-to-end production delivery. Final-year Software Development student at KCA University (Expected 2026). </w:t>
       </w:r>
     </w:p>
     <w:p>
       <w:pPr>
-        <w:divId w:val="877933792"/>
+        <w:divId w:val="1522818638"/>
         <w:rPr>
           <w:rFonts w:ascii="Calibri" w:eastAsia="Times New Roman" w:hAnsi="Calibri" w:cs="Calibri"/>
           <w:b/>
@@ -250,7 +278,7 @@
         </w:numPr>
         <w:spacing w:before="100" w:beforeAutospacing="1" w:after="38"/>
         <w:ind w:left="0"/>
-        <w:divId w:val="1930918928"/>
+        <w:divId w:val="1911886756"/>
         <w:rPr>
           <w:rFonts w:ascii="Calibri" w:eastAsia="Times New Roman" w:hAnsi="Calibri" w:cs="Calibri"/>
           <w:color w:val="222222"/>
@@ -287,7 +315,17 @@
           <w:szCs w:val="18"/>
           <w:lang w:val="en"/>
         </w:rPr>
-        <w:t xml:space="preserve"> Go (Golang), TypeScript, JavaScript (ES6+), Python, PHP 8, Kotlin, SQL (PostgreSQL, MySQL, SQLite), HTML5, CSS3, Bash</w:t>
+        <w:t xml:space="preserve"> Go (Golang), TypeScript, JavaScript (ES6+), Python, PHP 8, Kotlin, SQL (PostgreSQL, MySQL, SQ</w:t>
+      </w:r>
+      <w:r>
+        <w:rPr>
+          <w:rFonts w:ascii="Calibri" w:eastAsia="Times New Roman" w:hAnsi="Calibri" w:cs="Calibri"/>
+          <w:color w:val="222222"/>
+          <w:sz w:val="18"/>
+          <w:szCs w:val="18"/>
+          <w:lang w:val="en"/>
+        </w:rPr>
+        <w:t>Lite), HTML5, CSS3, Bash</w:t>
       </w:r>
     </w:p>
     <w:p>
@@ -298,7 +336,7 @@
         </w:numPr>
         <w:spacing w:before="100" w:beforeAutospacing="1" w:after="38"/>
         <w:ind w:left="0"/>
-        <w:divId w:val="1930918928"/>
+        <w:divId w:val="1911886756"/>
         <w:rPr>
           <w:rFonts w:ascii="Calibri" w:eastAsia="Times New Roman" w:hAnsi="Calibri" w:cs="Calibri"/>
           <w:color w:val="222222"/>
@@ -346,7 +384,7 @@
         </w:numPr>
         <w:spacing w:before="100" w:beforeAutospacing="1" w:after="38"/>
         <w:ind w:left="0"/>
-        <w:divId w:val="1930918928"/>
+        <w:divId w:val="1911886756"/>
         <w:rPr>
           <w:rFonts w:ascii="Calibri" w:eastAsia="Times New Roman" w:hAnsi="Calibri" w:cs="Calibri"/>
           <w:color w:val="222222"/>
@@ -383,7 +421,17 @@
           <w:szCs w:val="18"/>
           <w:lang w:val="en"/>
         </w:rPr>
-        <w:t xml:space="preserve"> React 19, Next.js 16/15, React Native 0.86, Expo 57, Electron, Vite, Tailwind CSS, Radix UI, TanStack Query, Progressive Web Apps (PWAs), IndexedDB</w:t>
+        <w:t xml:space="preserve"> React 19, Next.js 16/15, React Nati</w:t>
+      </w:r>
+      <w:r>
+        <w:rPr>
+          <w:rFonts w:ascii="Calibri" w:eastAsia="Times New Roman" w:hAnsi="Calibri" w:cs="Calibri"/>
+          <w:color w:val="222222"/>
+          <w:sz w:val="18"/>
+          <w:szCs w:val="18"/>
+          <w:lang w:val="en"/>
+        </w:rPr>
+        <w:t>ve 0.86, Expo 57, Electron, Vite, Tailwind CSS, Radix UI, TanStack Query, Progressive Web Apps (PWAs), IndexedDB</w:t>
       </w:r>
     </w:p>
     <w:p>
@@ -394,7 +442,7 @@
         </w:numPr>
         <w:spacing w:before="100" w:beforeAutospacing="1" w:after="38"/>
         <w:ind w:left="0"/>
-        <w:divId w:val="1930918928"/>
+        <w:divId w:val="1911886756"/>
         <w:rPr>
           <w:rFonts w:ascii="Calibri" w:eastAsia="Times New Roman" w:hAnsi="Calibri" w:cs="Calibri"/>
           <w:color w:val="222222"/>
@@ -431,7 +479,17 @@
           <w:szCs w:val="18"/>
           <w:lang w:val="en"/>
         </w:rPr>
-        <w:t xml:space="preserve"> PostgreSQL, MySQL 8 / TiDB Serverless, SQLite (better-sqlite3, Expo SQLite), Prisma ORM, Drizzle ORM, Eloquent ORM, Supabase, Cloudflare R2, AWS S3, Upstash Redis</w:t>
+        <w:t xml:space="preserve"> PostgreSQL, MySQL 8 / TiDB Serverless, SQLite (better-sqlite3, Expo SQLite), Prisma ORM, Drizzle ORM, Eloquent ORM, Supab</w:t>
+      </w:r>
+      <w:r>
+        <w:rPr>
+          <w:rFonts w:ascii="Calibri" w:eastAsia="Times New Roman" w:hAnsi="Calibri" w:cs="Calibri"/>
+          <w:color w:val="222222"/>
+          <w:sz w:val="18"/>
+          <w:szCs w:val="18"/>
+          <w:lang w:val="en"/>
+        </w:rPr>
+        <w:t>ase, Cloudflare R2, AWS S3, Upstash Redis</w:t>
       </w:r>
     </w:p>
     <w:p>
@@ -442,7 +500,7 @@
         </w:numPr>
         <w:spacing w:before="100" w:beforeAutospacing="1" w:after="38"/>
         <w:ind w:left="0"/>
-        <w:divId w:val="1930918928"/>
+        <w:divId w:val="1911886756"/>
         <w:rPr>
           <w:rFonts w:ascii="Calibri" w:eastAsia="Times New Roman" w:hAnsi="Calibri" w:cs="Calibri"/>
           <w:color w:val="222222"/>
@@ -479,7 +537,17 @@
           <w:szCs w:val="18"/>
           <w:lang w:val="en"/>
         </w:rPr>
-        <w:t xml:space="preserve"> Zero-Knowledge client-side encryption (Web Crypto PBKDF2/SHA-256 100k rounds, AES-GCM-256), hardware-bound CPU/MAC fingerprinting, timing-safe HMAC-SHA256, RLS, Helmet, rate limiting, KRA eTIMS AES-256 keys, CVE patching</w:t>
+        <w:t xml:space="preserve"> Zero-Knowledge client-side encryption (Web Crypto PBKDF2/SHA-256 100k rounds, AES-GCM-256), hardware-bound CPU/MAC fingerprinting, timing-safe HMAC-SHA256, RLS, Helmet, rate limiting, KRA </w:t>
+      </w:r>
+      <w:r>
+        <w:rPr>
+          <w:rFonts w:ascii="Calibri" w:eastAsia="Times New Roman" w:hAnsi="Calibri" w:cs="Calibri"/>
+          <w:color w:val="222222"/>
+          <w:sz w:val="18"/>
+          <w:szCs w:val="18"/>
+          <w:lang w:val="en"/>
+        </w:rPr>
+        <w:t>eTIMS AES-256 keys, CVE patching</w:t>
       </w:r>
     </w:p>
     <w:p>
@@ -490,7 +558,7 @@
         </w:numPr>
         <w:spacing w:before="100" w:beforeAutospacing="1" w:after="38"/>
         <w:ind w:left="0"/>
-        <w:divId w:val="1930918928"/>
+        <w:divId w:val="1911886756"/>
         <w:rPr>
           <w:rFonts w:ascii="Calibri" w:eastAsia="Times New Roman" w:hAnsi="Calibri" w:cs="Calibri"/>
           <w:color w:val="222222"/>
@@ -538,7 +606,7 @@
         </w:numPr>
         <w:spacing w:before="100" w:beforeAutospacing="1" w:after="38"/>
         <w:ind w:left="0"/>
-        <w:divId w:val="1930918928"/>
+        <w:divId w:val="1911886756"/>
         <w:rPr>
           <w:rFonts w:ascii="Calibri" w:eastAsia="Times New Roman" w:hAnsi="Calibri" w:cs="Calibri"/>
           <w:color w:val="222222"/>
@@ -575,12 +643,22 @@
           <w:szCs w:val="18"/>
           <w:lang w:val="en"/>
         </w:rPr>
-        <w:t xml:space="preserve"> KRA eTIMS (OSCU/VSCU automated fiscalization), M-Pesa Daraja (STK Push &amp; C2B Webhook queues), Paystack (SaaS subscriptions &amp; split payments), Model Context Protocol (MCP), Google Calendar API v3 (OAuth 2.0), Africa's Talking, Cloudinary, Resend</w:t>
+        <w:t xml:space="preserve"> KRA eTIMS </w:t>
+      </w:r>
+      <w:r>
+        <w:rPr>
+          <w:rFonts w:ascii="Calibri" w:eastAsia="Times New Roman" w:hAnsi="Calibri" w:cs="Calibri"/>
+          <w:color w:val="222222"/>
+          <w:sz w:val="18"/>
+          <w:szCs w:val="18"/>
+          <w:lang w:val="en"/>
+        </w:rPr>
+        <w:t>(OSCU/VSCU automated fiscalization), M-Pesa Daraja (STK Push &amp; C2B Webhook queues), Paystack (SaaS subscriptions &amp; split payments), Model Context Protocol (MCP), Google Calendar API v3 (OAuth 2.0), Africa's Talking, Cloudinary, Resend</w:t>
       </w:r>
     </w:p>
     <w:p>
       <w:pPr>
-        <w:divId w:val="270432707"/>
+        <w:divId w:val="255985449"/>
         <w:rPr>
           <w:rFonts w:ascii="Calibri" w:eastAsia="Times New Roman" w:hAnsi="Calibri" w:cs="Calibri"/>
           <w:b/>
@@ -605,12 +683,26 @@
           <w:szCs w:val="22"/>
           <w:lang w:val="en"/>
         </w:rPr>
-        <w:t>Professional Experience</w:t>
+        <w:t>Professional Experien</w:t>
+      </w:r>
+      <w:r>
+        <w:rPr>
+          <w:rFonts w:ascii="Calibri" w:eastAsia="Times New Roman" w:hAnsi="Calibri" w:cs="Calibri"/>
+          <w:b/>
+          <w:bCs/>
+          <w:caps/>
+          <w:color w:val="111111"/>
+          <w:spacing w:val="10"/>
+          <w:sz w:val="22"/>
+          <w:szCs w:val="22"/>
+          <w:lang w:val="en"/>
+        </w:rPr>
+        <w:t>ce</w:t>
       </w:r>
     </w:p>
     <w:p>
       <w:pPr>
-        <w:divId w:val="1800492656"/>
+        <w:divId w:val="781454688"/>
         <w:rPr>
           <w:rFonts w:ascii="Calibri" w:eastAsia="Times New Roman" w:hAnsi="Calibri" w:cs="Calibri"/>
           <w:color w:val="222222"/>
@@ -665,7 +757,7 @@
         <w:spacing w:before="100" w:beforeAutospacing="1" w:after="53"/>
         <w:ind w:left="0"/>
         <w:jc w:val="both"/>
-        <w:divId w:val="1575506196"/>
+        <w:divId w:val="78259141"/>
         <w:rPr>
           <w:rFonts w:ascii="Calibri" w:eastAsia="Times New Roman" w:hAnsi="Calibri" w:cs="Calibri"/>
           <w:color w:val="2A2A2A"/>
@@ -692,7 +784,27 @@
           <w:szCs w:val="18"/>
           <w:lang w:val="en"/>
         </w:rPr>
-        <w:t xml:space="preserve"> Architected multi-tenant cloud retail operations platform on NestJS 11, React 19, and PostgreSQL; built automated KRA eTIMS fiscalization worker (OSCU/VSCU) with AES-256 encrypted tax credentials, real-time M-Pesa STK push &amp; C2B Paybill cashier reconciliation queue (C2BQueueModal), and Paystack recurring SaaS billing with lifecycle walls (ActiveSubscriptionGuard, SuspendedWall).</w:t>
+        <w:t xml:space="preserve"> </w:t>
+      </w:r>
+      <w:r>
+        <w:rPr>
+          <w:rFonts w:ascii="Calibri" w:eastAsia="Times New Roman" w:hAnsi="Calibri" w:cs="Calibri"/>
+          <w:color w:val="2A2A2A"/>
+          <w:sz w:val="18"/>
+          <w:szCs w:val="18"/>
+          <w:lang w:val="en"/>
+        </w:rPr>
+        <w:t>Architected multi-tenant cloud retail operations platform on NestJS 11, React 19, and PostgreSQL; built automated KRA eTIMS fiscalization worker (OSCU/VSCU) with AES-256 encrypted tax credentials, real-time M-Pesa STK push &amp; C2B Paybill cashier reconciliat</w:t>
+      </w:r>
+      <w:r>
+        <w:rPr>
+          <w:rFonts w:ascii="Calibri" w:eastAsia="Times New Roman" w:hAnsi="Calibri" w:cs="Calibri"/>
+          <w:color w:val="2A2A2A"/>
+          <w:sz w:val="18"/>
+          <w:szCs w:val="18"/>
+          <w:lang w:val="en"/>
+        </w:rPr>
+        <w:t>ion queue (C2BQueueModal), and Paystack recurring SaaS billing with lifecycle walls (ActiveSubscriptionGuard, SuspendedWall).</w:t>
       </w:r>
     </w:p>
     <w:p>
@@ -704,7 +816,7 @@
         <w:spacing w:before="100" w:beforeAutospacing="1" w:after="53"/>
         <w:ind w:left="0"/>
         <w:jc w:val="both"/>
-        <w:divId w:val="1575506196"/>
+        <w:divId w:val="78259141"/>
         <w:rPr>
           <w:rFonts w:ascii="Calibri" w:eastAsia="Times New Roman" w:hAnsi="Calibri" w:cs="Calibri"/>
           <w:color w:val="2A2A2A"/>
@@ -731,7 +843,17 @@
           <w:szCs w:val="18"/>
           <w:lang w:val="en"/>
         </w:rPr>
-        <w:t xml:space="preserve"> Delivered 200+ endpoint clinical hospital ERP on Laravel 12, React 19, and MySQL 8 with automated ledger billing via Observer pattern, real-time triage queue management, and pharmacy FEFO batch expiry registers.</w:t>
+        <w:t xml:space="preserve"> Delivered 200+ endpoint clinical hospital ERP on Laravel 12, React 19, and MySQL 8 wit</w:t>
+      </w:r>
+      <w:r>
+        <w:rPr>
+          <w:rFonts w:ascii="Calibri" w:eastAsia="Times New Roman" w:hAnsi="Calibri" w:cs="Calibri"/>
+          <w:color w:val="2A2A2A"/>
+          <w:sz w:val="18"/>
+          <w:szCs w:val="18"/>
+          <w:lang w:val="en"/>
+        </w:rPr>
+        <w:t>h automated ledger billing via Observer pattern, real-time triage queue management, and pharmacy FEFO batch expiry registers.</w:t>
       </w:r>
     </w:p>
     <w:p>
@@ -743,7 +865,7 @@
         <w:spacing w:before="100" w:beforeAutospacing="1" w:after="53"/>
         <w:ind w:left="0"/>
         <w:jc w:val="both"/>
-        <w:divId w:val="1575506196"/>
+        <w:divId w:val="78259141"/>
         <w:rPr>
           <w:rFonts w:ascii="Calibri" w:eastAsia="Times New Roman" w:hAnsi="Calibri" w:cs="Calibri"/>
           <w:color w:val="2A2A2A"/>
@@ -770,7 +892,17 @@
           <w:szCs w:val="18"/>
           <w:lang w:val="en"/>
         </w:rPr>
-        <w:t xml:space="preserve"> Engineered high-concurrency Go backend for batch IoT telematics ingestion and real-time WebSocket fan-out, paired with an offline-first React Native (Expo 57) driver mobile app buffering telemetry in local SQLite with QR manifest claiming and stoppage detection.</w:t>
+        <w:t xml:space="preserve"> Engineered high-concurrency Go backend for batch IoT telematics ingestion and real-time WebSocke</w:t>
+      </w:r>
+      <w:r>
+        <w:rPr>
+          <w:rFonts w:ascii="Calibri" w:eastAsia="Times New Roman" w:hAnsi="Calibri" w:cs="Calibri"/>
+          <w:color w:val="2A2A2A"/>
+          <w:sz w:val="18"/>
+          <w:szCs w:val="18"/>
+          <w:lang w:val="en"/>
+        </w:rPr>
+        <w:t>t fan-out, paired with an offline-first React Native (Expo 57) driver mobile app buffering telemetry in local SQLite with QR manifest claiming and stoppage detection.</w:t>
       </w:r>
     </w:p>
     <w:p>
@@ -782,7 +914,7 @@
         <w:spacing w:before="100" w:beforeAutospacing="1" w:after="53"/>
         <w:ind w:left="0"/>
         <w:jc w:val="both"/>
-        <w:divId w:val="1575506196"/>
+        <w:divId w:val="78259141"/>
         <w:rPr>
           <w:rFonts w:ascii="Calibri" w:eastAsia="Times New Roman" w:hAnsi="Calibri" w:cs="Calibri"/>
           <w:color w:val="2A2A2A"/>
@@ -809,7 +941,17 @@
           <w:szCs w:val="18"/>
           <w:lang w:val="en"/>
         </w:rPr>
-        <w:t xml:space="preserve"> Built automated telecommunications billing daemon integrating MikroTik RouterOS socket API with M-Pesa Daraja STK push and a Next.js 14 NOC console for ISP/hotspot bandwidth automation in Docker Compose.</w:t>
+        <w:t xml:space="preserve"> Built automated telecommunications billing daemon integrat</w:t>
+      </w:r>
+      <w:r>
+        <w:rPr>
+          <w:rFonts w:ascii="Calibri" w:eastAsia="Times New Roman" w:hAnsi="Calibri" w:cs="Calibri"/>
+          <w:color w:val="2A2A2A"/>
+          <w:sz w:val="18"/>
+          <w:szCs w:val="18"/>
+          <w:lang w:val="en"/>
+        </w:rPr>
+        <w:t>ing MikroTik RouterOS socket API with M-Pesa Daraja STK push and a Next.js 14 NOC console for ISP/hotspot bandwidth automation in Docker Compose.</w:t>
       </w:r>
     </w:p>
     <w:p>
@@ -821,7 +963,7 @@
         <w:spacing w:before="100" w:beforeAutospacing="1" w:after="53"/>
         <w:ind w:left="0"/>
         <w:jc w:val="both"/>
-        <w:divId w:val="1575506196"/>
+        <w:divId w:val="78259141"/>
         <w:rPr>
           <w:rFonts w:ascii="Calibri" w:eastAsia="Times New Roman" w:hAnsi="Calibri" w:cs="Calibri"/>
           <w:color w:val="2A2A2A"/>
@@ -848,7 +990,17 @@
           <w:szCs w:val="18"/>
           <w:lang w:val="en"/>
         </w:rPr>
-        <w:t xml:space="preserve"> Developed zero-knowledge cross-browser extension (Manifest V3) and Web Vault using client-side Web Crypto PBKDF2 (100,000 iterations) and AES-GCM-256 with Supabase synchronization.</w:t>
+        <w:t xml:space="preserve"> Developed zero-knowledge cross-browser extension (Manifest V3) and Web Vault using clie</w:t>
+      </w:r>
+      <w:r>
+        <w:rPr>
+          <w:rFonts w:ascii="Calibri" w:eastAsia="Times New Roman" w:hAnsi="Calibri" w:cs="Calibri"/>
+          <w:color w:val="2A2A2A"/>
+          <w:sz w:val="18"/>
+          <w:szCs w:val="18"/>
+          <w:lang w:val="en"/>
+        </w:rPr>
+        <w:t>nt-side Web Crypto PBKDF2 (100,000 iterations) and AES-GCM-256 with Supabase synchronization.</w:t>
       </w:r>
     </w:p>
     <w:p>
@@ -860,7 +1012,7 @@
         <w:spacing w:before="100" w:beforeAutospacing="1" w:after="53"/>
         <w:ind w:left="0"/>
         <w:jc w:val="both"/>
-        <w:divId w:val="1575506196"/>
+        <w:divId w:val="78259141"/>
         <w:rPr>
           <w:rFonts w:ascii="Calibri" w:eastAsia="Times New Roman" w:hAnsi="Calibri" w:cs="Calibri"/>
           <w:color w:val="2A2A2A"/>
@@ -888,7 +1040,17 @@
           <w:szCs w:val="18"/>
           <w:lang w:val="en"/>
         </w:rPr>
-        <w:t xml:space="preserve"> Shipped offline-first Electron + SQLite retail suite featuring hardware-bound licensing (CPU+MAC fingerprinting), 30-day offline grace periods, FEFO pharmacy expiry batching (v1.3.33), and hotel multi-terminal LAN F&amp;B ordering (v1.3.26).</w:t>
+        <w:t xml:space="preserve"> Shipped offline-first Electron + SQLite retail suite featuring hardware-bound licensing (CPU+MAC fingerprinting), 30-</w:t>
+      </w:r>
+      <w:r>
+        <w:rPr>
+          <w:rFonts w:ascii="Calibri" w:eastAsia="Times New Roman" w:hAnsi="Calibri" w:cs="Calibri"/>
+          <w:color w:val="2A2A2A"/>
+          <w:sz w:val="18"/>
+          <w:szCs w:val="18"/>
+          <w:lang w:val="en"/>
+        </w:rPr>
+        <w:t>day offline grace periods, FEFO pharmacy expiry batching (v1.3.33), and hotel multi-terminal LAN F&amp;B ordering (v1.3.26).</w:t>
       </w:r>
     </w:p>
     <w:p>
@@ -900,7 +1062,7 @@
         <w:spacing w:before="100" w:beforeAutospacing="1" w:after="53"/>
         <w:ind w:left="0"/>
         <w:jc w:val="both"/>
-        <w:divId w:val="1575506196"/>
+        <w:divId w:val="78259141"/>
         <w:rPr>
           <w:rFonts w:ascii="Calibri" w:eastAsia="Times New Roman" w:hAnsi="Calibri" w:cs="Calibri"/>
           <w:color w:val="2A2A2A"/>
@@ -927,12 +1089,22 @@
           <w:szCs w:val="18"/>
           <w:lang w:val="en"/>
         </w:rPr>
-        <w:t xml:space="preserve"> Shipped task-management SaaS on Next.js 15 featuring two-way Google Calendar OAuth2 sync, Upstash Redis rate limiting, and a native 13-tool MCP server allowing AI agents to orchestrate schedule planning.</w:t>
+        <w:t xml:space="preserve"> Shipped task-management SaaS on Next.js 15 featuring two-way Google Calendar OAuth2 sync, Upstash </w:t>
+      </w:r>
+      <w:r>
+        <w:rPr>
+          <w:rFonts w:ascii="Calibri" w:eastAsia="Times New Roman" w:hAnsi="Calibri" w:cs="Calibri"/>
+          <w:color w:val="2A2A2A"/>
+          <w:sz w:val="18"/>
+          <w:szCs w:val="18"/>
+          <w:lang w:val="en"/>
+        </w:rPr>
+        <w:t>Redis rate limiting, and a native 13-tool MCP server allowing AI agents to orchestrate schedule planning.</w:t>
       </w:r>
     </w:p>
     <w:p>
       <w:pPr>
-        <w:divId w:val="330570503"/>
+        <w:divId w:val="1224675273"/>
         <w:rPr>
           <w:rFonts w:ascii="Calibri" w:eastAsia="Times New Roman" w:hAnsi="Calibri" w:cs="Calibri"/>
           <w:color w:val="222222"/>
@@ -987,7 +1159,7 @@
         <w:spacing w:before="100" w:beforeAutospacing="1" w:after="53"/>
         <w:ind w:left="0"/>
         <w:jc w:val="both"/>
-        <w:divId w:val="595483393"/>
+        <w:divId w:val="1712457860"/>
         <w:rPr>
           <w:rFonts w:ascii="Calibri" w:eastAsia="Times New Roman" w:hAnsi="Calibri" w:cs="Calibri"/>
           <w:color w:val="2A2A2A"/>
@@ -1014,7 +1186,17 @@
           <w:szCs w:val="18"/>
           <w:lang w:val="en"/>
         </w:rPr>
-        <w:t xml:space="preserve"> Directed engineering of the JKUAT innovation management platform (PHP 8.1, MySQL, Docker, JavaScript) across 4 user roles, 6 project lifecycle stages, and automated mentor assignment engines; delivered in production for active nationwide use.</w:t>
+        <w:t xml:space="preserve"> </w:t>
+      </w:r>
+      <w:r>
+        <w:rPr>
+          <w:rFonts w:ascii="Calibri" w:eastAsia="Times New Roman" w:hAnsi="Calibri" w:cs="Calibri"/>
+          <w:color w:val="2A2A2A"/>
+          <w:sz w:val="18"/>
+          <w:szCs w:val="18"/>
+          <w:lang w:val="en"/>
+        </w:rPr>
+        <w:t>Directed engineering of the JKUAT innovation management platform (PHP 8.1, MySQL, Docker, JavaScript) across 4 user roles, 6 project lifecycle stages, and automated mentor assignment engines; delivered in production for active nationwide use.</w:t>
       </w:r>
     </w:p>
     <w:p>
@@ -1026,7 +1208,7 @@
         <w:spacing w:before="100" w:beforeAutospacing="1" w:after="53"/>
         <w:ind w:left="0"/>
         <w:jc w:val="both"/>
-        <w:divId w:val="595483393"/>
+        <w:divId w:val="1712457860"/>
         <w:rPr>
           <w:rFonts w:ascii="Calibri" w:eastAsia="Times New Roman" w:hAnsi="Calibri" w:cs="Calibri"/>
           <w:color w:val="2A2A2A"/>
@@ -1043,7 +1225,17 @@
           <w:szCs w:val="18"/>
           <w:lang w:val="en"/>
         </w:rPr>
-        <w:t>Quality &amp; DevOps Standards:</w:t>
+        <w:t>Quality &amp; Dev</w:t>
+      </w:r>
+      <w:r>
+        <w:rPr>
+          <w:rStyle w:val="lead-bold1"/>
+          <w:rFonts w:ascii="Calibri" w:eastAsia="Times New Roman" w:hAnsi="Calibri" w:cs="Calibri"/>
+          <w:sz w:val="18"/>
+          <w:szCs w:val="18"/>
+          <w:lang w:val="en"/>
+        </w:rPr>
+        <w:t>Ops Standards:</w:t>
       </w:r>
       <w:r>
         <w:rPr>
@@ -1058,7 +1250,7 @@
     </w:p>
     <w:p>
       <w:pPr>
-        <w:divId w:val="1194265301"/>
+        <w:divId w:val="1180124053"/>
         <w:rPr>
           <w:rFonts w:ascii="Calibri" w:eastAsia="Times New Roman" w:hAnsi="Calibri" w:cs="Calibri"/>
           <w:color w:val="222222"/>
@@ -1073,7 +1265,15 @@
           <w:rFonts w:ascii="Calibri" w:eastAsia="Times New Roman" w:hAnsi="Calibri" w:cs="Calibri"/>
           <w:lang w:val="en"/>
         </w:rPr>
-        <w:t>Freelance Software Engineer &amp; Systems Consultant | Independent Contractor</w:t>
+        <w:t>Freelance Software Engineer &amp; Systems Consultant | Independent Contracto</w:t>
+      </w:r>
+      <w:r>
+        <w:rPr>
+          <w:rStyle w:val="job-title-company1"/>
+          <w:rFonts w:ascii="Calibri" w:eastAsia="Times New Roman" w:hAnsi="Calibri" w:cs="Calibri"/>
+          <w:lang w:val="en"/>
+        </w:rPr>
+        <w:t>r</w:t>
       </w:r>
       <w:r>
         <w:rPr>
@@ -1113,7 +1313,7 @@
         <w:spacing w:before="100" w:beforeAutospacing="1" w:after="53"/>
         <w:ind w:left="0"/>
         <w:jc w:val="both"/>
-        <w:divId w:val="379208666"/>
+        <w:divId w:val="860555835"/>
         <w:rPr>
           <w:rFonts w:ascii="Calibri" w:eastAsia="Times New Roman" w:hAnsi="Calibri" w:cs="Calibri"/>
           <w:color w:val="2A2A2A"/>
@@ -1140,7 +1340,17 @@
           <w:szCs w:val="18"/>
           <w:lang w:val="en"/>
         </w:rPr>
-        <w:t xml:space="preserve"> Shipped full-stack property marketplace monorepo (Next.js 16, Express 5, PostgreSQL, Prisma, Socket.IO) with dual Paystack subscription tiers (agents &amp; land agents), logarithmic listing curation algorithms, and CI/CD security invariant tests.</w:t>
+        <w:t xml:space="preserve"> Shipped full-stack property marketplace monorepo (Next.js 16, Express 5, PostgreSQL, Prisma, Socket.IO) with dual Paystack subscription tiers (agents &amp; land agents), logarithmic listing </w:t>
+      </w:r>
+      <w:r>
+        <w:rPr>
+          <w:rFonts w:ascii="Calibri" w:eastAsia="Times New Roman" w:hAnsi="Calibri" w:cs="Calibri"/>
+          <w:color w:val="2A2A2A"/>
+          <w:sz w:val="18"/>
+          <w:szCs w:val="18"/>
+          <w:lang w:val="en"/>
+        </w:rPr>
+        <w:t>curation algorithms, and CI/CD security invariant tests.</w:t>
       </w:r>
     </w:p>
     <w:p>
@@ -1152,7 +1362,7 @@
         <w:spacing w:before="100" w:beforeAutospacing="1" w:after="53"/>
         <w:ind w:left="0"/>
         <w:jc w:val="both"/>
-        <w:divId w:val="379208666"/>
+        <w:divId w:val="860555835"/>
         <w:rPr>
           <w:rFonts w:ascii="Calibri" w:eastAsia="Times New Roman" w:hAnsi="Calibri" w:cs="Calibri"/>
           <w:color w:val="2A2A2A"/>
@@ -1179,7 +1389,17 @@
           <w:szCs w:val="18"/>
           <w:lang w:val="en"/>
         </w:rPr>
-        <w:t xml:space="preserve"> Built multi-tutor agency commission platform (React 19, Express 5, TiDB Serverless, Cloudflare R2, Socket.IO) with timing-safe HMAC guest checkout URLs and idempotent boot-time database patching.</w:t>
+        <w:t xml:space="preserve"> Built multi-tutor agency commission platform (React 19, Express 5, TiDB Serverless, Cloudflare R2, Socket.IO) with timing-safe HMAC guest checkout URLs and idempotent boot-ti</w:t>
+      </w:r>
+      <w:r>
+        <w:rPr>
+          <w:rFonts w:ascii="Calibri" w:eastAsia="Times New Roman" w:hAnsi="Calibri" w:cs="Calibri"/>
+          <w:color w:val="2A2A2A"/>
+          <w:sz w:val="18"/>
+          <w:szCs w:val="18"/>
+          <w:lang w:val="en"/>
+        </w:rPr>
+        <w:t>me database patching.</w:t>
       </w:r>
     </w:p>
     <w:p>
@@ -1191,7 +1411,7 @@
         <w:spacing w:before="100" w:beforeAutospacing="1" w:after="53"/>
         <w:ind w:left="0"/>
         <w:jc w:val="both"/>
-        <w:divId w:val="379208666"/>
+        <w:divId w:val="860555835"/>
         <w:rPr>
           <w:rFonts w:ascii="Calibri" w:eastAsia="Times New Roman" w:hAnsi="Calibri" w:cs="Calibri"/>
           <w:color w:val="2A2A2A"/>
@@ -1230,7 +1450,7 @@
         <w:spacing w:before="100" w:beforeAutospacing="1" w:after="53"/>
         <w:ind w:left="0"/>
         <w:jc w:val="both"/>
-        <w:divId w:val="379208666"/>
+        <w:divId w:val="860555835"/>
         <w:rPr>
           <w:rFonts w:ascii="Calibri" w:eastAsia="Times New Roman" w:hAnsi="Calibri" w:cs="Calibri"/>
           <w:color w:val="2A2A2A"/>
@@ -1262,7 +1482,7 @@
     </w:p>
     <w:p>
       <w:pPr>
-        <w:divId w:val="1092776054"/>
+        <w:divId w:val="874195405"/>
         <w:rPr>
           <w:rFonts w:ascii="Calibri" w:eastAsia="Times New Roman" w:hAnsi="Calibri" w:cs="Calibri"/>
           <w:b/>
@@ -1292,7 +1512,7 @@
     </w:p>
     <w:p>
       <w:pPr>
-        <w:divId w:val="233585203"/>
+        <w:divId w:val="1117678264"/>
         <w:rPr>
           <w:rFonts w:ascii="Calibri" w:eastAsia="Times New Roman" w:hAnsi="Calibri" w:cs="Calibri"/>
           <w:color w:val="222222"/>
@@ -1325,7 +1545,15 @@
           <w:rFonts w:ascii="Calibri" w:eastAsia="Times New Roman" w:hAnsi="Calibri" w:cs="Calibri"/>
           <w:lang w:val="en"/>
         </w:rPr>
-        <w:t>Nairobi, Kenya  ·  Sep 2021 – Dec 2026 Expected</w:t>
+        <w:t xml:space="preserve">Nairobi, Kenya  ·  Sep 2021 – Dec </w:t>
+      </w:r>
+      <w:r>
+        <w:rPr>
+          <w:rStyle w:val="job-meta1"/>
+          <w:rFonts w:ascii="Calibri" w:eastAsia="Times New Roman" w:hAnsi="Calibri" w:cs="Calibri"/>
+          <w:lang w:val="en"/>
+        </w:rPr>
+        <w:t>2026 Expected</w:t>
       </w:r>
       <w:r>
         <w:rPr>
@@ -1347,7 +1575,7 @@
         <w:spacing w:before="100" w:beforeAutospacing="1" w:after="53"/>
         <w:ind w:left="0"/>
         <w:jc w:val="both"/>
-        <w:divId w:val="1372070981"/>
+        <w:divId w:val="256865003"/>
         <w:rPr>
           <w:rFonts w:ascii="Calibri" w:eastAsia="Times New Roman" w:hAnsi="Calibri" w:cs="Calibri"/>
           <w:color w:val="2A2A2A"/>
@@ -1386,7 +1614,7 @@
         <w:spacing w:before="100" w:beforeAutospacing="1" w:after="53"/>
         <w:ind w:left="0"/>
         <w:jc w:val="both"/>
-        <w:divId w:val="1372070981"/>
+        <w:divId w:val="256865003"/>
         <w:rPr>
           <w:rFonts w:ascii="Calibri" w:eastAsia="Times New Roman" w:hAnsi="Calibri" w:cs="Calibri"/>
           <w:color w:val="2A2A2A"/>
@@ -1413,7 +1641,17 @@
           <w:szCs w:val="18"/>
           <w:lang w:val="en"/>
         </w:rPr>
-        <w:t xml:space="preserve"> Cybersecurity Fundamentals (IBM SkillsBuild, 2025)  ·  Data Protection Basics (Atingi eLearning Platform, Sep 2025)  ·  Zoho Creator Developer Certification (Zoho, Nov/Dec 2025).</w:t>
+        <w:t xml:space="preserve"> Cybe</w:t>
+      </w:r>
+      <w:r>
+        <w:rPr>
+          <w:rFonts w:ascii="Calibri" w:eastAsia="Times New Roman" w:hAnsi="Calibri" w:cs="Calibri"/>
+          <w:color w:val="2A2A2A"/>
+          <w:sz w:val="18"/>
+          <w:szCs w:val="18"/>
+          <w:lang w:val="en"/>
+        </w:rPr>
+        <w:t>rsecurity Fundamentals (IBM SkillsBuild, 2025)  ·  Data Protection Basics (Atingi eLearning Platform, Sep 2025)  ·  Zoho Creator Developer Certification (Zoho, Nov/Dec 2025).</w:t>
       </w:r>
     </w:p>
     <w:sectPr>
@@ -1429,9 +1667,9 @@
 <file path=word/numbering.xml><?xml version="1.0" encoding="utf-8"?>
 <w:numbering xmlns:wpc="http://schemas.microsoft.com/office/word/2010/wordprocessingCanvas" xmlns:cx="http://schemas.microsoft.com/office/drawing/2014/chartex" xmlns:cx1="http://schemas.microsoft.com/office/drawing/2015/9/8/chartex" xmlns:cx2="http://schemas.microsoft.com/office/drawing/2015/10/21/chartex" xmlns:cx3="http://schemas.microsoft.com/office/drawing/2016/5/9/chartex" xmlns:cx4="http://schemas.microsoft.com/office/drawing/2016/5/10/chartex" xmlns:cx5="http://schemas.microsoft.com/office/drawing/2016/5/11/chartex" xmlns:cx6="http://schemas.microsoft.com/office/drawing/2016/5/12/chartex" xmlns:cx7="http://schemas.microsoft.com/office/drawing/2016/5/13/chartex" xmlns:cx8="http://schemas.microsoft.com/office/drawing/2016/5/14/chartex" xmlns:mc="http://schemas.openxmlformats.org/markup-compatibility/2006" xmlns:aink="http://schemas.microsoft.com/office/drawing/2016/ink" xmlns:am3d="http://schemas.microsoft.com/office/drawing/2017/model3d" xmlns:o="urn:schemas-microsoft-com:office:office" xmlns:r="http://schemas.openxmlformats.org/officeDocument/2006/relationships" xmlns:m="http://schemas.openxmlformats.org/officeDocument/2006/math" xmlns:v="urn:schemas-microsoft-com:vml" xmlns:wp14="http://schemas.microsoft.com/office/word/2010/wordprocessingDrawing" xmlns:wp="http://schemas.openxmlformats.org/drawingml/2006/wordprocessingDrawing" xmlns:w10="urn:schemas-microsoft-com:office:word" xmlns:w="http://schemas.openxmlformats.org/wordprocessingml/2006/main" xmlns:w14="http://schemas.microsoft.com/office/word/2010/wordml" xmlns:w15="http://schemas.microsoft.com/office/word/2012/wordml" xmlns:w16cid="http://schemas.microsoft.com/office/word/2016/wordml/cid" xmlns:w16se="http://schemas.microsoft.com/office/word/2015/wordml/symex" xmlns:wpg="http://schemas.microsoft.com/office/word/2010/wordprocessingGroup" xmlns:wpi="http://schemas.microsoft.com/office/word/2010/wordprocessingInk" xmlns:wne="http://schemas.microsoft.com/office/word/2006/wordml" xmlns:wps="http://schemas.microsoft.com/office/word/2010/wordprocessingShape" mc:Ignorable="w14 w15 w16se w16cid wp14">
   <w:abstractNum w:abstractNumId="0" w15:restartNumberingAfterBreak="0">
-    <w:nsid w:val="0A4D6EC1"/>
+    <w:nsid w:val="0A175894"/>
     <w:multiLevelType w:val="multilevel"/>
-    <w:tmpl w:val="854075C0"/>
+    <w:tmpl w:val="C9D22654"/>
     <w:lvl w:ilvl="0">
       <w:start w:val="1"/>
       <w:numFmt w:val="bullet"/>
@@ -1578,9 +1816,9 @@
     </w:lvl>
   </w:abstractNum>
   <w:abstractNum w:abstractNumId="1" w15:restartNumberingAfterBreak="0">
-    <w:nsid w:val="149B3A23"/>
+    <w:nsid w:val="11093FC3"/>
     <w:multiLevelType w:val="multilevel"/>
-    <w:tmpl w:val="16029470"/>
+    <w:tmpl w:val="A45E4628"/>
     <w:lvl w:ilvl="0">
       <w:start w:val="1"/>
       <w:numFmt w:val="bullet"/>
@@ -1727,9 +1965,9 @@
     </w:lvl>
   </w:abstractNum>
   <w:abstractNum w:abstractNumId="2" w15:restartNumberingAfterBreak="0">
-    <w:nsid w:val="1752578C"/>
+    <w:nsid w:val="1F5E1179"/>
     <w:multiLevelType w:val="multilevel"/>
-    <w:tmpl w:val="C3AE9124"/>
+    <w:tmpl w:val="0F5C8912"/>
     <w:lvl w:ilvl="0">
       <w:start w:val="1"/>
       <w:numFmt w:val="bullet"/>
@@ -1876,9 +2114,9 @@
     </w:lvl>
   </w:abstractNum>
   <w:abstractNum w:abstractNumId="3" w15:restartNumberingAfterBreak="0">
-    <w:nsid w:val="496B433C"/>
+    <w:nsid w:val="2E2328EF"/>
     <w:multiLevelType w:val="multilevel"/>
-    <w:tmpl w:val="388CB3E4"/>
+    <w:tmpl w:val="388E324C"/>
     <w:lvl w:ilvl="0">
       <w:start w:val="1"/>
       <w:numFmt w:val="bullet"/>
@@ -2025,9 +2263,9 @@
     </w:lvl>
   </w:abstractNum>
   <w:abstractNum w:abstractNumId="4" w15:restartNumberingAfterBreak="0">
-    <w:nsid w:val="6F5427B9"/>
+    <w:nsid w:val="595B4DF0"/>
     <w:multiLevelType w:val="multilevel"/>
-    <w:tmpl w:val="42345B7E"/>
+    <w:tmpl w:val="676ACAC4"/>
     <w:lvl w:ilvl="0">
       <w:start w:val="1"/>
       <w:numFmt w:val="bullet"/>
@@ -2180,10 +2418,10 @@
     <w:abstractNumId w:val="2"/>
   </w:num>
   <w:num w:numId="3">
-    <w:abstractNumId w:val="4"/>
+    <w:abstractNumId w:val="1"/>
   </w:num>
   <w:num w:numId="4">
-    <w:abstractNumId w:val="1"/>
+    <w:abstractNumId w:val="4"/>
   </w:num>
   <w:num w:numId="5">
     <w:abstractNumId w:val="3"/>
@@ -2662,8 +2900,8 @@
       <w:spacing w:before="100" w:beforeAutospacing="1" w:after="100" w:afterAutospacing="1"/>
     </w:pPr>
   </w:style>
-  <w:style w:type="paragraph" w:customStyle="1" w:styleId="Header1">
-    <w:name w:val="Header1"/>
+  <w:style w:type="paragraph" w:customStyle="1" w:styleId="header">
+    <w:name w:val="header"/>
     <w:basedOn w:val="Normal"/>
     <w:pPr>
       <w:spacing w:before="100" w:beforeAutospacing="1" w:after="120"/>

</xml_diff>